<commit_message>
feat: Main menu delete data button
</commit_message>
<xml_diff>
--- a/docu/Anexo II.docx
+++ b/docu/Anexo II.docx
@@ -35,37 +35,88 @@
         <w:rPr>
           <w:lang w:val="es-ES"/>
         </w:rPr>
-        <w:t>de casos de uso</w:t>
-      </w:r>
-    </w:p>
-    <w:p>
-      <w:pPr>
-        <w:rPr>
-          <w:lang w:val="es-ES"/>
-        </w:rPr>
-      </w:pPr>
-    </w:p>
-    <w:p>
-      <w:pPr>
-        <w:pStyle w:val="Ttulo2"/>
-        <w:rPr>
-          <w:b/>
-          <w:bCs/>
-          <w:lang w:val="es-ES"/>
-        </w:rPr>
-      </w:pPr>
-      <w:r>
-        <w:rPr>
-          <w:b/>
-          <w:bCs/>
-          <w:lang w:val="es-ES"/>
-        </w:rPr>
+        <w:t xml:space="preserve">de </w:t>
+      </w:r>
+      <w:r>
+        <w:rPr>
+          <w:lang w:val="es-ES"/>
+        </w:rPr>
+        <w:t>requisitos del software</w:t>
+      </w:r>
+    </w:p>
+    <w:p>
+      <w:pPr>
+        <w:pStyle w:val="Ttulo1"/>
+        <w:rPr>
+          <w:lang w:val="es-ES"/>
+        </w:rPr>
+      </w:pPr>
+      <w:r>
+        <w:rPr>
+          <w:lang w:val="es-ES"/>
+        </w:rPr>
+        <w:t>Introducción</w:t>
+      </w:r>
+    </w:p>
+    <w:p>
+      <w:pPr>
+        <w:rPr>
+          <w:lang w:val="es-ES"/>
+        </w:rPr>
+      </w:pPr>
+      <w:r>
+        <w:rPr>
+          <w:lang w:val="es-ES"/>
+        </w:rPr>
+        <w:t>En este anexo se realizará la especificación de requisitos del software. Para ello haremos uso de la metodología de Durán y Bernárdez</w:t>
+      </w:r>
+      <w:r>
+        <w:rPr>
+          <w:lang w:val="es-ES"/>
+        </w:rPr>
+        <w:t xml:space="preserve">. </w:t>
+      </w:r>
+    </w:p>
+    <w:p>
+      <w:pPr>
+        <w:rPr>
+          <w:lang w:val="es-ES"/>
+        </w:rPr>
+      </w:pPr>
+    </w:p>
+    <w:p>
+      <w:pPr>
+        <w:rPr>
+          <w:rFonts w:asciiTheme="majorHAnsi" w:eastAsiaTheme="majorEastAsia" w:hAnsiTheme="majorHAnsi" w:cstheme="majorBidi"/>
+          <w:color w:val="0F4761" w:themeColor="accent1" w:themeShade="BF"/>
+          <w:sz w:val="40"/>
+          <w:szCs w:val="40"/>
+          <w:lang w:val="es-ES"/>
+        </w:rPr>
+      </w:pPr>
+      <w:r>
+        <w:rPr>
+          <w:lang w:val="es-ES"/>
+        </w:rPr>
+        <w:br w:type="page"/>
+      </w:r>
+    </w:p>
+    <w:p>
+      <w:pPr>
+        <w:pStyle w:val="Ttulo1"/>
+        <w:rPr>
+          <w:lang w:val="es-ES"/>
+        </w:rPr>
+      </w:pPr>
+      <w:r>
+        <w:rPr>
+          <w:lang w:val="es-ES"/>
+        </w:rPr>
+        <w:lastRenderedPageBreak/>
         <w:t>Participante</w:t>
       </w:r>
       <w:r>
         <w:rPr>
-          <w:b/>
-          <w:bCs/>
           <w:lang w:val="es-ES"/>
         </w:rPr>
         <w:t>s</w:t>
@@ -93,21 +144,7 @@
         <w:rPr>
           <w:lang w:val="es-ES"/>
         </w:rPr>
-        <w:t xml:space="preserve">el componente rítmico  es muy importante, se ha contado con la ayuda externa de un compositor para hacer la música. Por otro lado, se ha elegido una metodología ágil de tipo SCRUM en base a prototipos, por lo que se han requerido de un grupo de </w:t>
-      </w:r>
-      <w:proofErr w:type="spellStart"/>
-      <w:r>
-        <w:rPr>
-          <w:lang w:val="es-ES"/>
-        </w:rPr>
-        <w:t>testers</w:t>
-      </w:r>
-      <w:proofErr w:type="spellEnd"/>
-      <w:r>
-        <w:rPr>
-          <w:lang w:val="es-ES"/>
-        </w:rPr>
-        <w:t xml:space="preserve"> que realizaran pruebas sobre el software. Por último, contamos al tutor como participante ya que ha ayudado en su desarrollo.</w:t>
+        <w:t>el componente rítmico  es muy importante, se ha contado con la ayuda externa de un compositor para hacer la música. Por otro lado, se ha elegido una metodología ágil de tipo SCRUM en base a prototipos, por lo que se han requerido de un grupo de testers que realizaran pruebas sobre el software. Por último, contamos al tutor como participante ya que ha ayudado en su desarrollo.</w:t>
       </w:r>
     </w:p>
     <w:p>
@@ -144,11 +181,9 @@
             <w:shd w:val="clear" w:color="auto" w:fill="B3E5A1" w:themeFill="accent6" w:themeFillTint="66"/>
           </w:tcPr>
           <w:p>
-            <w:proofErr w:type="spellStart"/>
             <w:r>
               <w:t>Participante</w:t>
             </w:r>
-            <w:proofErr w:type="spellEnd"/>
           </w:p>
         </w:tc>
         <w:tc>
@@ -161,46 +196,21 @@
               <w:cnfStyle w:val="100000000000" w:firstRow="1" w:lastRow="0" w:firstColumn="0" w:lastColumn="0" w:oddVBand="0" w:evenVBand="0" w:oddHBand="0" w:evenHBand="0" w:firstRowFirstColumn="0" w:firstRowLastColumn="0" w:lastRowFirstColumn="0" w:lastRowLastColumn="0"/>
             </w:pPr>
             <w:r>
-              <w:t xml:space="preserve">Ángel </w:t>
-            </w:r>
-            <w:proofErr w:type="spellStart"/>
-            <w:r>
-              <w:t>Torijano</w:t>
-            </w:r>
-            <w:proofErr w:type="spellEnd"/>
-            <w:r>
-              <w:t xml:space="preserve"> </w:t>
-            </w:r>
-            <w:proofErr w:type="spellStart"/>
-            <w:r>
-              <w:t>Sexmero</w:t>
-            </w:r>
-            <w:proofErr w:type="spellEnd"/>
-          </w:p>
-        </w:tc>
-      </w:tr>
-      <w:tr>
-        <w:tc>
-          <w:tcPr>
-            <w:cnfStyle w:val="001000000000" w:firstRow="0" w:lastRow="0" w:firstColumn="1" w:lastColumn="0" w:oddVBand="0" w:evenVBand="0" w:oddHBand="0" w:evenHBand="0" w:firstRowFirstColumn="0" w:firstRowLastColumn="0" w:lastRowFirstColumn="0" w:lastRowLastColumn="0"/>
-            <w:tcW w:w="2830" w:type="dxa"/>
-          </w:tcPr>
-          <w:p>
-            <w:pPr>
-              <w:rPr>
-                <w:b w:val="0"/>
-                <w:bCs w:val="0"/>
-              </w:rPr>
-            </w:pPr>
-            <w:proofErr w:type="spellStart"/>
-            <w:r>
-              <w:rPr>
-                <w:b w:val="0"/>
-                <w:bCs w:val="0"/>
-              </w:rPr>
+              <w:t>Ángel Torijano Sexmero</w:t>
+            </w:r>
+          </w:p>
+        </w:tc>
+      </w:tr>
+      <w:tr>
+        <w:tc>
+          <w:tcPr>
+            <w:cnfStyle w:val="001000000000" w:firstRow="0" w:lastRow="0" w:firstColumn="1" w:lastColumn="0" w:oddVBand="0" w:evenVBand="0" w:oddHBand="0" w:evenHBand="0" w:firstRowFirstColumn="0" w:firstRowLastColumn="0" w:lastRowFirstColumn="0" w:lastRowLastColumn="0"/>
+            <w:tcW w:w="2830" w:type="dxa"/>
+          </w:tcPr>
+          <w:p>
+            <w:r>
               <w:t>Organización</w:t>
             </w:r>
-            <w:proofErr w:type="spellEnd"/>
           </w:p>
         </w:tc>
         <w:tc>
@@ -224,17 +234,7 @@
             <w:tcW w:w="2830" w:type="dxa"/>
           </w:tcPr>
           <w:p>
-            <w:pPr>
-              <w:rPr>
-                <w:b w:val="0"/>
-                <w:bCs w:val="0"/>
-              </w:rPr>
-            </w:pPr>
-            <w:r>
-              <w:rPr>
-                <w:b w:val="0"/>
-                <w:bCs w:val="0"/>
-              </w:rPr>
+            <w:r>
               <w:t>Rol</w:t>
             </w:r>
           </w:p>
@@ -247,83 +247,51 @@
             <w:pPr>
               <w:cnfStyle w:val="000000000000" w:firstRow="0" w:lastRow="0" w:firstColumn="0" w:lastColumn="0" w:oddVBand="0" w:evenVBand="0" w:oddHBand="0" w:evenHBand="0" w:firstRowFirstColumn="0" w:firstRowLastColumn="0" w:lastRowFirstColumn="0" w:lastRowLastColumn="0"/>
             </w:pPr>
-            <w:proofErr w:type="spellStart"/>
             <w:r>
               <w:t>Desarrollador</w:t>
             </w:r>
-            <w:proofErr w:type="spellEnd"/>
-          </w:p>
-        </w:tc>
-      </w:tr>
-      <w:tr>
-        <w:tc>
-          <w:tcPr>
-            <w:cnfStyle w:val="001000000000" w:firstRow="0" w:lastRow="0" w:firstColumn="1" w:lastColumn="0" w:oddVBand="0" w:evenVBand="0" w:oddHBand="0" w:evenHBand="0" w:firstRowFirstColumn="0" w:firstRowLastColumn="0" w:lastRowFirstColumn="0" w:lastRowLastColumn="0"/>
-            <w:tcW w:w="2830" w:type="dxa"/>
-          </w:tcPr>
-          <w:p>
-            <w:pPr>
-              <w:rPr>
-                <w:b w:val="0"/>
-                <w:bCs w:val="0"/>
-              </w:rPr>
-            </w:pPr>
-            <w:r>
-              <w:rPr>
-                <w:b w:val="0"/>
-                <w:bCs w:val="0"/>
-              </w:rPr>
-              <w:t xml:space="preserve">Tipo de </w:t>
-            </w:r>
-            <w:proofErr w:type="spellStart"/>
-            <w:r>
-              <w:rPr>
-                <w:b w:val="0"/>
-                <w:bCs w:val="0"/>
-              </w:rPr>
-              <w:t>usuario</w:t>
-            </w:r>
-            <w:proofErr w:type="spellEnd"/>
-          </w:p>
-        </w:tc>
-        <w:tc>
-          <w:tcPr>
-            <w:tcW w:w="6520" w:type="dxa"/>
-          </w:tcPr>
-          <w:p>
-            <w:pPr>
-              <w:cnfStyle w:val="000000000000" w:firstRow="0" w:lastRow="0" w:firstColumn="0" w:lastColumn="0" w:oddVBand="0" w:evenVBand="0" w:oddHBand="0" w:evenHBand="0" w:firstRowFirstColumn="0" w:firstRowLastColumn="0" w:lastRowFirstColumn="0" w:lastRowLastColumn="0"/>
-            </w:pPr>
-            <w:proofErr w:type="spellStart"/>
+          </w:p>
+        </w:tc>
+      </w:tr>
+      <w:tr>
+        <w:tc>
+          <w:tcPr>
+            <w:cnfStyle w:val="001000000000" w:firstRow="0" w:lastRow="0" w:firstColumn="1" w:lastColumn="0" w:oddVBand="0" w:evenVBand="0" w:oddHBand="0" w:evenHBand="0" w:firstRowFirstColumn="0" w:firstRowLastColumn="0" w:lastRowFirstColumn="0" w:lastRowLastColumn="0"/>
+            <w:tcW w:w="2830" w:type="dxa"/>
+          </w:tcPr>
+          <w:p>
+            <w:r>
+              <w:t>Tipo de usuario</w:t>
+            </w:r>
+          </w:p>
+        </w:tc>
+        <w:tc>
+          <w:tcPr>
+            <w:tcW w:w="6520" w:type="dxa"/>
+          </w:tcPr>
+          <w:p>
+            <w:pPr>
+              <w:cnfStyle w:val="000000000000" w:firstRow="0" w:lastRow="0" w:firstColumn="0" w:lastColumn="0" w:oddVBand="0" w:evenVBand="0" w:oddHBand="0" w:evenHBand="0" w:firstRowFirstColumn="0" w:firstRowLastColumn="0" w:lastRowFirstColumn="0" w:lastRowLastColumn="0"/>
+            </w:pPr>
             <w:r>
               <w:t>Desarrollador</w:t>
             </w:r>
-            <w:proofErr w:type="spellEnd"/>
-          </w:p>
-        </w:tc>
-      </w:tr>
-      <w:tr>
-        <w:tc>
-          <w:tcPr>
-            <w:cnfStyle w:val="001000000000" w:firstRow="0" w:lastRow="0" w:firstColumn="1" w:lastColumn="0" w:oddVBand="0" w:evenVBand="0" w:oddHBand="0" w:evenHBand="0" w:firstRowFirstColumn="0" w:firstRowLastColumn="0" w:lastRowFirstColumn="0" w:lastRowLastColumn="0"/>
-            <w:tcW w:w="2830" w:type="dxa"/>
-          </w:tcPr>
-          <w:p>
-            <w:pPr>
-              <w:rPr>
-                <w:b w:val="0"/>
-                <w:bCs w:val="0"/>
-              </w:rPr>
-            </w:pPr>
-            <w:proofErr w:type="spellStart"/>
-            <w:r>
-              <w:rPr>
-                <w:b w:val="0"/>
-                <w:bCs w:val="0"/>
-              </w:rPr>
+          </w:p>
+        </w:tc>
+      </w:tr>
+      <w:tr>
+        <w:trPr>
+          <w:trHeight w:val="90"/>
+        </w:trPr>
+        <w:tc>
+          <w:tcPr>
+            <w:cnfStyle w:val="001000000000" w:firstRow="0" w:lastRow="0" w:firstColumn="1" w:lastColumn="0" w:oddVBand="0" w:evenVBand="0" w:oddHBand="0" w:evenHBand="0" w:firstRowFirstColumn="0" w:firstRowLastColumn="0" w:lastRowFirstColumn="0" w:lastRowLastColumn="0"/>
+            <w:tcW w:w="2830" w:type="dxa"/>
+          </w:tcPr>
+          <w:p>
+            <w:r>
               <w:t>Comentarios</w:t>
             </w:r>
-            <w:proofErr w:type="spellEnd"/>
           </w:p>
         </w:tc>
         <w:tc>
@@ -375,11 +343,9 @@
             <w:shd w:val="clear" w:color="auto" w:fill="B3E5A1" w:themeFill="accent6" w:themeFillTint="66"/>
           </w:tcPr>
           <w:p>
-            <w:proofErr w:type="spellStart"/>
             <w:r>
               <w:t>Participante</w:t>
             </w:r>
-            <w:proofErr w:type="spellEnd"/>
           </w:p>
         </w:tc>
         <w:tc>
@@ -404,21 +370,9 @@
             <w:tcW w:w="2830" w:type="dxa"/>
           </w:tcPr>
           <w:p>
-            <w:pPr>
-              <w:rPr>
-                <w:b w:val="0"/>
-                <w:bCs w:val="0"/>
-              </w:rPr>
-            </w:pPr>
-            <w:proofErr w:type="spellStart"/>
-            <w:r>
-              <w:rPr>
-                <w:b w:val="0"/>
-                <w:bCs w:val="0"/>
-              </w:rPr>
+            <w:r>
               <w:t>Organización</w:t>
             </w:r>
-            <w:proofErr w:type="spellEnd"/>
           </w:p>
         </w:tc>
         <w:tc>
@@ -442,17 +396,7 @@
             <w:tcW w:w="2830" w:type="dxa"/>
           </w:tcPr>
           <w:p>
-            <w:pPr>
-              <w:rPr>
-                <w:b w:val="0"/>
-                <w:bCs w:val="0"/>
-              </w:rPr>
-            </w:pPr>
-            <w:r>
-              <w:rPr>
-                <w:b w:val="0"/>
-                <w:bCs w:val="0"/>
-              </w:rPr>
+            <w:r>
               <w:t>Rol</w:t>
             </w:r>
           </w:p>
@@ -478,68 +422,35 @@
             <w:tcW w:w="2830" w:type="dxa"/>
           </w:tcPr>
           <w:p>
-            <w:pPr>
-              <w:rPr>
-                <w:b w:val="0"/>
-                <w:bCs w:val="0"/>
-              </w:rPr>
-            </w:pPr>
-            <w:r>
-              <w:rPr>
-                <w:b w:val="0"/>
-                <w:bCs w:val="0"/>
-              </w:rPr>
-              <w:t xml:space="preserve">Tipo de </w:t>
-            </w:r>
-            <w:proofErr w:type="spellStart"/>
-            <w:r>
-              <w:rPr>
-                <w:b w:val="0"/>
-                <w:bCs w:val="0"/>
-              </w:rPr>
-              <w:t>usuario</w:t>
-            </w:r>
-            <w:proofErr w:type="spellEnd"/>
-          </w:p>
-        </w:tc>
-        <w:tc>
-          <w:tcPr>
-            <w:tcW w:w="6520" w:type="dxa"/>
-          </w:tcPr>
-          <w:p>
-            <w:pPr>
-              <w:cnfStyle w:val="000000000000" w:firstRow="0" w:lastRow="0" w:firstColumn="0" w:lastColumn="0" w:oddVBand="0" w:evenVBand="0" w:oddHBand="0" w:evenHBand="0" w:firstRowFirstColumn="0" w:firstRowLastColumn="0" w:lastRowFirstColumn="0" w:lastRowLastColumn="0"/>
-            </w:pPr>
-            <w:proofErr w:type="spellStart"/>
+            <w:r>
+              <w:t>Tipo de usuario</w:t>
+            </w:r>
+          </w:p>
+        </w:tc>
+        <w:tc>
+          <w:tcPr>
+            <w:tcW w:w="6520" w:type="dxa"/>
+          </w:tcPr>
+          <w:p>
+            <w:pPr>
+              <w:cnfStyle w:val="000000000000" w:firstRow="0" w:lastRow="0" w:firstColumn="0" w:lastColumn="0" w:oddVBand="0" w:evenVBand="0" w:oddHBand="0" w:evenHBand="0" w:firstRowFirstColumn="0" w:firstRowLastColumn="0" w:lastRowFirstColumn="0" w:lastRowLastColumn="0"/>
+            </w:pPr>
             <w:r>
               <w:t>Cliente</w:t>
             </w:r>
-            <w:proofErr w:type="spellEnd"/>
-          </w:p>
-        </w:tc>
-      </w:tr>
-      <w:tr>
-        <w:tc>
-          <w:tcPr>
-            <w:cnfStyle w:val="001000000000" w:firstRow="0" w:lastRow="0" w:firstColumn="1" w:lastColumn="0" w:oddVBand="0" w:evenVBand="0" w:oddHBand="0" w:evenHBand="0" w:firstRowFirstColumn="0" w:firstRowLastColumn="0" w:lastRowFirstColumn="0" w:lastRowLastColumn="0"/>
-            <w:tcW w:w="2830" w:type="dxa"/>
-          </w:tcPr>
-          <w:p>
-            <w:pPr>
-              <w:rPr>
-                <w:b w:val="0"/>
-                <w:bCs w:val="0"/>
-              </w:rPr>
-            </w:pPr>
-            <w:proofErr w:type="spellStart"/>
-            <w:r>
-              <w:rPr>
-                <w:b w:val="0"/>
-                <w:bCs w:val="0"/>
-              </w:rPr>
+          </w:p>
+        </w:tc>
+      </w:tr>
+      <w:tr>
+        <w:tc>
+          <w:tcPr>
+            <w:cnfStyle w:val="001000000000" w:firstRow="0" w:lastRow="0" w:firstColumn="1" w:lastColumn="0" w:oddVBand="0" w:evenVBand="0" w:oddHBand="0" w:evenHBand="0" w:firstRowFirstColumn="0" w:firstRowLastColumn="0" w:lastRowFirstColumn="0" w:lastRowLastColumn="0"/>
+            <w:tcW w:w="2830" w:type="dxa"/>
+          </w:tcPr>
+          <w:p>
+            <w:r>
               <w:t>Comentarios</w:t>
             </w:r>
-            <w:proofErr w:type="spellEnd"/>
           </w:p>
         </w:tc>
         <w:tc>
@@ -591,11 +502,9 @@
             <w:shd w:val="clear" w:color="auto" w:fill="B3E5A1" w:themeFill="accent6" w:themeFillTint="66"/>
           </w:tcPr>
           <w:p>
-            <w:proofErr w:type="spellStart"/>
             <w:r>
               <w:t>Participante</w:t>
             </w:r>
-            <w:proofErr w:type="spellEnd"/>
           </w:p>
         </w:tc>
         <w:tc>
@@ -638,21 +547,9 @@
             <w:tcW w:w="2830" w:type="dxa"/>
           </w:tcPr>
           <w:p>
-            <w:pPr>
-              <w:rPr>
-                <w:b w:val="0"/>
-                <w:bCs w:val="0"/>
-              </w:rPr>
-            </w:pPr>
-            <w:proofErr w:type="spellStart"/>
-            <w:r>
-              <w:rPr>
-                <w:b w:val="0"/>
-                <w:bCs w:val="0"/>
-              </w:rPr>
+            <w:r>
               <w:t>Organización</w:t>
             </w:r>
-            <w:proofErr w:type="spellEnd"/>
           </w:p>
         </w:tc>
         <w:tc>
@@ -676,17 +573,7 @@
             <w:tcW w:w="2830" w:type="dxa"/>
           </w:tcPr>
           <w:p>
-            <w:pPr>
-              <w:rPr>
-                <w:b w:val="0"/>
-                <w:bCs w:val="0"/>
-              </w:rPr>
-            </w:pPr>
-            <w:r>
-              <w:rPr>
-                <w:b w:val="0"/>
-                <w:bCs w:val="0"/>
-              </w:rPr>
+            <w:r>
               <w:t>Rol</w:t>
             </w:r>
           </w:p>
@@ -715,76 +602,41 @@
             <w:tcW w:w="2830" w:type="dxa"/>
           </w:tcPr>
           <w:p>
-            <w:pPr>
-              <w:rPr>
-                <w:b w:val="0"/>
-                <w:bCs w:val="0"/>
-              </w:rPr>
-            </w:pPr>
-            <w:r>
-              <w:rPr>
-                <w:b w:val="0"/>
-                <w:bCs w:val="0"/>
-              </w:rPr>
-              <w:t xml:space="preserve">Tipo de </w:t>
-            </w:r>
-            <w:proofErr w:type="spellStart"/>
-            <w:r>
-              <w:rPr>
-                <w:b w:val="0"/>
-                <w:bCs w:val="0"/>
-              </w:rPr>
-              <w:t>usuario</w:t>
-            </w:r>
-            <w:proofErr w:type="spellEnd"/>
-          </w:p>
-        </w:tc>
-        <w:tc>
-          <w:tcPr>
-            <w:tcW w:w="6520" w:type="dxa"/>
-          </w:tcPr>
-          <w:p>
-            <w:pPr>
-              <w:cnfStyle w:val="000000000000" w:firstRow="0" w:lastRow="0" w:firstColumn="0" w:lastColumn="0" w:oddVBand="0" w:evenVBand="0" w:oddHBand="0" w:evenHBand="0" w:firstRowFirstColumn="0" w:firstRowLastColumn="0" w:lastRowFirstColumn="0" w:lastRowLastColumn="0"/>
-            </w:pPr>
-            <w:proofErr w:type="spellStart"/>
+            <w:r>
+              <w:t>Tipo de usuario</w:t>
+            </w:r>
+          </w:p>
+        </w:tc>
+        <w:tc>
+          <w:tcPr>
+            <w:tcW w:w="6520" w:type="dxa"/>
+          </w:tcPr>
+          <w:p>
+            <w:pPr>
+              <w:cnfStyle w:val="000000000000" w:firstRow="0" w:lastRow="0" w:firstColumn="0" w:lastColumn="0" w:oddVBand="0" w:evenVBand="0" w:oddHBand="0" w:evenHBand="0" w:firstRowFirstColumn="0" w:firstRowLastColumn="0" w:lastRowFirstColumn="0" w:lastRowLastColumn="0"/>
+            </w:pPr>
             <w:r>
               <w:t>Desarrollador</w:t>
             </w:r>
-            <w:proofErr w:type="spellEnd"/>
             <w:r>
               <w:t xml:space="preserve">, </w:t>
             </w:r>
-            <w:proofErr w:type="spellStart"/>
             <w:r>
               <w:t>Usuario</w:t>
             </w:r>
-            <w:proofErr w:type="spellEnd"/>
-          </w:p>
-        </w:tc>
-      </w:tr>
-      <w:tr>
-        <w:tc>
-          <w:tcPr>
-            <w:cnfStyle w:val="001000000000" w:firstRow="0" w:lastRow="0" w:firstColumn="1" w:lastColumn="0" w:oddVBand="0" w:evenVBand="0" w:oddHBand="0" w:evenHBand="0" w:firstRowFirstColumn="0" w:firstRowLastColumn="0" w:lastRowFirstColumn="0" w:lastRowLastColumn="0"/>
-            <w:tcW w:w="2830" w:type="dxa"/>
-          </w:tcPr>
-          <w:p>
-            <w:pPr>
-              <w:rPr>
-                <w:b w:val="0"/>
-                <w:bCs w:val="0"/>
-              </w:rPr>
-            </w:pPr>
-            <w:proofErr w:type="spellStart"/>
-            <w:r>
-              <w:rPr>
-                <w:b w:val="0"/>
-                <w:bCs w:val="0"/>
-              </w:rPr>
+          </w:p>
+        </w:tc>
+      </w:tr>
+      <w:tr>
+        <w:tc>
+          <w:tcPr>
+            <w:cnfStyle w:val="001000000000" w:firstRow="0" w:lastRow="0" w:firstColumn="1" w:lastColumn="0" w:oddVBand="0" w:evenVBand="0" w:oddHBand="0" w:evenHBand="0" w:firstRowFirstColumn="0" w:firstRowLastColumn="0" w:lastRowFirstColumn="0" w:lastRowLastColumn="0"/>
+            <w:tcW w:w="2830" w:type="dxa"/>
+          </w:tcPr>
+          <w:p>
+            <w:r>
               <w:t>Comentarios</w:t>
             </w:r>
-            <w:proofErr w:type="spellEnd"/>
           </w:p>
         </w:tc>
         <w:tc>
@@ -808,21 +660,7 @@
               <w:rPr>
                 <w:lang w:val="es-ES"/>
               </w:rPr>
-              <w:t xml:space="preserve">en el Proyecto, además de ser </w:t>
-            </w:r>
-            <w:proofErr w:type="spellStart"/>
-            <w:r>
-              <w:rPr>
-                <w:lang w:val="es-ES"/>
-              </w:rPr>
-              <w:t>tester</w:t>
-            </w:r>
-            <w:proofErr w:type="spellEnd"/>
-            <w:r>
-              <w:rPr>
-                <w:lang w:val="es-ES"/>
-              </w:rPr>
-              <w:t xml:space="preserve"> de los prototipos que se vayan desarrollando.</w:t>
+              <w:t>en el Proyecto, además de ser tester de los prototipos que se vayan desarrollando.</w:t>
             </w:r>
           </w:p>
         </w:tc>
@@ -856,11 +694,9 @@
             <w:shd w:val="clear" w:color="auto" w:fill="B3E5A1" w:themeFill="accent6" w:themeFillTint="66"/>
           </w:tcPr>
           <w:p>
-            <w:proofErr w:type="spellStart"/>
             <w:r>
               <w:t>Participante</w:t>
             </w:r>
-            <w:proofErr w:type="spellEnd"/>
           </w:p>
         </w:tc>
         <w:tc>
@@ -885,21 +721,9 @@
             <w:tcW w:w="2830" w:type="dxa"/>
           </w:tcPr>
           <w:p>
-            <w:pPr>
-              <w:rPr>
-                <w:b w:val="0"/>
-                <w:bCs w:val="0"/>
-              </w:rPr>
-            </w:pPr>
-            <w:proofErr w:type="spellStart"/>
-            <w:r>
-              <w:rPr>
-                <w:b w:val="0"/>
-                <w:bCs w:val="0"/>
-              </w:rPr>
+            <w:r>
               <w:t>Organización</w:t>
             </w:r>
-            <w:proofErr w:type="spellEnd"/>
           </w:p>
         </w:tc>
         <w:tc>
@@ -923,18 +747,7 @@
             <w:tcW w:w="2830" w:type="dxa"/>
           </w:tcPr>
           <w:p>
-            <w:pPr>
-              <w:rPr>
-                <w:b w:val="0"/>
-                <w:bCs w:val="0"/>
-              </w:rPr>
-            </w:pPr>
-            <w:r>
-              <w:rPr>
-                <w:b w:val="0"/>
-                <w:bCs w:val="0"/>
-              </w:rPr>
-              <w:lastRenderedPageBreak/>
+            <w:r>
               <w:t>Rol</w:t>
             </w:r>
           </w:p>
@@ -960,43 +773,22 @@
             <w:tcW w:w="2830" w:type="dxa"/>
           </w:tcPr>
           <w:p>
-            <w:pPr>
-              <w:rPr>
-                <w:b w:val="0"/>
-                <w:bCs w:val="0"/>
-              </w:rPr>
-            </w:pPr>
-            <w:r>
-              <w:rPr>
-                <w:b w:val="0"/>
-                <w:bCs w:val="0"/>
-              </w:rPr>
-              <w:t xml:space="preserve">Tipo de </w:t>
-            </w:r>
-            <w:proofErr w:type="spellStart"/>
-            <w:r>
-              <w:rPr>
-                <w:b w:val="0"/>
-                <w:bCs w:val="0"/>
-              </w:rPr>
-              <w:t>usuario</w:t>
-            </w:r>
-            <w:proofErr w:type="spellEnd"/>
-          </w:p>
-        </w:tc>
-        <w:tc>
-          <w:tcPr>
-            <w:tcW w:w="6520" w:type="dxa"/>
-          </w:tcPr>
-          <w:p>
-            <w:pPr>
-              <w:cnfStyle w:val="000000000000" w:firstRow="0" w:lastRow="0" w:firstColumn="0" w:lastColumn="0" w:oddVBand="0" w:evenVBand="0" w:oddHBand="0" w:evenHBand="0" w:firstRowFirstColumn="0" w:firstRowLastColumn="0" w:lastRowFirstColumn="0" w:lastRowLastColumn="0"/>
-            </w:pPr>
-            <w:proofErr w:type="spellStart"/>
+            <w:r>
+              <w:t>Tipo de usuario</w:t>
+            </w:r>
+          </w:p>
+        </w:tc>
+        <w:tc>
+          <w:tcPr>
+            <w:tcW w:w="6520" w:type="dxa"/>
+          </w:tcPr>
+          <w:p>
+            <w:pPr>
+              <w:cnfStyle w:val="000000000000" w:firstRow="0" w:lastRow="0" w:firstColumn="0" w:lastColumn="0" w:oddVBand="0" w:evenVBand="0" w:oddHBand="0" w:evenHBand="0" w:firstRowFirstColumn="0" w:firstRowLastColumn="0" w:lastRowFirstColumn="0" w:lastRowLastColumn="0"/>
+            </w:pPr>
             <w:r>
               <w:t>Usuario</w:t>
             </w:r>
-            <w:proofErr w:type="spellEnd"/>
           </w:p>
         </w:tc>
       </w:tr>
@@ -1010,21 +802,9 @@
             <w:tcW w:w="2830" w:type="dxa"/>
           </w:tcPr>
           <w:p>
-            <w:pPr>
-              <w:rPr>
-                <w:b w:val="0"/>
-                <w:bCs w:val="0"/>
-              </w:rPr>
-            </w:pPr>
-            <w:proofErr w:type="spellStart"/>
-            <w:r>
-              <w:rPr>
-                <w:b w:val="0"/>
-                <w:bCs w:val="0"/>
-              </w:rPr>
+            <w:r>
               <w:t>Comentarios</w:t>
             </w:r>
-            <w:proofErr w:type="spellEnd"/>
           </w:p>
         </w:tc>
         <w:tc>
@@ -1076,11 +856,10 @@
             <w:shd w:val="clear" w:color="auto" w:fill="B3E5A1" w:themeFill="accent6" w:themeFillTint="66"/>
           </w:tcPr>
           <w:p>
-            <w:proofErr w:type="spellStart"/>
-            <w:r>
+            <w:r>
+              <w:lastRenderedPageBreak/>
               <w:t>Participante</w:t>
             </w:r>
-            <w:proofErr w:type="spellEnd"/>
           </w:p>
         </w:tc>
         <w:tc>
@@ -1105,21 +884,9 @@
             <w:tcW w:w="2830" w:type="dxa"/>
           </w:tcPr>
           <w:p>
-            <w:pPr>
-              <w:rPr>
-                <w:b w:val="0"/>
-                <w:bCs w:val="0"/>
-              </w:rPr>
-            </w:pPr>
-            <w:proofErr w:type="spellStart"/>
-            <w:r>
-              <w:rPr>
-                <w:b w:val="0"/>
-                <w:bCs w:val="0"/>
-              </w:rPr>
+            <w:r>
               <w:t>Organización</w:t>
             </w:r>
-            <w:proofErr w:type="spellEnd"/>
           </w:p>
         </w:tc>
         <w:tc>
@@ -1143,17 +910,7 @@
             <w:tcW w:w="2830" w:type="dxa"/>
           </w:tcPr>
           <w:p>
-            <w:pPr>
-              <w:rPr>
-                <w:b w:val="0"/>
-                <w:bCs w:val="0"/>
-              </w:rPr>
-            </w:pPr>
-            <w:r>
-              <w:rPr>
-                <w:b w:val="0"/>
-                <w:bCs w:val="0"/>
-              </w:rPr>
+            <w:r>
               <w:t>Rol</w:t>
             </w:r>
           </w:p>
@@ -1179,68 +936,35 @@
             <w:tcW w:w="2830" w:type="dxa"/>
           </w:tcPr>
           <w:p>
-            <w:pPr>
-              <w:rPr>
-                <w:b w:val="0"/>
-                <w:bCs w:val="0"/>
-              </w:rPr>
-            </w:pPr>
-            <w:r>
-              <w:rPr>
-                <w:b w:val="0"/>
-                <w:bCs w:val="0"/>
-              </w:rPr>
-              <w:t xml:space="preserve">Tipo de </w:t>
-            </w:r>
-            <w:proofErr w:type="spellStart"/>
-            <w:r>
-              <w:rPr>
-                <w:b w:val="0"/>
-                <w:bCs w:val="0"/>
-              </w:rPr>
-              <w:t>usuario</w:t>
-            </w:r>
-            <w:proofErr w:type="spellEnd"/>
-          </w:p>
-        </w:tc>
-        <w:tc>
-          <w:tcPr>
-            <w:tcW w:w="6520" w:type="dxa"/>
-          </w:tcPr>
-          <w:p>
-            <w:pPr>
-              <w:cnfStyle w:val="000000000000" w:firstRow="0" w:lastRow="0" w:firstColumn="0" w:lastColumn="0" w:oddVBand="0" w:evenVBand="0" w:oddHBand="0" w:evenHBand="0" w:firstRowFirstColumn="0" w:firstRowLastColumn="0" w:lastRowFirstColumn="0" w:lastRowLastColumn="0"/>
-            </w:pPr>
-            <w:proofErr w:type="spellStart"/>
+            <w:r>
+              <w:t>Tipo de usuario</w:t>
+            </w:r>
+          </w:p>
+        </w:tc>
+        <w:tc>
+          <w:tcPr>
+            <w:tcW w:w="6520" w:type="dxa"/>
+          </w:tcPr>
+          <w:p>
+            <w:pPr>
+              <w:cnfStyle w:val="000000000000" w:firstRow="0" w:lastRow="0" w:firstColumn="0" w:lastColumn="0" w:oddVBand="0" w:evenVBand="0" w:oddHBand="0" w:evenHBand="0" w:firstRowFirstColumn="0" w:firstRowLastColumn="0" w:lastRowFirstColumn="0" w:lastRowLastColumn="0"/>
+            </w:pPr>
             <w:r>
               <w:t>Usuario</w:t>
             </w:r>
-            <w:proofErr w:type="spellEnd"/>
-          </w:p>
-        </w:tc>
-      </w:tr>
-      <w:tr>
-        <w:tc>
-          <w:tcPr>
-            <w:cnfStyle w:val="001000000000" w:firstRow="0" w:lastRow="0" w:firstColumn="1" w:lastColumn="0" w:oddVBand="0" w:evenVBand="0" w:oddHBand="0" w:evenHBand="0" w:firstRowFirstColumn="0" w:firstRowLastColumn="0" w:lastRowFirstColumn="0" w:lastRowLastColumn="0"/>
-            <w:tcW w:w="2830" w:type="dxa"/>
-          </w:tcPr>
-          <w:p>
-            <w:pPr>
-              <w:rPr>
-                <w:b w:val="0"/>
-                <w:bCs w:val="0"/>
-              </w:rPr>
-            </w:pPr>
-            <w:proofErr w:type="spellStart"/>
-            <w:r>
-              <w:rPr>
-                <w:b w:val="0"/>
-                <w:bCs w:val="0"/>
-              </w:rPr>
+          </w:p>
+        </w:tc>
+      </w:tr>
+      <w:tr>
+        <w:tc>
+          <w:tcPr>
+            <w:cnfStyle w:val="001000000000" w:firstRow="0" w:lastRow="0" w:firstColumn="1" w:lastColumn="0" w:oddVBand="0" w:evenVBand="0" w:oddHBand="0" w:evenHBand="0" w:firstRowFirstColumn="0" w:firstRowLastColumn="0" w:lastRowFirstColumn="0" w:lastRowLastColumn="0"/>
+            <w:tcW w:w="2830" w:type="dxa"/>
+          </w:tcPr>
+          <w:p>
+            <w:r>
               <w:t>Comentarios</w:t>
             </w:r>
-            <w:proofErr w:type="spellEnd"/>
           </w:p>
         </w:tc>
         <w:tc>
@@ -1279,7 +1003,7 @@
     </w:p>
     <w:p>
       <w:pPr>
-        <w:pStyle w:val="Ttulo2"/>
+        <w:pStyle w:val="Ttulo1"/>
         <w:rPr>
           <w:lang w:val="es-ES"/>
         </w:rPr>
@@ -1307,239 +1031,15 @@
         <w:rPr>
           <w:lang w:val="es-ES"/>
         </w:rPr>
-        <w:t xml:space="preserve">Listados: </w:t>
-      </w:r>
-    </w:p>
-    <w:p>
-      <w:pPr>
-        <w:pStyle w:val="Prrafodelista"/>
-        <w:numPr>
-          <w:ilvl w:val="0"/>
-          <w:numId w:val="2"/>
-        </w:numPr>
-        <w:rPr>
-          <w:lang w:val="es-ES"/>
-        </w:rPr>
-      </w:pPr>
-      <w:r>
-        <w:rPr>
-          <w:lang w:val="es-ES"/>
-        </w:rPr>
-        <w:t xml:space="preserve">OBJ-01 Desarrollo de la base del videojuego: El sistema deberá dar las funcionalidades básicas de un videojuego 2D, como son </w:t>
-      </w:r>
-      <w:r>
-        <w:rPr>
-          <w:lang w:val="es-ES"/>
-        </w:rPr>
-        <w:t>el movimiento fluido y elementos tales como enemigos, coleccionables, una meta, etc</w:t>
-      </w:r>
-      <w:r>
-        <w:rPr>
-          <w:lang w:val="es-ES"/>
-        </w:rPr>
-        <w:t>.</w:t>
-      </w:r>
-    </w:p>
-    <w:p>
-      <w:pPr>
-        <w:pStyle w:val="Prrafodelista"/>
-        <w:numPr>
-          <w:ilvl w:val="0"/>
-          <w:numId w:val="2"/>
-        </w:numPr>
-        <w:rPr>
-          <w:lang w:val="es-ES"/>
-        </w:rPr>
-      </w:pPr>
-      <w:r>
-        <w:rPr>
-          <w:lang w:val="es-ES"/>
-        </w:rPr>
-        <w:t>OBJ-0</w:t>
-      </w:r>
-      <w:r>
-        <w:rPr>
-          <w:lang w:val="es-ES"/>
-        </w:rPr>
-        <w:t>2</w:t>
-      </w:r>
-      <w:r>
-        <w:rPr>
-          <w:lang w:val="es-ES"/>
-        </w:rPr>
-        <w:t xml:space="preserve"> </w:t>
-      </w:r>
-      <w:r>
-        <w:rPr>
-          <w:lang w:val="es-ES"/>
-        </w:rPr>
-        <w:t>Diseño de interfaz</w:t>
-      </w:r>
-      <w:r>
-        <w:rPr>
-          <w:lang w:val="es-ES"/>
-        </w:rPr>
-        <w:t xml:space="preserve">: El sistema </w:t>
-      </w:r>
-      <w:r>
-        <w:rPr>
-          <w:lang w:val="es-ES"/>
-        </w:rPr>
-        <w:t>tendrá una interfaz agradable a la vista y clara para que el usuario pueda moverse por la escena con facilidad,</w:t>
-      </w:r>
-    </w:p>
-    <w:p>
-      <w:pPr>
-        <w:pStyle w:val="Prrafodelista"/>
-        <w:numPr>
-          <w:ilvl w:val="0"/>
-          <w:numId w:val="2"/>
-        </w:numPr>
-        <w:rPr>
-          <w:lang w:val="es-ES"/>
-        </w:rPr>
-      </w:pPr>
-      <w:r>
-        <w:rPr>
-          <w:lang w:val="es-ES"/>
-        </w:rPr>
-        <w:t>OBJ-0</w:t>
-      </w:r>
-      <w:r>
-        <w:rPr>
-          <w:lang w:val="es-ES"/>
-        </w:rPr>
-        <w:t>3</w:t>
-      </w:r>
-      <w:r>
-        <w:rPr>
-          <w:lang w:val="es-ES"/>
-        </w:rPr>
-        <w:t xml:space="preserve"> Implementar carácter rítmico al juego: El sistema</w:t>
-      </w:r>
-      <w:r>
-        <w:rPr>
-          <w:lang w:val="es-ES"/>
-        </w:rPr>
-        <w:t xml:space="preserve"> fluirá en base a un ritmo al que el usuario tendrá que atenerse para poder actuar correctamente sobre el sistema</w:t>
-      </w:r>
-      <w:r>
-        <w:rPr>
-          <w:lang w:val="es-ES"/>
-        </w:rPr>
-        <w:t>. Este ritmo también afectara a otros elementos de la pantalla</w:t>
-      </w:r>
-      <w:r>
-        <w:rPr>
-          <w:lang w:val="es-ES"/>
-        </w:rPr>
-        <w:t>.</w:t>
-      </w:r>
-    </w:p>
-    <w:p>
-      <w:pPr>
-        <w:pStyle w:val="Prrafodelista"/>
-        <w:numPr>
-          <w:ilvl w:val="0"/>
-          <w:numId w:val="2"/>
-        </w:numPr>
-        <w:rPr>
-          <w:lang w:val="es-ES"/>
-        </w:rPr>
-      </w:pPr>
-      <w:r>
-        <w:rPr>
-          <w:lang w:val="es-ES"/>
-        </w:rPr>
-        <w:t>OBJ-0</w:t>
-      </w:r>
-      <w:r>
-        <w:rPr>
-          <w:lang w:val="es-ES"/>
-        </w:rPr>
-        <w:t>4</w:t>
-      </w:r>
-      <w:r>
-        <w:rPr>
-          <w:lang w:val="es-ES"/>
-        </w:rPr>
-        <w:t xml:space="preserve"> </w:t>
-      </w:r>
-      <w:r>
-        <w:rPr>
-          <w:lang w:val="es-ES"/>
-        </w:rPr>
-        <w:t xml:space="preserve">Gestión de </w:t>
-      </w:r>
-      <w:r>
-        <w:rPr>
-          <w:lang w:val="es-ES"/>
-        </w:rPr>
-        <w:t>niveles</w:t>
-      </w:r>
-      <w:r>
-        <w:rPr>
-          <w:lang w:val="es-ES"/>
-        </w:rPr>
-        <w:t xml:space="preserve">: El sistema deberá poder recoger y guardar diversas puntuaciones de distintos usuarios </w:t>
-      </w:r>
-    </w:p>
-    <w:p>
-      <w:pPr>
-        <w:pStyle w:val="Prrafodelista"/>
-        <w:numPr>
-          <w:ilvl w:val="0"/>
-          <w:numId w:val="2"/>
-        </w:numPr>
-        <w:rPr>
-          <w:lang w:val="es-ES"/>
-        </w:rPr>
-      </w:pPr>
-      <w:r>
-        <w:rPr>
-          <w:highlight w:val="yellow"/>
-          <w:lang w:val="es-ES"/>
-        </w:rPr>
-        <w:t>OBJ-0</w:t>
-      </w:r>
-      <w:r>
-        <w:rPr>
-          <w:highlight w:val="yellow"/>
-          <w:lang w:val="es-ES"/>
-        </w:rPr>
-        <w:t>5</w:t>
-      </w:r>
-      <w:r>
-        <w:rPr>
-          <w:highlight w:val="yellow"/>
-          <w:lang w:val="es-ES"/>
-        </w:rPr>
-        <w:t xml:space="preserve"> Diseño e implementación de los elementos artísticos: El sistema dispondrá de elementos originales tanto gráficos como de audio.</w:t>
-      </w:r>
-    </w:p>
-    <w:p>
-      <w:pPr>
-        <w:pStyle w:val="Prrafodelista"/>
-        <w:numPr>
-          <w:ilvl w:val="0"/>
-          <w:numId w:val="2"/>
-        </w:numPr>
-        <w:rPr>
-          <w:lang w:val="es-ES"/>
-        </w:rPr>
-      </w:pPr>
-      <w:r>
-        <w:rPr>
-          <w:lang w:val="es-ES"/>
-        </w:rPr>
-        <w:t xml:space="preserve">OBJ-06 </w:t>
-      </w:r>
-      <w:r>
-        <w:rPr>
-          <w:lang w:val="es-ES"/>
-        </w:rPr>
-        <w:t>Desarrollo de Obstáculos</w:t>
-      </w:r>
+        <w:t>EL objetivo principal del proyecto es la creación de un juego que utilice elementos rítmicos dentro de un entorno 2D. Gracias a estos elementos rítmicos el usuario tendrá diversas opciones para completar los niveles, las cuales serán premiadas según su fluidez.</w:t>
+      </w:r>
+    </w:p>
+    <w:p>
+      <w:pPr>
+        <w:rPr>
+          <w:lang w:val="es-ES"/>
+        </w:rPr>
+      </w:pPr>
     </w:p>
     <w:p>
       <w:pPr>
@@ -1612,21 +1112,9 @@
             <w:tcW w:w="2830" w:type="dxa"/>
           </w:tcPr>
           <w:p>
-            <w:pPr>
-              <w:rPr>
-                <w:b w:val="0"/>
-                <w:bCs w:val="0"/>
-              </w:rPr>
-            </w:pPr>
-            <w:proofErr w:type="spellStart"/>
-            <w:r>
-              <w:rPr>
-                <w:b w:val="0"/>
-                <w:bCs w:val="0"/>
-              </w:rPr>
+            <w:r>
               <w:t>Versión</w:t>
             </w:r>
-            <w:proofErr w:type="spellEnd"/>
           </w:p>
         </w:tc>
         <w:tc>
@@ -1650,71 +1138,33 @@
             <w:tcW w:w="2830" w:type="dxa"/>
           </w:tcPr>
           <w:p>
-            <w:pPr>
-              <w:rPr>
-                <w:b w:val="0"/>
-                <w:bCs w:val="0"/>
-              </w:rPr>
-            </w:pPr>
-            <w:proofErr w:type="spellStart"/>
-            <w:r>
-              <w:rPr>
-                <w:b w:val="0"/>
-                <w:bCs w:val="0"/>
-              </w:rPr>
+            <w:r>
               <w:t>Autores</w:t>
             </w:r>
-            <w:proofErr w:type="spellEnd"/>
-          </w:p>
-        </w:tc>
-        <w:tc>
-          <w:tcPr>
-            <w:tcW w:w="6520" w:type="dxa"/>
-          </w:tcPr>
-          <w:p>
-            <w:pPr>
-              <w:cnfStyle w:val="000000000000" w:firstRow="0" w:lastRow="0" w:firstColumn="0" w:lastColumn="0" w:oddVBand="0" w:evenVBand="0" w:oddHBand="0" w:evenHBand="0" w:firstRowFirstColumn="0" w:firstRowLastColumn="0" w:lastRowFirstColumn="0" w:lastRowLastColumn="0"/>
-            </w:pPr>
-            <w:r>
-              <w:t xml:space="preserve">Ángel </w:t>
-            </w:r>
-            <w:proofErr w:type="spellStart"/>
-            <w:r>
-              <w:t>Torijano</w:t>
-            </w:r>
-            <w:proofErr w:type="spellEnd"/>
-            <w:r>
-              <w:t xml:space="preserve"> </w:t>
-            </w:r>
-            <w:proofErr w:type="spellStart"/>
-            <w:r>
-              <w:t>Sexmero</w:t>
-            </w:r>
-            <w:proofErr w:type="spellEnd"/>
-            <w:r>
-              <w:t xml:space="preserve"> </w:t>
-            </w:r>
-          </w:p>
-        </w:tc>
-      </w:tr>
-      <w:tr>
-        <w:tc>
-          <w:tcPr>
-            <w:cnfStyle w:val="001000000000" w:firstRow="0" w:lastRow="0" w:firstColumn="1" w:lastColumn="0" w:oddVBand="0" w:evenVBand="0" w:oddHBand="0" w:evenHBand="0" w:firstRowFirstColumn="0" w:firstRowLastColumn="0" w:lastRowFirstColumn="0" w:lastRowLastColumn="0"/>
-            <w:tcW w:w="2830" w:type="dxa"/>
-          </w:tcPr>
-          <w:p>
-            <w:pPr>
-              <w:rPr>
-                <w:b w:val="0"/>
-                <w:bCs w:val="0"/>
-              </w:rPr>
-            </w:pPr>
-            <w:r>
-              <w:rPr>
-                <w:b w:val="0"/>
-                <w:bCs w:val="0"/>
-              </w:rPr>
+          </w:p>
+        </w:tc>
+        <w:tc>
+          <w:tcPr>
+            <w:tcW w:w="6520" w:type="dxa"/>
+          </w:tcPr>
+          <w:p>
+            <w:pPr>
+              <w:cnfStyle w:val="000000000000" w:firstRow="0" w:lastRow="0" w:firstColumn="0" w:lastColumn="0" w:oddVBand="0" w:evenVBand="0" w:oddHBand="0" w:evenHBand="0" w:firstRowFirstColumn="0" w:firstRowLastColumn="0" w:lastRowFirstColumn="0" w:lastRowLastColumn="0"/>
+            </w:pPr>
+            <w:r>
+              <w:t xml:space="preserve">Ángel Torijano Sexmero </w:t>
+            </w:r>
+          </w:p>
+        </w:tc>
+      </w:tr>
+      <w:tr>
+        <w:tc>
+          <w:tcPr>
+            <w:cnfStyle w:val="001000000000" w:firstRow="0" w:lastRow="0" w:firstColumn="1" w:lastColumn="0" w:oddVBand="0" w:evenVBand="0" w:oddHBand="0" w:evenHBand="0" w:firstRowFirstColumn="0" w:firstRowLastColumn="0" w:lastRowFirstColumn="0" w:lastRowLastColumn="0"/>
+            <w:tcW w:w="2830" w:type="dxa"/>
+          </w:tcPr>
+          <w:p>
+            <w:r>
               <w:t>Fuentes</w:t>
             </w:r>
           </w:p>
@@ -1740,21 +1190,9 @@
             <w:tcW w:w="2830" w:type="dxa"/>
           </w:tcPr>
           <w:p>
-            <w:pPr>
-              <w:rPr>
-                <w:b w:val="0"/>
-                <w:bCs w:val="0"/>
-              </w:rPr>
-            </w:pPr>
-            <w:proofErr w:type="spellStart"/>
-            <w:r>
-              <w:rPr>
-                <w:b w:val="0"/>
-                <w:bCs w:val="0"/>
-              </w:rPr>
+            <w:r>
               <w:t>Descripción</w:t>
             </w:r>
-            <w:proofErr w:type="spellEnd"/>
           </w:p>
         </w:tc>
         <w:tc>
@@ -1790,21 +1228,9 @@
             <w:tcW w:w="2830" w:type="dxa"/>
           </w:tcPr>
           <w:p>
-            <w:pPr>
-              <w:rPr>
-                <w:b w:val="0"/>
-                <w:bCs w:val="0"/>
-              </w:rPr>
-            </w:pPr>
-            <w:proofErr w:type="spellStart"/>
-            <w:r>
-              <w:rPr>
-                <w:b w:val="0"/>
-                <w:bCs w:val="0"/>
-              </w:rPr>
+            <w:r>
               <w:t>Subobjetivos</w:t>
             </w:r>
-            <w:proofErr w:type="spellEnd"/>
           </w:p>
         </w:tc>
         <w:tc>
@@ -1821,138 +1247,80 @@
               <w:cnfStyle w:val="000000000000" w:firstRow="0" w:lastRow="0" w:firstColumn="0" w:lastColumn="0" w:oddVBand="0" w:evenVBand="0" w:oddHBand="0" w:evenHBand="0" w:firstRowFirstColumn="0" w:firstRowLastColumn="0" w:lastRowFirstColumn="0" w:lastRowLastColumn="0"/>
             </w:pPr>
             <w:r>
-              <w:t xml:space="preserve">OBJ-06: </w:t>
-            </w:r>
-            <w:r>
-              <w:rPr>
-                <w:lang w:val="es-ES"/>
-              </w:rPr>
-              <w:t>Desarrollo de Obst</w:t>
-            </w:r>
-            <w:r>
-              <w:rPr>
-                <w:lang w:val="es-ES"/>
-              </w:rPr>
-              <w:t>á</w:t>
-            </w:r>
-            <w:r>
-              <w:rPr>
-                <w:lang w:val="es-ES"/>
-              </w:rPr>
-              <w:t>culos</w:t>
-            </w:r>
-          </w:p>
-        </w:tc>
-      </w:tr>
-      <w:tr>
-        <w:tc>
-          <w:tcPr>
-            <w:cnfStyle w:val="001000000000" w:firstRow="0" w:lastRow="0" w:firstColumn="1" w:lastColumn="0" w:oddVBand="0" w:evenVBand="0" w:oddHBand="0" w:evenHBand="0" w:firstRowFirstColumn="0" w:firstRowLastColumn="0" w:lastRowFirstColumn="0" w:lastRowLastColumn="0"/>
-            <w:tcW w:w="2830" w:type="dxa"/>
-          </w:tcPr>
-          <w:p>
-            <w:pPr>
-              <w:rPr>
-                <w:b w:val="0"/>
-                <w:bCs w:val="0"/>
-              </w:rPr>
-            </w:pPr>
-            <w:proofErr w:type="spellStart"/>
-            <w:r>
-              <w:rPr>
-                <w:b w:val="0"/>
-                <w:bCs w:val="0"/>
-              </w:rPr>
+              <w:t>OBJ-0</w:t>
+            </w:r>
+            <w:r>
+              <w:t>3</w:t>
+            </w:r>
+            <w:r>
+              <w:t>:</w:t>
+            </w:r>
+            <w:r>
+              <w:t xml:space="preserve">  Gestión de vidas</w:t>
+            </w:r>
+          </w:p>
+        </w:tc>
+      </w:tr>
+      <w:tr>
+        <w:tc>
+          <w:tcPr>
+            <w:cnfStyle w:val="001000000000" w:firstRow="0" w:lastRow="0" w:firstColumn="1" w:lastColumn="0" w:oddVBand="0" w:evenVBand="0" w:oddHBand="0" w:evenHBand="0" w:firstRowFirstColumn="0" w:firstRowLastColumn="0" w:lastRowFirstColumn="0" w:lastRowLastColumn="0"/>
+            <w:tcW w:w="2830" w:type="dxa"/>
+          </w:tcPr>
+          <w:p>
+            <w:r>
               <w:t>Importancia</w:t>
             </w:r>
-            <w:proofErr w:type="spellEnd"/>
-          </w:p>
-        </w:tc>
-        <w:tc>
-          <w:tcPr>
-            <w:tcW w:w="6520" w:type="dxa"/>
-          </w:tcPr>
-          <w:p>
-            <w:pPr>
-              <w:cnfStyle w:val="000000000000" w:firstRow="0" w:lastRow="0" w:firstColumn="0" w:lastColumn="0" w:oddVBand="0" w:evenVBand="0" w:oddHBand="0" w:evenHBand="0" w:firstRowFirstColumn="0" w:firstRowLastColumn="0" w:lastRowFirstColumn="0" w:lastRowLastColumn="0"/>
-            </w:pPr>
-            <w:r>
-              <w:t xml:space="preserve">Vital </w:t>
-            </w:r>
-            <w:proofErr w:type="spellStart"/>
-            <w:r>
-              <w:t>importancia</w:t>
-            </w:r>
-            <w:proofErr w:type="spellEnd"/>
-          </w:p>
-        </w:tc>
-      </w:tr>
-      <w:tr>
-        <w:tc>
-          <w:tcPr>
-            <w:cnfStyle w:val="001000000000" w:firstRow="0" w:lastRow="0" w:firstColumn="1" w:lastColumn="0" w:oddVBand="0" w:evenVBand="0" w:oddHBand="0" w:evenHBand="0" w:firstRowFirstColumn="0" w:firstRowLastColumn="0" w:lastRowFirstColumn="0" w:lastRowLastColumn="0"/>
-            <w:tcW w:w="2830" w:type="dxa"/>
-          </w:tcPr>
-          <w:p>
-            <w:pPr>
-              <w:rPr>
-                <w:b w:val="0"/>
-                <w:bCs w:val="0"/>
-              </w:rPr>
-            </w:pPr>
-            <w:proofErr w:type="spellStart"/>
-            <w:r>
-              <w:rPr>
-                <w:b w:val="0"/>
-                <w:bCs w:val="0"/>
-              </w:rPr>
+          </w:p>
+        </w:tc>
+        <w:tc>
+          <w:tcPr>
+            <w:tcW w:w="6520" w:type="dxa"/>
+          </w:tcPr>
+          <w:p>
+            <w:pPr>
+              <w:cnfStyle w:val="000000000000" w:firstRow="0" w:lastRow="0" w:firstColumn="0" w:lastColumn="0" w:oddVBand="0" w:evenVBand="0" w:oddHBand="0" w:evenHBand="0" w:firstRowFirstColumn="0" w:firstRowLastColumn="0" w:lastRowFirstColumn="0" w:lastRowLastColumn="0"/>
+            </w:pPr>
+            <w:r>
+              <w:t>Vital importancia</w:t>
+            </w:r>
+          </w:p>
+        </w:tc>
+      </w:tr>
+      <w:tr>
+        <w:tc>
+          <w:tcPr>
+            <w:cnfStyle w:val="001000000000" w:firstRow="0" w:lastRow="0" w:firstColumn="1" w:lastColumn="0" w:oddVBand="0" w:evenVBand="0" w:oddHBand="0" w:evenHBand="0" w:firstRowFirstColumn="0" w:firstRowLastColumn="0" w:lastRowFirstColumn="0" w:lastRowLastColumn="0"/>
+            <w:tcW w:w="2830" w:type="dxa"/>
+          </w:tcPr>
+          <w:p>
+            <w:r>
               <w:t>Urgencia</w:t>
             </w:r>
-            <w:proofErr w:type="spellEnd"/>
-          </w:p>
-        </w:tc>
-        <w:tc>
-          <w:tcPr>
-            <w:tcW w:w="6520" w:type="dxa"/>
-          </w:tcPr>
-          <w:p>
-            <w:pPr>
-              <w:cnfStyle w:val="000000000000" w:firstRow="0" w:lastRow="0" w:firstColumn="0" w:lastColumn="0" w:oddVBand="0" w:evenVBand="0" w:oddHBand="0" w:evenHBand="0" w:firstRowFirstColumn="0" w:firstRowLastColumn="0" w:lastRowFirstColumn="0" w:lastRowLastColumn="0"/>
-            </w:pPr>
-            <w:proofErr w:type="spellStart"/>
-            <w:r>
-              <w:t>Necesario</w:t>
-            </w:r>
-            <w:proofErr w:type="spellEnd"/>
-            <w:r>
-              <w:t xml:space="preserve"> para </w:t>
-            </w:r>
-            <w:proofErr w:type="spellStart"/>
-            <w:r>
-              <w:t>avanzar</w:t>
-            </w:r>
-            <w:proofErr w:type="spellEnd"/>
-          </w:p>
-        </w:tc>
-      </w:tr>
-      <w:tr>
-        <w:tc>
-          <w:tcPr>
-            <w:cnfStyle w:val="001000000000" w:firstRow="0" w:lastRow="0" w:firstColumn="1" w:lastColumn="0" w:oddVBand="0" w:evenVBand="0" w:oddHBand="0" w:evenHBand="0" w:firstRowFirstColumn="0" w:firstRowLastColumn="0" w:lastRowFirstColumn="0" w:lastRowLastColumn="0"/>
-            <w:tcW w:w="2830" w:type="dxa"/>
-          </w:tcPr>
-          <w:p>
-            <w:pPr>
-              <w:rPr>
-                <w:b w:val="0"/>
-                <w:bCs w:val="0"/>
-              </w:rPr>
-            </w:pPr>
-            <w:r>
-              <w:rPr>
-                <w:b w:val="0"/>
-                <w:bCs w:val="0"/>
-              </w:rPr>
+          </w:p>
+        </w:tc>
+        <w:tc>
+          <w:tcPr>
+            <w:tcW w:w="6520" w:type="dxa"/>
+          </w:tcPr>
+          <w:p>
+            <w:pPr>
+              <w:cnfStyle w:val="000000000000" w:firstRow="0" w:lastRow="0" w:firstColumn="0" w:lastColumn="0" w:oddVBand="0" w:evenVBand="0" w:oddHBand="0" w:evenHBand="0" w:firstRowFirstColumn="0" w:firstRowLastColumn="0" w:lastRowFirstColumn="0" w:lastRowLastColumn="0"/>
+            </w:pPr>
+            <w:r>
+              <w:t>Necesario para avanzar</w:t>
+            </w:r>
+          </w:p>
+        </w:tc>
+      </w:tr>
+      <w:tr>
+        <w:tc>
+          <w:tcPr>
+            <w:cnfStyle w:val="001000000000" w:firstRow="0" w:lastRow="0" w:firstColumn="1" w:lastColumn="0" w:oddVBand="0" w:evenVBand="0" w:oddHBand="0" w:evenHBand="0" w:firstRowFirstColumn="0" w:firstRowLastColumn="0" w:lastRowFirstColumn="0" w:lastRowLastColumn="0"/>
+            <w:tcW w:w="2830" w:type="dxa"/>
+          </w:tcPr>
+          <w:p>
+            <w:r>
               <w:t>Estado</w:t>
             </w:r>
           </w:p>
@@ -1975,21 +1343,9 @@
             <w:tcW w:w="2830" w:type="dxa"/>
           </w:tcPr>
           <w:p>
-            <w:pPr>
-              <w:rPr>
-                <w:b w:val="0"/>
-                <w:bCs w:val="0"/>
-              </w:rPr>
-            </w:pPr>
-            <w:proofErr w:type="spellStart"/>
-            <w:r>
-              <w:rPr>
-                <w:b w:val="0"/>
-                <w:bCs w:val="0"/>
-              </w:rPr>
+            <w:r>
               <w:t>Estabilidad</w:t>
             </w:r>
-            <w:proofErr w:type="spellEnd"/>
           </w:p>
         </w:tc>
         <w:tc>
@@ -2013,21 +1369,9 @@
             <w:tcW w:w="2830" w:type="dxa"/>
           </w:tcPr>
           <w:p>
-            <w:pPr>
-              <w:rPr>
-                <w:b w:val="0"/>
-                <w:bCs w:val="0"/>
-              </w:rPr>
-            </w:pPr>
-            <w:proofErr w:type="spellStart"/>
-            <w:r>
-              <w:rPr>
-                <w:b w:val="0"/>
-                <w:bCs w:val="0"/>
-              </w:rPr>
+            <w:r>
               <w:t>Comentarios</w:t>
             </w:r>
-            <w:proofErr w:type="spellEnd"/>
           </w:p>
         </w:tc>
         <w:tc>
@@ -2123,21 +1467,9 @@
             <w:tcW w:w="2830" w:type="dxa"/>
           </w:tcPr>
           <w:p>
-            <w:pPr>
-              <w:rPr>
-                <w:b w:val="0"/>
-                <w:bCs w:val="0"/>
-              </w:rPr>
-            </w:pPr>
-            <w:proofErr w:type="spellStart"/>
-            <w:r>
-              <w:rPr>
-                <w:b w:val="0"/>
-                <w:bCs w:val="0"/>
-              </w:rPr>
+            <w:r>
               <w:t>Versión</w:t>
             </w:r>
-            <w:proofErr w:type="spellEnd"/>
           </w:p>
         </w:tc>
         <w:tc>
@@ -2161,71 +1493,33 @@
             <w:tcW w:w="2830" w:type="dxa"/>
           </w:tcPr>
           <w:p>
-            <w:pPr>
-              <w:rPr>
-                <w:b w:val="0"/>
-                <w:bCs w:val="0"/>
-              </w:rPr>
-            </w:pPr>
-            <w:proofErr w:type="spellStart"/>
-            <w:r>
-              <w:rPr>
-                <w:b w:val="0"/>
-                <w:bCs w:val="0"/>
-              </w:rPr>
+            <w:r>
               <w:t>Autores</w:t>
             </w:r>
-            <w:proofErr w:type="spellEnd"/>
-          </w:p>
-        </w:tc>
-        <w:tc>
-          <w:tcPr>
-            <w:tcW w:w="6520" w:type="dxa"/>
-          </w:tcPr>
-          <w:p>
-            <w:pPr>
-              <w:cnfStyle w:val="000000000000" w:firstRow="0" w:lastRow="0" w:firstColumn="0" w:lastColumn="0" w:oddVBand="0" w:evenVBand="0" w:oddHBand="0" w:evenHBand="0" w:firstRowFirstColumn="0" w:firstRowLastColumn="0" w:lastRowFirstColumn="0" w:lastRowLastColumn="0"/>
-            </w:pPr>
-            <w:r>
-              <w:t xml:space="preserve">Ángel </w:t>
-            </w:r>
-            <w:proofErr w:type="spellStart"/>
-            <w:r>
-              <w:t>Torijano</w:t>
-            </w:r>
-            <w:proofErr w:type="spellEnd"/>
-            <w:r>
-              <w:t xml:space="preserve"> </w:t>
-            </w:r>
-            <w:proofErr w:type="spellStart"/>
-            <w:r>
-              <w:t>Sexmero</w:t>
-            </w:r>
-            <w:proofErr w:type="spellEnd"/>
-            <w:r>
-              <w:t xml:space="preserve"> </w:t>
-            </w:r>
-          </w:p>
-        </w:tc>
-      </w:tr>
-      <w:tr>
-        <w:tc>
-          <w:tcPr>
-            <w:cnfStyle w:val="001000000000" w:firstRow="0" w:lastRow="0" w:firstColumn="1" w:lastColumn="0" w:oddVBand="0" w:evenVBand="0" w:oddHBand="0" w:evenHBand="0" w:firstRowFirstColumn="0" w:firstRowLastColumn="0" w:lastRowFirstColumn="0" w:lastRowLastColumn="0"/>
-            <w:tcW w:w="2830" w:type="dxa"/>
-          </w:tcPr>
-          <w:p>
-            <w:pPr>
-              <w:rPr>
-                <w:b w:val="0"/>
-                <w:bCs w:val="0"/>
-              </w:rPr>
-            </w:pPr>
-            <w:r>
-              <w:rPr>
-                <w:b w:val="0"/>
-                <w:bCs w:val="0"/>
-              </w:rPr>
+          </w:p>
+        </w:tc>
+        <w:tc>
+          <w:tcPr>
+            <w:tcW w:w="6520" w:type="dxa"/>
+          </w:tcPr>
+          <w:p>
+            <w:pPr>
+              <w:cnfStyle w:val="000000000000" w:firstRow="0" w:lastRow="0" w:firstColumn="0" w:lastColumn="0" w:oddVBand="0" w:evenVBand="0" w:oddHBand="0" w:evenHBand="0" w:firstRowFirstColumn="0" w:firstRowLastColumn="0" w:lastRowFirstColumn="0" w:lastRowLastColumn="0"/>
+            </w:pPr>
+            <w:r>
+              <w:t xml:space="preserve">Ángel Torijano Sexmero </w:t>
+            </w:r>
+          </w:p>
+        </w:tc>
+      </w:tr>
+      <w:tr>
+        <w:tc>
+          <w:tcPr>
+            <w:cnfStyle w:val="001000000000" w:firstRow="0" w:lastRow="0" w:firstColumn="1" w:lastColumn="0" w:oddVBand="0" w:evenVBand="0" w:oddHBand="0" w:evenHBand="0" w:firstRowFirstColumn="0" w:firstRowLastColumn="0" w:lastRowFirstColumn="0" w:lastRowLastColumn="0"/>
+            <w:tcW w:w="2830" w:type="dxa"/>
+          </w:tcPr>
+          <w:p>
+            <w:r>
               <w:t>Fuentes</w:t>
             </w:r>
           </w:p>
@@ -2251,21 +1545,9 @@
             <w:tcW w:w="2830" w:type="dxa"/>
           </w:tcPr>
           <w:p>
-            <w:pPr>
-              <w:rPr>
-                <w:b w:val="0"/>
-                <w:bCs w:val="0"/>
-              </w:rPr>
-            </w:pPr>
-            <w:proofErr w:type="spellStart"/>
-            <w:r>
-              <w:rPr>
-                <w:b w:val="0"/>
-                <w:bCs w:val="0"/>
-              </w:rPr>
+            <w:r>
               <w:t>Descripción</w:t>
             </w:r>
-            <w:proofErr w:type="spellEnd"/>
           </w:p>
         </w:tc>
         <w:tc>
@@ -2307,99 +1589,58 @@
             <w:tcW w:w="2830" w:type="dxa"/>
           </w:tcPr>
           <w:p>
-            <w:pPr>
-              <w:rPr>
-                <w:b w:val="0"/>
-                <w:bCs w:val="0"/>
-              </w:rPr>
-            </w:pPr>
-            <w:proofErr w:type="spellStart"/>
-            <w:r>
-              <w:rPr>
-                <w:b w:val="0"/>
-                <w:bCs w:val="0"/>
-              </w:rPr>
+            <w:r>
               <w:t>Subobjetivos</w:t>
             </w:r>
-            <w:proofErr w:type="spellEnd"/>
-          </w:p>
-        </w:tc>
-        <w:tc>
-          <w:tcPr>
-            <w:tcW w:w="6520" w:type="dxa"/>
-          </w:tcPr>
-          <w:p>
-            <w:pPr>
-              <w:cnfStyle w:val="000000000000" w:firstRow="0" w:lastRow="0" w:firstColumn="0" w:lastColumn="0" w:oddVBand="0" w:evenVBand="0" w:oddHBand="0" w:evenHBand="0" w:firstRowFirstColumn="0" w:firstRowLastColumn="0" w:lastRowFirstColumn="0" w:lastRowLastColumn="0"/>
-            </w:pPr>
-          </w:p>
-        </w:tc>
-      </w:tr>
-      <w:tr>
-        <w:tc>
-          <w:tcPr>
-            <w:cnfStyle w:val="001000000000" w:firstRow="0" w:lastRow="0" w:firstColumn="1" w:lastColumn="0" w:oddVBand="0" w:evenVBand="0" w:oddHBand="0" w:evenHBand="0" w:firstRowFirstColumn="0" w:firstRowLastColumn="0" w:lastRowFirstColumn="0" w:lastRowLastColumn="0"/>
-            <w:tcW w:w="2830" w:type="dxa"/>
-          </w:tcPr>
-          <w:p>
-            <w:pPr>
-              <w:rPr>
-                <w:b w:val="0"/>
-                <w:bCs w:val="0"/>
-              </w:rPr>
-            </w:pPr>
-            <w:proofErr w:type="spellStart"/>
-            <w:r>
-              <w:rPr>
-                <w:b w:val="0"/>
-                <w:bCs w:val="0"/>
-              </w:rPr>
+          </w:p>
+        </w:tc>
+        <w:tc>
+          <w:tcPr>
+            <w:tcW w:w="6520" w:type="dxa"/>
+          </w:tcPr>
+          <w:p>
+            <w:pPr>
+              <w:cnfStyle w:val="000000000000" w:firstRow="0" w:lastRow="0" w:firstColumn="0" w:lastColumn="0" w:oddVBand="0" w:evenVBand="0" w:oddHBand="0" w:evenHBand="0" w:firstRowFirstColumn="0" w:firstRowLastColumn="0" w:lastRowFirstColumn="0" w:lastRowLastColumn="0"/>
+            </w:pPr>
+          </w:p>
+        </w:tc>
+      </w:tr>
+      <w:tr>
+        <w:tc>
+          <w:tcPr>
+            <w:cnfStyle w:val="001000000000" w:firstRow="0" w:lastRow="0" w:firstColumn="1" w:lastColumn="0" w:oddVBand="0" w:evenVBand="0" w:oddHBand="0" w:evenHBand="0" w:firstRowFirstColumn="0" w:firstRowLastColumn="0" w:lastRowFirstColumn="0" w:lastRowLastColumn="0"/>
+            <w:tcW w:w="2830" w:type="dxa"/>
+          </w:tcPr>
+          <w:p>
+            <w:r>
               <w:t>Importancia</w:t>
             </w:r>
-            <w:proofErr w:type="spellEnd"/>
-          </w:p>
-        </w:tc>
-        <w:tc>
-          <w:tcPr>
-            <w:tcW w:w="6520" w:type="dxa"/>
-          </w:tcPr>
-          <w:p>
-            <w:pPr>
-              <w:cnfStyle w:val="000000000000" w:firstRow="0" w:lastRow="0" w:firstColumn="0" w:lastColumn="0" w:oddVBand="0" w:evenVBand="0" w:oddHBand="0" w:evenHBand="0" w:firstRowFirstColumn="0" w:firstRowLastColumn="0" w:lastRowFirstColumn="0" w:lastRowLastColumn="0"/>
-            </w:pPr>
-            <w:r>
-              <w:t xml:space="preserve">Vital </w:t>
-            </w:r>
-            <w:proofErr w:type="spellStart"/>
-            <w:r>
-              <w:t>importancia</w:t>
-            </w:r>
-            <w:proofErr w:type="spellEnd"/>
-          </w:p>
-        </w:tc>
-      </w:tr>
-      <w:tr>
-        <w:tc>
-          <w:tcPr>
-            <w:cnfStyle w:val="001000000000" w:firstRow="0" w:lastRow="0" w:firstColumn="1" w:lastColumn="0" w:oddVBand="0" w:evenVBand="0" w:oddHBand="0" w:evenHBand="0" w:firstRowFirstColumn="0" w:firstRowLastColumn="0" w:lastRowFirstColumn="0" w:lastRowLastColumn="0"/>
-            <w:tcW w:w="2830" w:type="dxa"/>
-          </w:tcPr>
-          <w:p>
-            <w:pPr>
-              <w:rPr>
-                <w:b w:val="0"/>
-                <w:bCs w:val="0"/>
-              </w:rPr>
-            </w:pPr>
-            <w:proofErr w:type="spellStart"/>
-            <w:r>
-              <w:rPr>
-                <w:b w:val="0"/>
-                <w:bCs w:val="0"/>
-              </w:rPr>
+          </w:p>
+        </w:tc>
+        <w:tc>
+          <w:tcPr>
+            <w:tcW w:w="6520" w:type="dxa"/>
+          </w:tcPr>
+          <w:p>
+            <w:pPr>
+              <w:cnfStyle w:val="000000000000" w:firstRow="0" w:lastRow="0" w:firstColumn="0" w:lastColumn="0" w:oddVBand="0" w:evenVBand="0" w:oddHBand="0" w:evenHBand="0" w:firstRowFirstColumn="0" w:firstRowLastColumn="0" w:lastRowFirstColumn="0" w:lastRowLastColumn="0"/>
+            </w:pPr>
+            <w:r>
+              <w:t>Vital importancia</w:t>
+            </w:r>
+          </w:p>
+        </w:tc>
+      </w:tr>
+      <w:tr>
+        <w:tc>
+          <w:tcPr>
+            <w:cnfStyle w:val="001000000000" w:firstRow="0" w:lastRow="0" w:firstColumn="1" w:lastColumn="0" w:oddVBand="0" w:evenVBand="0" w:oddHBand="0" w:evenHBand="0" w:firstRowFirstColumn="0" w:firstRowLastColumn="0" w:lastRowFirstColumn="0" w:lastRowLastColumn="0"/>
+            <w:tcW w:w="2830" w:type="dxa"/>
+          </w:tcPr>
+          <w:p>
+            <w:r>
               <w:t>Urgencia</w:t>
             </w:r>
-            <w:proofErr w:type="spellEnd"/>
           </w:p>
         </w:tc>
         <w:tc>
@@ -2423,17 +1664,7 @@
             <w:tcW w:w="2830" w:type="dxa"/>
           </w:tcPr>
           <w:p>
-            <w:pPr>
-              <w:rPr>
-                <w:b w:val="0"/>
-                <w:bCs w:val="0"/>
-              </w:rPr>
-            </w:pPr>
-            <w:r>
-              <w:rPr>
-                <w:b w:val="0"/>
-                <w:bCs w:val="0"/>
-              </w:rPr>
+            <w:r>
               <w:t>Estado</w:t>
             </w:r>
           </w:p>
@@ -2456,21 +1687,9 @@
             <w:tcW w:w="2830" w:type="dxa"/>
           </w:tcPr>
           <w:p>
-            <w:pPr>
-              <w:rPr>
-                <w:b w:val="0"/>
-                <w:bCs w:val="0"/>
-              </w:rPr>
-            </w:pPr>
-            <w:proofErr w:type="spellStart"/>
-            <w:r>
-              <w:rPr>
-                <w:b w:val="0"/>
-                <w:bCs w:val="0"/>
-              </w:rPr>
+            <w:r>
               <w:t>Estabilidad</w:t>
             </w:r>
-            <w:proofErr w:type="spellEnd"/>
           </w:p>
         </w:tc>
         <w:tc>
@@ -2494,21 +1713,9 @@
             <w:tcW w:w="2830" w:type="dxa"/>
           </w:tcPr>
           <w:p>
-            <w:pPr>
-              <w:rPr>
-                <w:b w:val="0"/>
-                <w:bCs w:val="0"/>
-              </w:rPr>
-            </w:pPr>
-            <w:proofErr w:type="spellStart"/>
-            <w:r>
-              <w:rPr>
-                <w:b w:val="0"/>
-                <w:bCs w:val="0"/>
-              </w:rPr>
+            <w:r>
               <w:t>Comentarios</w:t>
             </w:r>
-            <w:proofErr w:type="spellEnd"/>
           </w:p>
         </w:tc>
         <w:tc>
@@ -2600,33 +1807,33 @@
               <w:rPr>
                 <w:lang w:val="es-ES"/>
               </w:rPr>
-              <w:t>Desarrollo de Obstáculos</w:t>
-            </w:r>
-          </w:p>
-        </w:tc>
-      </w:tr>
-      <w:tr>
-        <w:tc>
-          <w:tcPr>
-            <w:cnfStyle w:val="001000000000" w:firstRow="0" w:lastRow="0" w:firstColumn="1" w:lastColumn="0" w:oddVBand="0" w:evenVBand="0" w:oddHBand="0" w:evenHBand="0" w:firstRowFirstColumn="0" w:firstRowLastColumn="0" w:lastRowFirstColumn="0" w:lastRowLastColumn="0"/>
-            <w:tcW w:w="2830" w:type="dxa"/>
-          </w:tcPr>
-          <w:p>
-            <w:pPr>
-              <w:rPr>
-                <w:b w:val="0"/>
-                <w:bCs w:val="0"/>
-              </w:rPr>
-            </w:pPr>
-            <w:proofErr w:type="spellStart"/>
-            <w:r>
-              <w:rPr>
-                <w:b w:val="0"/>
-                <w:bCs w:val="0"/>
-              </w:rPr>
+              <w:t>Gestión</w:t>
+            </w:r>
+            <w:r>
+              <w:rPr>
+                <w:lang w:val="es-ES"/>
+              </w:rPr>
+              <w:t xml:space="preserve"> de </w:t>
+            </w:r>
+            <w:r>
+              <w:rPr>
+                <w:lang w:val="es-ES"/>
+              </w:rPr>
+              <w:t>vidas</w:t>
+            </w:r>
+          </w:p>
+        </w:tc>
+      </w:tr>
+      <w:tr>
+        <w:tc>
+          <w:tcPr>
+            <w:cnfStyle w:val="001000000000" w:firstRow="0" w:lastRow="0" w:firstColumn="1" w:lastColumn="0" w:oddVBand="0" w:evenVBand="0" w:oddHBand="0" w:evenHBand="0" w:firstRowFirstColumn="0" w:firstRowLastColumn="0" w:lastRowFirstColumn="0" w:lastRowLastColumn="0"/>
+            <w:tcW w:w="2830" w:type="dxa"/>
+          </w:tcPr>
+          <w:p>
+            <w:r>
               <w:t>Versión</w:t>
             </w:r>
-            <w:proofErr w:type="spellEnd"/>
           </w:p>
         </w:tc>
         <w:tc>
@@ -2650,71 +1857,33 @@
             <w:tcW w:w="2830" w:type="dxa"/>
           </w:tcPr>
           <w:p>
-            <w:pPr>
-              <w:rPr>
-                <w:b w:val="0"/>
-                <w:bCs w:val="0"/>
-              </w:rPr>
-            </w:pPr>
-            <w:proofErr w:type="spellStart"/>
-            <w:r>
-              <w:rPr>
-                <w:b w:val="0"/>
-                <w:bCs w:val="0"/>
-              </w:rPr>
+            <w:r>
               <w:t>Autores</w:t>
             </w:r>
-            <w:proofErr w:type="spellEnd"/>
-          </w:p>
-        </w:tc>
-        <w:tc>
-          <w:tcPr>
-            <w:tcW w:w="6520" w:type="dxa"/>
-          </w:tcPr>
-          <w:p>
-            <w:pPr>
-              <w:cnfStyle w:val="000000000000" w:firstRow="0" w:lastRow="0" w:firstColumn="0" w:lastColumn="0" w:oddVBand="0" w:evenVBand="0" w:oddHBand="0" w:evenHBand="0" w:firstRowFirstColumn="0" w:firstRowLastColumn="0" w:lastRowFirstColumn="0" w:lastRowLastColumn="0"/>
-            </w:pPr>
-            <w:r>
-              <w:t xml:space="preserve">Ángel </w:t>
-            </w:r>
-            <w:proofErr w:type="spellStart"/>
-            <w:r>
-              <w:t>Torijano</w:t>
-            </w:r>
-            <w:proofErr w:type="spellEnd"/>
-            <w:r>
-              <w:t xml:space="preserve"> </w:t>
-            </w:r>
-            <w:proofErr w:type="spellStart"/>
-            <w:r>
-              <w:t>Sexmero</w:t>
-            </w:r>
-            <w:proofErr w:type="spellEnd"/>
-            <w:r>
-              <w:t xml:space="preserve"> </w:t>
-            </w:r>
-          </w:p>
-        </w:tc>
-      </w:tr>
-      <w:tr>
-        <w:tc>
-          <w:tcPr>
-            <w:cnfStyle w:val="001000000000" w:firstRow="0" w:lastRow="0" w:firstColumn="1" w:lastColumn="0" w:oddVBand="0" w:evenVBand="0" w:oddHBand="0" w:evenHBand="0" w:firstRowFirstColumn="0" w:firstRowLastColumn="0" w:lastRowFirstColumn="0" w:lastRowLastColumn="0"/>
-            <w:tcW w:w="2830" w:type="dxa"/>
-          </w:tcPr>
-          <w:p>
-            <w:pPr>
-              <w:rPr>
-                <w:b w:val="0"/>
-                <w:bCs w:val="0"/>
-              </w:rPr>
-            </w:pPr>
-            <w:r>
-              <w:rPr>
-                <w:b w:val="0"/>
-                <w:bCs w:val="0"/>
-              </w:rPr>
+          </w:p>
+        </w:tc>
+        <w:tc>
+          <w:tcPr>
+            <w:tcW w:w="6520" w:type="dxa"/>
+          </w:tcPr>
+          <w:p>
+            <w:pPr>
+              <w:cnfStyle w:val="000000000000" w:firstRow="0" w:lastRow="0" w:firstColumn="0" w:lastColumn="0" w:oddVBand="0" w:evenVBand="0" w:oddHBand="0" w:evenHBand="0" w:firstRowFirstColumn="0" w:firstRowLastColumn="0" w:lastRowFirstColumn="0" w:lastRowLastColumn="0"/>
+            </w:pPr>
+            <w:r>
+              <w:t xml:space="preserve">Ángel Torijano Sexmero </w:t>
+            </w:r>
+          </w:p>
+        </w:tc>
+      </w:tr>
+      <w:tr>
+        <w:tc>
+          <w:tcPr>
+            <w:cnfStyle w:val="001000000000" w:firstRow="0" w:lastRow="0" w:firstColumn="1" w:lastColumn="0" w:oddVBand="0" w:evenVBand="0" w:oddHBand="0" w:evenHBand="0" w:firstRowFirstColumn="0" w:firstRowLastColumn="0" w:lastRowFirstColumn="0" w:lastRowLastColumn="0"/>
+            <w:tcW w:w="2830" w:type="dxa"/>
+          </w:tcPr>
+          <w:p>
+            <w:r>
               <w:t>Fuentes</w:t>
             </w:r>
           </w:p>
@@ -2740,21 +1909,9 @@
             <w:tcW w:w="2830" w:type="dxa"/>
           </w:tcPr>
           <w:p>
-            <w:pPr>
-              <w:rPr>
-                <w:b w:val="0"/>
-                <w:bCs w:val="0"/>
-              </w:rPr>
-            </w:pPr>
-            <w:proofErr w:type="spellStart"/>
-            <w:r>
-              <w:rPr>
-                <w:b w:val="0"/>
-                <w:bCs w:val="0"/>
-              </w:rPr>
+            <w:r>
               <w:t>Descripción</w:t>
             </w:r>
-            <w:proofErr w:type="spellEnd"/>
           </w:p>
         </w:tc>
         <w:tc>
@@ -2778,111 +1935,70 @@
               <w:rPr>
                 <w:lang w:val="es-ES"/>
               </w:rPr>
-              <w:t>propondrá desafíos al jugador en forma de obstáculos y enemigos que tendrá que resolver para poder avanzar en el nivel.</w:t>
-            </w:r>
-          </w:p>
-        </w:tc>
-      </w:tr>
-      <w:tr>
-        <w:tc>
-          <w:tcPr>
-            <w:cnfStyle w:val="001000000000" w:firstRow="0" w:lastRow="0" w:firstColumn="1" w:lastColumn="0" w:oddVBand="0" w:evenVBand="0" w:oddHBand="0" w:evenHBand="0" w:firstRowFirstColumn="0" w:firstRowLastColumn="0" w:lastRowFirstColumn="0" w:lastRowLastColumn="0"/>
-            <w:tcW w:w="2830" w:type="dxa"/>
-          </w:tcPr>
-          <w:p>
-            <w:pPr>
-              <w:rPr>
-                <w:b w:val="0"/>
-                <w:bCs w:val="0"/>
-              </w:rPr>
-            </w:pPr>
-            <w:proofErr w:type="spellStart"/>
-            <w:r>
-              <w:rPr>
-                <w:b w:val="0"/>
-                <w:bCs w:val="0"/>
-              </w:rPr>
+              <w:t>presentará al jugador un sistema de salud que interactuará con enemigos, obstáculos o recolectables.</w:t>
+            </w:r>
+          </w:p>
+        </w:tc>
+      </w:tr>
+      <w:tr>
+        <w:tc>
+          <w:tcPr>
+            <w:cnfStyle w:val="001000000000" w:firstRow="0" w:lastRow="0" w:firstColumn="1" w:lastColumn="0" w:oddVBand="0" w:evenVBand="0" w:oddHBand="0" w:evenHBand="0" w:firstRowFirstColumn="0" w:firstRowLastColumn="0" w:lastRowFirstColumn="0" w:lastRowLastColumn="0"/>
+            <w:tcW w:w="2830" w:type="dxa"/>
+          </w:tcPr>
+          <w:p>
+            <w:r>
               <w:t>Subobjetivos</w:t>
             </w:r>
-            <w:proofErr w:type="spellEnd"/>
-          </w:p>
-        </w:tc>
-        <w:tc>
-          <w:tcPr>
-            <w:tcW w:w="6520" w:type="dxa"/>
-          </w:tcPr>
-          <w:p>
-            <w:pPr>
-              <w:cnfStyle w:val="000000000000" w:firstRow="0" w:lastRow="0" w:firstColumn="0" w:lastColumn="0" w:oddVBand="0" w:evenVBand="0" w:oddHBand="0" w:evenHBand="0" w:firstRowFirstColumn="0" w:firstRowLastColumn="0" w:lastRowFirstColumn="0" w:lastRowLastColumn="0"/>
-            </w:pPr>
-          </w:p>
-        </w:tc>
-      </w:tr>
-      <w:tr>
-        <w:tc>
-          <w:tcPr>
-            <w:cnfStyle w:val="001000000000" w:firstRow="0" w:lastRow="0" w:firstColumn="1" w:lastColumn="0" w:oddVBand="0" w:evenVBand="0" w:oddHBand="0" w:evenHBand="0" w:firstRowFirstColumn="0" w:firstRowLastColumn="0" w:lastRowFirstColumn="0" w:lastRowLastColumn="0"/>
-            <w:tcW w:w="2830" w:type="dxa"/>
-          </w:tcPr>
-          <w:p>
-            <w:pPr>
-              <w:rPr>
-                <w:b w:val="0"/>
-                <w:bCs w:val="0"/>
-              </w:rPr>
-            </w:pPr>
-            <w:proofErr w:type="spellStart"/>
-            <w:r>
-              <w:rPr>
-                <w:b w:val="0"/>
-                <w:bCs w:val="0"/>
-              </w:rPr>
+          </w:p>
+        </w:tc>
+        <w:tc>
+          <w:tcPr>
+            <w:tcW w:w="6520" w:type="dxa"/>
+          </w:tcPr>
+          <w:p>
+            <w:pPr>
+              <w:cnfStyle w:val="000000000000" w:firstRow="0" w:lastRow="0" w:firstColumn="0" w:lastColumn="0" w:oddVBand="0" w:evenVBand="0" w:oddHBand="0" w:evenHBand="0" w:firstRowFirstColumn="0" w:firstRowLastColumn="0" w:lastRowFirstColumn="0" w:lastRowLastColumn="0"/>
+            </w:pPr>
+          </w:p>
+        </w:tc>
+      </w:tr>
+      <w:tr>
+        <w:tc>
+          <w:tcPr>
+            <w:cnfStyle w:val="001000000000" w:firstRow="0" w:lastRow="0" w:firstColumn="1" w:lastColumn="0" w:oddVBand="0" w:evenVBand="0" w:oddHBand="0" w:evenHBand="0" w:firstRowFirstColumn="0" w:firstRowLastColumn="0" w:lastRowFirstColumn="0" w:lastRowLastColumn="0"/>
+            <w:tcW w:w="2830" w:type="dxa"/>
+          </w:tcPr>
+          <w:p>
+            <w:r>
               <w:t>Importancia</w:t>
             </w:r>
-            <w:proofErr w:type="spellEnd"/>
-          </w:p>
-        </w:tc>
-        <w:tc>
-          <w:tcPr>
-            <w:tcW w:w="6520" w:type="dxa"/>
-          </w:tcPr>
-          <w:p>
-            <w:pPr>
-              <w:cnfStyle w:val="000000000000" w:firstRow="0" w:lastRow="0" w:firstColumn="0" w:lastColumn="0" w:oddVBand="0" w:evenVBand="0" w:oddHBand="0" w:evenHBand="0" w:firstRowFirstColumn="0" w:firstRowLastColumn="0" w:lastRowFirstColumn="0" w:lastRowLastColumn="0"/>
-            </w:pPr>
-            <w:r>
-              <w:t xml:space="preserve">Vital </w:t>
-            </w:r>
-            <w:proofErr w:type="spellStart"/>
-            <w:r>
-              <w:t>importancia</w:t>
-            </w:r>
-            <w:proofErr w:type="spellEnd"/>
-          </w:p>
-        </w:tc>
-      </w:tr>
-      <w:tr>
-        <w:tc>
-          <w:tcPr>
-            <w:cnfStyle w:val="001000000000" w:firstRow="0" w:lastRow="0" w:firstColumn="1" w:lastColumn="0" w:oddVBand="0" w:evenVBand="0" w:oddHBand="0" w:evenHBand="0" w:firstRowFirstColumn="0" w:firstRowLastColumn="0" w:lastRowFirstColumn="0" w:lastRowLastColumn="0"/>
-            <w:tcW w:w="2830" w:type="dxa"/>
-          </w:tcPr>
-          <w:p>
-            <w:pPr>
-              <w:rPr>
-                <w:b w:val="0"/>
-                <w:bCs w:val="0"/>
-              </w:rPr>
-            </w:pPr>
-            <w:proofErr w:type="spellStart"/>
-            <w:r>
-              <w:rPr>
-                <w:b w:val="0"/>
-                <w:bCs w:val="0"/>
-              </w:rPr>
+          </w:p>
+        </w:tc>
+        <w:tc>
+          <w:tcPr>
+            <w:tcW w:w="6520" w:type="dxa"/>
+          </w:tcPr>
+          <w:p>
+            <w:pPr>
+              <w:cnfStyle w:val="000000000000" w:firstRow="0" w:lastRow="0" w:firstColumn="0" w:lastColumn="0" w:oddVBand="0" w:evenVBand="0" w:oddHBand="0" w:evenHBand="0" w:firstRowFirstColumn="0" w:firstRowLastColumn="0" w:lastRowFirstColumn="0" w:lastRowLastColumn="0"/>
+            </w:pPr>
+            <w:r>
+              <w:t>Alta</w:t>
+            </w:r>
+          </w:p>
+        </w:tc>
+      </w:tr>
+      <w:tr>
+        <w:tc>
+          <w:tcPr>
+            <w:cnfStyle w:val="001000000000" w:firstRow="0" w:lastRow="0" w:firstColumn="1" w:lastColumn="0" w:oddVBand="0" w:evenVBand="0" w:oddHBand="0" w:evenHBand="0" w:firstRowFirstColumn="0" w:firstRowLastColumn="0" w:lastRowFirstColumn="0" w:lastRowLastColumn="0"/>
+            <w:tcW w:w="2830" w:type="dxa"/>
+          </w:tcPr>
+          <w:p>
+            <w:r>
               <w:t>Urgencia</w:t>
             </w:r>
-            <w:proofErr w:type="spellEnd"/>
           </w:p>
         </w:tc>
         <w:tc>
@@ -2906,17 +2022,7 @@
             <w:tcW w:w="2830" w:type="dxa"/>
           </w:tcPr>
           <w:p>
-            <w:pPr>
-              <w:rPr>
-                <w:b w:val="0"/>
-                <w:bCs w:val="0"/>
-              </w:rPr>
-            </w:pPr>
-            <w:r>
-              <w:rPr>
-                <w:b w:val="0"/>
-                <w:bCs w:val="0"/>
-              </w:rPr>
+            <w:r>
               <w:t>Estado</w:t>
             </w:r>
           </w:p>
@@ -2939,21 +2045,9 @@
             <w:tcW w:w="2830" w:type="dxa"/>
           </w:tcPr>
           <w:p>
-            <w:pPr>
-              <w:rPr>
-                <w:b w:val="0"/>
-                <w:bCs w:val="0"/>
-              </w:rPr>
-            </w:pPr>
-            <w:proofErr w:type="spellStart"/>
-            <w:r>
-              <w:rPr>
-                <w:b w:val="0"/>
-                <w:bCs w:val="0"/>
-              </w:rPr>
+            <w:r>
               <w:t>Estabilidad</w:t>
             </w:r>
-            <w:proofErr w:type="spellEnd"/>
           </w:p>
         </w:tc>
         <w:tc>
@@ -2977,39 +2071,39 @@
             <w:tcW w:w="2830" w:type="dxa"/>
           </w:tcPr>
           <w:p>
-            <w:pPr>
-              <w:rPr>
-                <w:b w:val="0"/>
-                <w:bCs w:val="0"/>
-              </w:rPr>
-            </w:pPr>
-            <w:proofErr w:type="spellStart"/>
-            <w:r>
-              <w:rPr>
-                <w:b w:val="0"/>
-                <w:bCs w:val="0"/>
-              </w:rPr>
+            <w:r>
               <w:t>Comentarios</w:t>
             </w:r>
-            <w:proofErr w:type="spellEnd"/>
-          </w:p>
-        </w:tc>
-        <w:tc>
-          <w:tcPr>
-            <w:tcW w:w="6520" w:type="dxa"/>
-          </w:tcPr>
-          <w:p>
-            <w:pPr>
-              <w:cnfStyle w:val="000000000000" w:firstRow="0" w:lastRow="0" w:firstColumn="0" w:lastColumn="0" w:oddVBand="0" w:evenVBand="0" w:oddHBand="0" w:evenHBand="0" w:firstRowFirstColumn="0" w:firstRowLastColumn="0" w:lastRowFirstColumn="0" w:lastRowLastColumn="0"/>
-              <w:rPr>
-                <w:lang w:val="es-ES"/>
-              </w:rPr>
-            </w:pPr>
-            <w:r>
-              <w:rPr>
-                <w:lang w:val="es-ES"/>
-              </w:rPr>
-              <w:t>Para mejorar la experiencia de juego, se implementara un sistema de vidas, fosos donde podrás caerte, y demás elementos que castiguen o fuercen al jugador a utilizar las habilidades rítmicas.</w:t>
+          </w:p>
+        </w:tc>
+        <w:tc>
+          <w:tcPr>
+            <w:tcW w:w="6520" w:type="dxa"/>
+          </w:tcPr>
+          <w:p>
+            <w:pPr>
+              <w:cnfStyle w:val="000000000000" w:firstRow="0" w:lastRow="0" w:firstColumn="0" w:lastColumn="0" w:oddVBand="0" w:evenVBand="0" w:oddHBand="0" w:evenHBand="0" w:firstRowFirstColumn="0" w:firstRowLastColumn="0" w:lastRowFirstColumn="0" w:lastRowLastColumn="0"/>
+              <w:rPr>
+                <w:lang w:val="es-ES"/>
+              </w:rPr>
+            </w:pPr>
+            <w:r>
+              <w:rPr>
+                <w:lang w:val="es-ES"/>
+              </w:rPr>
+              <w:t xml:space="preserve">Para mejorar la experiencia de juego, se </w:t>
+            </w:r>
+            <w:r>
+              <w:rPr>
+                <w:lang w:val="es-ES"/>
+              </w:rPr>
+              <w:t>implementará</w:t>
+            </w:r>
+            <w:r>
+              <w:rPr>
+                <w:lang w:val="es-ES"/>
+              </w:rPr>
+              <w:t xml:space="preserve"> un sistema de vidas, fosos donde podrás caerte, y demás elementos que castiguen o fuercen al jugador a utilizar las habilidades rítmicas.</w:t>
             </w:r>
           </w:p>
         </w:tc>
@@ -3063,45 +2157,25 @@
                 <w:lang w:val="es-ES"/>
               </w:rPr>
             </w:pPr>
-            <w:proofErr w:type="spellStart"/>
-            <w:r>
-              <w:rPr>
-                <w:lang w:val="es-ES"/>
-              </w:rPr>
-              <w:t>Gestion</w:t>
-            </w:r>
-            <w:proofErr w:type="spellEnd"/>
-            <w:r>
-              <w:rPr>
-                <w:lang w:val="es-ES"/>
-              </w:rPr>
-              <w:t xml:space="preserve"> de puntuaciones</w:t>
-            </w:r>
-          </w:p>
-        </w:tc>
-      </w:tr>
-      <w:tr>
-        <w:tc>
-          <w:tcPr>
-            <w:cnfStyle w:val="001000000000" w:firstRow="0" w:lastRow="0" w:firstColumn="1" w:lastColumn="0" w:oddVBand="0" w:evenVBand="0" w:oddHBand="0" w:evenHBand="0" w:firstRowFirstColumn="0" w:firstRowLastColumn="0" w:lastRowFirstColumn="0" w:lastRowLastColumn="0"/>
-            <w:tcW w:w="2830" w:type="dxa"/>
-          </w:tcPr>
-          <w:p>
-            <w:pPr>
-              <w:rPr>
-                <w:b w:val="0"/>
-                <w:bCs w:val="0"/>
-              </w:rPr>
-            </w:pPr>
-            <w:proofErr w:type="spellStart"/>
-            <w:r>
-              <w:rPr>
-                <w:b w:val="0"/>
-                <w:bCs w:val="0"/>
-              </w:rPr>
+            <w:r>
+              <w:rPr>
+                <w:lang w:val="es-ES"/>
+              </w:rPr>
+              <w:t>Gestion de puntuaciones</w:t>
+            </w:r>
+          </w:p>
+        </w:tc>
+      </w:tr>
+      <w:tr>
+        <w:tc>
+          <w:tcPr>
+            <w:cnfStyle w:val="001000000000" w:firstRow="0" w:lastRow="0" w:firstColumn="1" w:lastColumn="0" w:oddVBand="0" w:evenVBand="0" w:oddHBand="0" w:evenHBand="0" w:firstRowFirstColumn="0" w:firstRowLastColumn="0" w:lastRowFirstColumn="0" w:lastRowLastColumn="0"/>
+            <w:tcW w:w="2830" w:type="dxa"/>
+          </w:tcPr>
+          <w:p>
+            <w:r>
               <w:t>Versión</w:t>
             </w:r>
-            <w:proofErr w:type="spellEnd"/>
           </w:p>
         </w:tc>
         <w:tc>
@@ -3125,71 +2199,33 @@
             <w:tcW w:w="2830" w:type="dxa"/>
           </w:tcPr>
           <w:p>
-            <w:pPr>
-              <w:rPr>
-                <w:b w:val="0"/>
-                <w:bCs w:val="0"/>
-              </w:rPr>
-            </w:pPr>
-            <w:proofErr w:type="spellStart"/>
-            <w:r>
-              <w:rPr>
-                <w:b w:val="0"/>
-                <w:bCs w:val="0"/>
-              </w:rPr>
+            <w:r>
               <w:t>Autores</w:t>
             </w:r>
-            <w:proofErr w:type="spellEnd"/>
-          </w:p>
-        </w:tc>
-        <w:tc>
-          <w:tcPr>
-            <w:tcW w:w="6520" w:type="dxa"/>
-          </w:tcPr>
-          <w:p>
-            <w:pPr>
-              <w:cnfStyle w:val="000000000000" w:firstRow="0" w:lastRow="0" w:firstColumn="0" w:lastColumn="0" w:oddVBand="0" w:evenVBand="0" w:oddHBand="0" w:evenHBand="0" w:firstRowFirstColumn="0" w:firstRowLastColumn="0" w:lastRowFirstColumn="0" w:lastRowLastColumn="0"/>
-            </w:pPr>
-            <w:r>
-              <w:t xml:space="preserve">Ángel </w:t>
-            </w:r>
-            <w:proofErr w:type="spellStart"/>
-            <w:r>
-              <w:t>Torijano</w:t>
-            </w:r>
-            <w:proofErr w:type="spellEnd"/>
-            <w:r>
-              <w:t xml:space="preserve"> </w:t>
-            </w:r>
-            <w:proofErr w:type="spellStart"/>
-            <w:r>
-              <w:t>Sexmero</w:t>
-            </w:r>
-            <w:proofErr w:type="spellEnd"/>
-            <w:r>
-              <w:t xml:space="preserve"> </w:t>
-            </w:r>
-          </w:p>
-        </w:tc>
-      </w:tr>
-      <w:tr>
-        <w:tc>
-          <w:tcPr>
-            <w:cnfStyle w:val="001000000000" w:firstRow="0" w:lastRow="0" w:firstColumn="1" w:lastColumn="0" w:oddVBand="0" w:evenVBand="0" w:oddHBand="0" w:evenHBand="0" w:firstRowFirstColumn="0" w:firstRowLastColumn="0" w:lastRowFirstColumn="0" w:lastRowLastColumn="0"/>
-            <w:tcW w:w="2830" w:type="dxa"/>
-          </w:tcPr>
-          <w:p>
-            <w:pPr>
-              <w:rPr>
-                <w:b w:val="0"/>
-                <w:bCs w:val="0"/>
-              </w:rPr>
-            </w:pPr>
-            <w:r>
-              <w:rPr>
-                <w:b w:val="0"/>
-                <w:bCs w:val="0"/>
-              </w:rPr>
+          </w:p>
+        </w:tc>
+        <w:tc>
+          <w:tcPr>
+            <w:tcW w:w="6520" w:type="dxa"/>
+          </w:tcPr>
+          <w:p>
+            <w:pPr>
+              <w:cnfStyle w:val="000000000000" w:firstRow="0" w:lastRow="0" w:firstColumn="0" w:lastColumn="0" w:oddVBand="0" w:evenVBand="0" w:oddHBand="0" w:evenHBand="0" w:firstRowFirstColumn="0" w:firstRowLastColumn="0" w:lastRowFirstColumn="0" w:lastRowLastColumn="0"/>
+            </w:pPr>
+            <w:r>
+              <w:t xml:space="preserve">Ángel Torijano Sexmero </w:t>
+            </w:r>
+          </w:p>
+        </w:tc>
+      </w:tr>
+      <w:tr>
+        <w:tc>
+          <w:tcPr>
+            <w:cnfStyle w:val="001000000000" w:firstRow="0" w:lastRow="0" w:firstColumn="1" w:lastColumn="0" w:oddVBand="0" w:evenVBand="0" w:oddHBand="0" w:evenHBand="0" w:firstRowFirstColumn="0" w:firstRowLastColumn="0" w:lastRowFirstColumn="0" w:lastRowLastColumn="0"/>
+            <w:tcW w:w="2830" w:type="dxa"/>
+          </w:tcPr>
+          <w:p>
+            <w:r>
               <w:t>Fuentes</w:t>
             </w:r>
           </w:p>
@@ -3215,21 +2251,9 @@
             <w:tcW w:w="2830" w:type="dxa"/>
           </w:tcPr>
           <w:p>
-            <w:pPr>
-              <w:rPr>
-                <w:b w:val="0"/>
-                <w:bCs w:val="0"/>
-              </w:rPr>
-            </w:pPr>
-            <w:proofErr w:type="spellStart"/>
-            <w:r>
-              <w:rPr>
-                <w:b w:val="0"/>
-                <w:bCs w:val="0"/>
-              </w:rPr>
+            <w:r>
               <w:t>Descripción</w:t>
             </w:r>
-            <w:proofErr w:type="spellEnd"/>
           </w:p>
         </w:tc>
         <w:tc>
@@ -3265,130 +2289,85 @@
             <w:tcW w:w="2830" w:type="dxa"/>
           </w:tcPr>
           <w:p>
-            <w:pPr>
-              <w:rPr>
-                <w:b w:val="0"/>
-                <w:bCs w:val="0"/>
-              </w:rPr>
-            </w:pPr>
-            <w:proofErr w:type="spellStart"/>
-            <w:r>
-              <w:rPr>
-                <w:b w:val="0"/>
-                <w:bCs w:val="0"/>
-              </w:rPr>
+            <w:r>
               <w:t>Subobjetivos</w:t>
             </w:r>
-            <w:proofErr w:type="spellEnd"/>
-          </w:p>
-        </w:tc>
-        <w:tc>
-          <w:tcPr>
-            <w:tcW w:w="6520" w:type="dxa"/>
-          </w:tcPr>
-          <w:p>
-            <w:pPr>
-              <w:cnfStyle w:val="000000000000" w:firstRow="0" w:lastRow="0" w:firstColumn="0" w:lastColumn="0" w:oddVBand="0" w:evenVBand="0" w:oddHBand="0" w:evenHBand="0" w:firstRowFirstColumn="0" w:firstRowLastColumn="0" w:lastRowFirstColumn="0" w:lastRowLastColumn="0"/>
-            </w:pPr>
-          </w:p>
-        </w:tc>
-      </w:tr>
-      <w:tr>
-        <w:tc>
-          <w:tcPr>
-            <w:cnfStyle w:val="001000000000" w:firstRow="0" w:lastRow="0" w:firstColumn="1" w:lastColumn="0" w:oddVBand="0" w:evenVBand="0" w:oddHBand="0" w:evenHBand="0" w:firstRowFirstColumn="0" w:firstRowLastColumn="0" w:lastRowFirstColumn="0" w:lastRowLastColumn="0"/>
-            <w:tcW w:w="2830" w:type="dxa"/>
-          </w:tcPr>
-          <w:p>
-            <w:pPr>
-              <w:rPr>
-                <w:b w:val="0"/>
-                <w:bCs w:val="0"/>
-              </w:rPr>
-            </w:pPr>
-            <w:proofErr w:type="spellStart"/>
-            <w:r>
-              <w:rPr>
-                <w:b w:val="0"/>
-                <w:bCs w:val="0"/>
-              </w:rPr>
+          </w:p>
+        </w:tc>
+        <w:tc>
+          <w:tcPr>
+            <w:tcW w:w="6520" w:type="dxa"/>
+          </w:tcPr>
+          <w:p>
+            <w:pPr>
+              <w:cnfStyle w:val="000000000000" w:firstRow="0" w:lastRow="0" w:firstColumn="0" w:lastColumn="0" w:oddVBand="0" w:evenVBand="0" w:oddHBand="0" w:evenHBand="0" w:firstRowFirstColumn="0" w:firstRowLastColumn="0" w:lastRowFirstColumn="0" w:lastRowLastColumn="0"/>
+            </w:pPr>
+          </w:p>
+        </w:tc>
+      </w:tr>
+      <w:tr>
+        <w:tc>
+          <w:tcPr>
+            <w:cnfStyle w:val="001000000000" w:firstRow="0" w:lastRow="0" w:firstColumn="1" w:lastColumn="0" w:oddVBand="0" w:evenVBand="0" w:oddHBand="0" w:evenHBand="0" w:firstRowFirstColumn="0" w:firstRowLastColumn="0" w:lastRowFirstColumn="0" w:lastRowLastColumn="0"/>
+            <w:tcW w:w="2830" w:type="dxa"/>
+          </w:tcPr>
+          <w:p>
+            <w:r>
               <w:t>Importancia</w:t>
             </w:r>
-            <w:proofErr w:type="spellEnd"/>
-          </w:p>
-        </w:tc>
-        <w:tc>
-          <w:tcPr>
-            <w:tcW w:w="6520" w:type="dxa"/>
-          </w:tcPr>
-          <w:p>
-            <w:pPr>
-              <w:cnfStyle w:val="000000000000" w:firstRow="0" w:lastRow="0" w:firstColumn="0" w:lastColumn="0" w:oddVBand="0" w:evenVBand="0" w:oddHBand="0" w:evenHBand="0" w:firstRowFirstColumn="0" w:firstRowLastColumn="0" w:lastRowFirstColumn="0" w:lastRowLastColumn="0"/>
-            </w:pPr>
-            <w:r>
-              <w:t xml:space="preserve">Vital </w:t>
-            </w:r>
-            <w:proofErr w:type="spellStart"/>
-            <w:r>
-              <w:t>importancia</w:t>
-            </w:r>
-            <w:proofErr w:type="spellEnd"/>
-          </w:p>
-        </w:tc>
-      </w:tr>
-      <w:tr>
-        <w:tc>
-          <w:tcPr>
-            <w:cnfStyle w:val="001000000000" w:firstRow="0" w:lastRow="0" w:firstColumn="1" w:lastColumn="0" w:oddVBand="0" w:evenVBand="0" w:oddHBand="0" w:evenHBand="0" w:firstRowFirstColumn="0" w:firstRowLastColumn="0" w:lastRowFirstColumn="0" w:lastRowLastColumn="0"/>
-            <w:tcW w:w="2830" w:type="dxa"/>
-          </w:tcPr>
-          <w:p>
-            <w:pPr>
-              <w:rPr>
-                <w:b w:val="0"/>
-                <w:bCs w:val="0"/>
-              </w:rPr>
-            </w:pPr>
-            <w:proofErr w:type="spellStart"/>
-            <w:r>
-              <w:rPr>
-                <w:b w:val="0"/>
-                <w:bCs w:val="0"/>
-              </w:rPr>
+          </w:p>
+        </w:tc>
+        <w:tc>
+          <w:tcPr>
+            <w:tcW w:w="6520" w:type="dxa"/>
+          </w:tcPr>
+          <w:p>
+            <w:pPr>
+              <w:cnfStyle w:val="000000000000" w:firstRow="0" w:lastRow="0" w:firstColumn="0" w:lastColumn="0" w:oddVBand="0" w:evenVBand="0" w:oddHBand="0" w:evenHBand="0" w:firstRowFirstColumn="0" w:firstRowLastColumn="0" w:lastRowFirstColumn="0" w:lastRowLastColumn="0"/>
+            </w:pPr>
+            <w:r>
+              <w:t>Media</w:t>
+            </w:r>
+          </w:p>
+        </w:tc>
+      </w:tr>
+      <w:tr>
+        <w:tc>
+          <w:tcPr>
+            <w:cnfStyle w:val="001000000000" w:firstRow="0" w:lastRow="0" w:firstColumn="1" w:lastColumn="0" w:oddVBand="0" w:evenVBand="0" w:oddHBand="0" w:evenHBand="0" w:firstRowFirstColumn="0" w:firstRowLastColumn="0" w:lastRowFirstColumn="0" w:lastRowLastColumn="0"/>
+            <w:tcW w:w="2830" w:type="dxa"/>
+          </w:tcPr>
+          <w:p>
+            <w:r>
               <w:t>Urgencia</w:t>
             </w:r>
-            <w:proofErr w:type="spellEnd"/>
-          </w:p>
-        </w:tc>
-        <w:tc>
-          <w:tcPr>
-            <w:tcW w:w="6520" w:type="dxa"/>
-          </w:tcPr>
-          <w:p>
-            <w:pPr>
-              <w:cnfStyle w:val="000000000000" w:firstRow="0" w:lastRow="0" w:firstColumn="0" w:lastColumn="0" w:oddVBand="0" w:evenVBand="0" w:oddHBand="0" w:evenHBand="0" w:firstRowFirstColumn="0" w:firstRowLastColumn="0" w:lastRowFirstColumn="0" w:lastRowLastColumn="0"/>
-            </w:pPr>
-          </w:p>
-        </w:tc>
-      </w:tr>
-      <w:tr>
-        <w:tc>
-          <w:tcPr>
-            <w:cnfStyle w:val="001000000000" w:firstRow="0" w:lastRow="0" w:firstColumn="1" w:lastColumn="0" w:oddVBand="0" w:evenVBand="0" w:oddHBand="0" w:evenHBand="0" w:firstRowFirstColumn="0" w:firstRowLastColumn="0" w:lastRowFirstColumn="0" w:lastRowLastColumn="0"/>
-            <w:tcW w:w="2830" w:type="dxa"/>
-          </w:tcPr>
-          <w:p>
-            <w:pPr>
-              <w:rPr>
-                <w:b w:val="0"/>
-                <w:bCs w:val="0"/>
-              </w:rPr>
-            </w:pPr>
-            <w:r>
-              <w:rPr>
-                <w:b w:val="0"/>
-                <w:bCs w:val="0"/>
-              </w:rPr>
+          </w:p>
+        </w:tc>
+        <w:tc>
+          <w:tcPr>
+            <w:tcW w:w="6520" w:type="dxa"/>
+          </w:tcPr>
+          <w:p>
+            <w:pPr>
+              <w:cnfStyle w:val="000000000000" w:firstRow="0" w:lastRow="0" w:firstColumn="0" w:lastColumn="0" w:oddVBand="0" w:evenVBand="0" w:oddHBand="0" w:evenHBand="0" w:firstRowFirstColumn="0" w:firstRowLastColumn="0" w:lastRowFirstColumn="0" w:lastRowLastColumn="0"/>
+              <w:rPr>
+                <w:u w:val="single"/>
+              </w:rPr>
+            </w:pPr>
+            <w:r>
+              <w:t>Media</w:t>
+            </w:r>
+          </w:p>
+        </w:tc>
+      </w:tr>
+      <w:tr>
+        <w:tc>
+          <w:tcPr>
+            <w:cnfStyle w:val="001000000000" w:firstRow="0" w:lastRow="0" w:firstColumn="1" w:lastColumn="0" w:oddVBand="0" w:evenVBand="0" w:oddHBand="0" w:evenHBand="0" w:firstRowFirstColumn="0" w:firstRowLastColumn="0" w:lastRowFirstColumn="0" w:lastRowLastColumn="0"/>
+            <w:tcW w:w="2830" w:type="dxa"/>
+          </w:tcPr>
+          <w:p>
+            <w:r>
               <w:t>Estado</w:t>
             </w:r>
           </w:p>
@@ -3411,21 +2390,9 @@
             <w:tcW w:w="2830" w:type="dxa"/>
           </w:tcPr>
           <w:p>
-            <w:pPr>
-              <w:rPr>
-                <w:b w:val="0"/>
-                <w:bCs w:val="0"/>
-              </w:rPr>
-            </w:pPr>
-            <w:proofErr w:type="spellStart"/>
-            <w:r>
-              <w:rPr>
-                <w:b w:val="0"/>
-                <w:bCs w:val="0"/>
-              </w:rPr>
+            <w:r>
               <w:t>Estabilidad</w:t>
             </w:r>
-            <w:proofErr w:type="spellEnd"/>
           </w:p>
         </w:tc>
         <w:tc>
@@ -3449,21 +2416,9 @@
             <w:tcW w:w="2830" w:type="dxa"/>
           </w:tcPr>
           <w:p>
-            <w:pPr>
-              <w:rPr>
-                <w:b w:val="0"/>
-                <w:bCs w:val="0"/>
-              </w:rPr>
-            </w:pPr>
-            <w:proofErr w:type="spellStart"/>
-            <w:r>
-              <w:rPr>
-                <w:b w:val="0"/>
-                <w:bCs w:val="0"/>
-              </w:rPr>
+            <w:r>
               <w:t>Comentarios</w:t>
             </w:r>
-            <w:proofErr w:type="spellEnd"/>
           </w:p>
         </w:tc>
         <w:tc>
@@ -3483,14 +2438,18 @@
               </w:rPr>
               <w:t xml:space="preserve">Este </w:t>
             </w:r>
-            <w:proofErr w:type="spellStart"/>
             <w:r>
               <w:rPr>
                 <w:lang w:val="es-ES"/>
               </w:rPr>
               <w:t>ob</w:t>
             </w:r>
-            <w:proofErr w:type="spellEnd"/>
+            <w:r>
+              <w:rPr>
+                <w:lang w:val="es-ES"/>
+              </w:rPr>
+              <w:t>jetivo contaba como uno de las primeras ideas pero fue perdiendo viabilidad a medida que avanzaba el proyecto. Se ha mantenido la recolección de puntos por nivel pero la implementación de conexión a la nube se ha descartado.</w:t>
+            </w:r>
           </w:p>
         </w:tc>
       </w:tr>
@@ -3501,6 +2460,122 @@
           <w:lang w:val="es-ES"/>
         </w:rPr>
       </w:pPr>
+    </w:p>
+    <w:p>
+      <w:pPr>
+        <w:pStyle w:val="Ttulo1"/>
+        <w:rPr>
+          <w:lang w:val="es-ES"/>
+        </w:rPr>
+      </w:pPr>
+      <w:r>
+        <w:rPr>
+          <w:lang w:val="es-ES"/>
+        </w:rPr>
+        <w:t>Requisitos del sistema</w:t>
+      </w:r>
+    </w:p>
+    <w:p>
+      <w:pPr>
+        <w:rPr>
+          <w:lang w:val="es-ES"/>
+        </w:rPr>
+      </w:pPr>
+      <w:r>
+        <w:rPr>
+          <w:lang w:val="es-ES"/>
+        </w:rPr>
+        <w:t>Después de definir los objetivos de nuestro sistema, pasaremos a definir los requisitos del sistema que ayudaran a conseguir completar los objetivos previamente mencionados.</w:t>
+      </w:r>
+    </w:p>
+    <w:p>
+      <w:pPr>
+        <w:rPr>
+          <w:lang w:val="es-ES"/>
+        </w:rPr>
+      </w:pPr>
+      <w:r>
+        <w:rPr>
+          <w:lang w:val="es-ES"/>
+        </w:rPr>
+        <w:t xml:space="preserve">Estos requisitos pueden ser de tres tipos: </w:t>
+      </w:r>
+      <w:r>
+        <w:rPr>
+          <w:b/>
+          <w:bCs/>
+          <w:lang w:val="es-ES"/>
+        </w:rPr>
+        <w:t>Requisitos de Información</w:t>
+      </w:r>
+      <w:r>
+        <w:rPr>
+          <w:lang w:val="es-ES"/>
+        </w:rPr>
+        <w:t xml:space="preserve">, </w:t>
+      </w:r>
+      <w:r>
+        <w:rPr>
+          <w:b/>
+          <w:bCs/>
+          <w:lang w:val="es-ES"/>
+        </w:rPr>
+        <w:t>Requisitos Funcionales</w:t>
+      </w:r>
+      <w:r>
+        <w:rPr>
+          <w:lang w:val="es-ES"/>
+        </w:rPr>
+        <w:t xml:space="preserve"> y </w:t>
+      </w:r>
+      <w:r>
+        <w:rPr>
+          <w:b/>
+          <w:bCs/>
+          <w:lang w:val="es-ES"/>
+        </w:rPr>
+        <w:t>Requisitos No Funcionales</w:t>
+      </w:r>
+      <w:r>
+        <w:rPr>
+          <w:lang w:val="es-ES"/>
+        </w:rPr>
+        <w:t>.</w:t>
+      </w:r>
+    </w:p>
+    <w:p>
+      <w:pPr>
+        <w:pStyle w:val="Ttulo2"/>
+        <w:rPr>
+          <w:lang w:val="es-ES"/>
+        </w:rPr>
+      </w:pPr>
+      <w:r>
+        <w:rPr>
+          <w:lang w:val="es-ES"/>
+        </w:rPr>
+        <w:lastRenderedPageBreak/>
+        <w:t>Req</w:t>
+      </w:r>
+      <w:r>
+        <w:rPr>
+          <w:lang w:val="es-ES"/>
+        </w:rPr>
+        <w:t>uesitios de Información:</w:t>
+      </w:r>
+    </w:p>
+    <w:p>
+      <w:pPr>
+        <w:rPr>
+          <w:lang w:val="es-ES"/>
+        </w:rPr>
+      </w:pPr>
+      <w:r>
+        <w:rPr>
+          <w:lang w:val="es-ES"/>
+        </w:rPr>
+        <w:t>Estos requisitos definen el tipo de información que se almacenará y gestionará nuestro sistema. En nuestro caso, al ser un videojuego la única información que querremos almacenar es la puntuación de los niveles y los coleccionables de cada uno.</w:t>
+      </w:r>
     </w:p>
     <w:tbl>
       <w:tblPr>
@@ -3524,7 +2599,13 @@
           </w:tcPr>
           <w:p>
             <w:r>
-              <w:t>OBJ-0</w:t>
+              <w:t>IRQ</w:t>
+            </w:r>
+            <w:r>
+              <w:t>-0</w:t>
+            </w:r>
+            <w:r>
+              <w:t>1</w:t>
             </w:r>
           </w:p>
         </w:tc>
@@ -3540,6 +2621,18 @@
                 <w:lang w:val="es-ES"/>
               </w:rPr>
             </w:pPr>
+            <w:r>
+              <w:rPr>
+                <w:lang w:val="es-ES"/>
+              </w:rPr>
+              <w:t>Información</w:t>
+            </w:r>
+            <w:r>
+              <w:rPr>
+                <w:lang w:val="es-ES"/>
+              </w:rPr>
+              <w:t xml:space="preserve"> de puntuaciones</w:t>
+            </w:r>
           </w:p>
         </w:tc>
       </w:tr>
@@ -3556,15 +2649,9 @@
                 <w:bCs w:val="0"/>
               </w:rPr>
             </w:pPr>
-            <w:proofErr w:type="spellStart"/>
-            <w:r>
-              <w:rPr>
-                <w:b w:val="0"/>
-                <w:bCs w:val="0"/>
-              </w:rPr>
+            <w:r>
               <w:t>Versión</w:t>
             </w:r>
-            <w:proofErr w:type="spellEnd"/>
           </w:p>
         </w:tc>
         <w:tc>
@@ -3588,71 +2675,33 @@
             <w:tcW w:w="2830" w:type="dxa"/>
           </w:tcPr>
           <w:p>
-            <w:pPr>
-              <w:rPr>
-                <w:b w:val="0"/>
-                <w:bCs w:val="0"/>
-              </w:rPr>
-            </w:pPr>
-            <w:proofErr w:type="spellStart"/>
-            <w:r>
-              <w:rPr>
-                <w:b w:val="0"/>
-                <w:bCs w:val="0"/>
-              </w:rPr>
+            <w:r>
               <w:t>Autores</w:t>
             </w:r>
-            <w:proofErr w:type="spellEnd"/>
-          </w:p>
-        </w:tc>
-        <w:tc>
-          <w:tcPr>
-            <w:tcW w:w="6520" w:type="dxa"/>
-          </w:tcPr>
-          <w:p>
-            <w:pPr>
-              <w:cnfStyle w:val="000000000000" w:firstRow="0" w:lastRow="0" w:firstColumn="0" w:lastColumn="0" w:oddVBand="0" w:evenVBand="0" w:oddHBand="0" w:evenHBand="0" w:firstRowFirstColumn="0" w:firstRowLastColumn="0" w:lastRowFirstColumn="0" w:lastRowLastColumn="0"/>
-            </w:pPr>
-            <w:r>
-              <w:t xml:space="preserve">Ángel </w:t>
-            </w:r>
-            <w:proofErr w:type="spellStart"/>
-            <w:r>
-              <w:t>Torijano</w:t>
-            </w:r>
-            <w:proofErr w:type="spellEnd"/>
-            <w:r>
-              <w:t xml:space="preserve"> </w:t>
-            </w:r>
-            <w:proofErr w:type="spellStart"/>
-            <w:r>
-              <w:t>Sexmero</w:t>
-            </w:r>
-            <w:proofErr w:type="spellEnd"/>
-            <w:r>
-              <w:t xml:space="preserve"> </w:t>
-            </w:r>
-          </w:p>
-        </w:tc>
-      </w:tr>
-      <w:tr>
-        <w:tc>
-          <w:tcPr>
-            <w:cnfStyle w:val="001000000000" w:firstRow="0" w:lastRow="0" w:firstColumn="1" w:lastColumn="0" w:oddVBand="0" w:evenVBand="0" w:oddHBand="0" w:evenHBand="0" w:firstRowFirstColumn="0" w:firstRowLastColumn="0" w:lastRowFirstColumn="0" w:lastRowLastColumn="0"/>
-            <w:tcW w:w="2830" w:type="dxa"/>
-          </w:tcPr>
-          <w:p>
-            <w:pPr>
-              <w:rPr>
-                <w:b w:val="0"/>
-                <w:bCs w:val="0"/>
-              </w:rPr>
-            </w:pPr>
-            <w:r>
-              <w:rPr>
-                <w:b w:val="0"/>
-                <w:bCs w:val="0"/>
-              </w:rPr>
+          </w:p>
+        </w:tc>
+        <w:tc>
+          <w:tcPr>
+            <w:tcW w:w="6520" w:type="dxa"/>
+          </w:tcPr>
+          <w:p>
+            <w:pPr>
+              <w:cnfStyle w:val="000000000000" w:firstRow="0" w:lastRow="0" w:firstColumn="0" w:lastColumn="0" w:oddVBand="0" w:evenVBand="0" w:oddHBand="0" w:evenHBand="0" w:firstRowFirstColumn="0" w:firstRowLastColumn="0" w:lastRowFirstColumn="0" w:lastRowLastColumn="0"/>
+            </w:pPr>
+            <w:r>
+              <w:t xml:space="preserve">Ángel Torijano Sexmero </w:t>
+            </w:r>
+          </w:p>
+        </w:tc>
+      </w:tr>
+      <w:tr>
+        <w:tc>
+          <w:tcPr>
+            <w:cnfStyle w:val="001000000000" w:firstRow="0" w:lastRow="0" w:firstColumn="1" w:lastColumn="0" w:oddVBand="0" w:evenVBand="0" w:oddHBand="0" w:evenHBand="0" w:firstRowFirstColumn="0" w:firstRowLastColumn="0" w:lastRowFirstColumn="0" w:lastRowLastColumn="0"/>
+            <w:tcW w:w="2830" w:type="dxa"/>
+          </w:tcPr>
+          <w:p>
+            <w:r>
               <w:t>Fuentes</w:t>
             </w:r>
           </w:p>
@@ -3678,174 +2727,295 @@
             <w:tcW w:w="2830" w:type="dxa"/>
           </w:tcPr>
           <w:p>
-            <w:pPr>
-              <w:rPr>
-                <w:b w:val="0"/>
-                <w:bCs w:val="0"/>
-              </w:rPr>
-            </w:pPr>
-            <w:proofErr w:type="spellStart"/>
-            <w:r>
-              <w:rPr>
-                <w:b w:val="0"/>
-                <w:bCs w:val="0"/>
-              </w:rPr>
+            <w:r>
+              <w:t>Objetivos asociados</w:t>
+            </w:r>
+          </w:p>
+        </w:tc>
+        <w:tc>
+          <w:tcPr>
+            <w:tcW w:w="6520" w:type="dxa"/>
+          </w:tcPr>
+          <w:p>
+            <w:pPr>
+              <w:pStyle w:val="Prrafodelista"/>
+              <w:numPr>
+                <w:ilvl w:val="0"/>
+                <w:numId w:val="5"/>
+              </w:numPr>
+              <w:cnfStyle w:val="000000000000" w:firstRow="0" w:lastRow="0" w:firstColumn="0" w:lastColumn="0" w:oddVBand="0" w:evenVBand="0" w:oddHBand="0" w:evenHBand="0" w:firstRowFirstColumn="0" w:firstRowLastColumn="0" w:lastRowFirstColumn="0" w:lastRowLastColumn="0"/>
+            </w:pPr>
+            <w:r>
+              <w:t>OBJ-01</w:t>
+            </w:r>
+          </w:p>
+          <w:p>
+            <w:pPr>
+              <w:pStyle w:val="Prrafodelista"/>
+              <w:numPr>
+                <w:ilvl w:val="0"/>
+                <w:numId w:val="5"/>
+              </w:numPr>
+              <w:cnfStyle w:val="000000000000" w:firstRow="0" w:lastRow="0" w:firstColumn="0" w:lastColumn="0" w:oddVBand="0" w:evenVBand="0" w:oddHBand="0" w:evenHBand="0" w:firstRowFirstColumn="0" w:firstRowLastColumn="0" w:lastRowFirstColumn="0" w:lastRowLastColumn="0"/>
+            </w:pPr>
+            <w:r>
+              <w:t>OBJ-03</w:t>
+            </w:r>
+          </w:p>
+          <w:p>
+            <w:pPr>
+              <w:pStyle w:val="Prrafodelista"/>
+              <w:numPr>
+                <w:ilvl w:val="0"/>
+                <w:numId w:val="5"/>
+              </w:numPr>
+              <w:cnfStyle w:val="000000000000" w:firstRow="0" w:lastRow="0" w:firstColumn="0" w:lastColumn="0" w:oddVBand="0" w:evenVBand="0" w:oddHBand="0" w:evenHBand="0" w:firstRowFirstColumn="0" w:firstRowLastColumn="0" w:lastRowFirstColumn="0" w:lastRowLastColumn="0"/>
+            </w:pPr>
+            <w:r>
+              <w:t>OBJ-04</w:t>
+            </w:r>
+          </w:p>
+        </w:tc>
+      </w:tr>
+      <w:tr>
+        <w:trPr>
+          <w:trHeight w:val="58"/>
+        </w:trPr>
+        <w:tc>
+          <w:tcPr>
+            <w:cnfStyle w:val="001000000000" w:firstRow="0" w:lastRow="0" w:firstColumn="1" w:lastColumn="0" w:oddVBand="0" w:evenVBand="0" w:oddHBand="0" w:evenHBand="0" w:firstRowFirstColumn="0" w:firstRowLastColumn="0" w:lastRowFirstColumn="0" w:lastRowLastColumn="0"/>
+            <w:tcW w:w="2830" w:type="dxa"/>
+          </w:tcPr>
+          <w:p>
+            <w:r>
+              <w:t>Requisitos asociados</w:t>
+            </w:r>
+          </w:p>
+        </w:tc>
+        <w:tc>
+          <w:tcPr>
+            <w:tcW w:w="6520" w:type="dxa"/>
+          </w:tcPr>
+          <w:p>
+            <w:pPr>
+              <w:cnfStyle w:val="000000000000" w:firstRow="0" w:lastRow="0" w:firstColumn="0" w:lastColumn="0" w:oddVBand="0" w:evenVBand="0" w:oddHBand="0" w:evenHBand="0" w:firstRowFirstColumn="0" w:firstRowLastColumn="0" w:lastRowFirstColumn="0" w:lastRowLastColumn="0"/>
+              <w:rPr>
+                <w:lang w:val="es-ES"/>
+              </w:rPr>
+            </w:pPr>
+            <w:r>
+              <w:rPr>
+                <w:highlight w:val="yellow"/>
+                <w:lang w:val="es-ES"/>
+              </w:rPr>
+              <w:t>TODO</w:t>
+            </w:r>
+          </w:p>
+        </w:tc>
+      </w:tr>
+      <w:tr>
+        <w:tc>
+          <w:tcPr>
+            <w:cnfStyle w:val="001000000000" w:firstRow="0" w:lastRow="0" w:firstColumn="1" w:lastColumn="0" w:oddVBand="0" w:evenVBand="0" w:oddHBand="0" w:evenHBand="0" w:firstRowFirstColumn="0" w:firstRowLastColumn="0" w:lastRowFirstColumn="0" w:lastRowLastColumn="0"/>
+            <w:tcW w:w="2830" w:type="dxa"/>
+          </w:tcPr>
+          <w:p>
+            <w:r>
               <w:t>Descripción</w:t>
             </w:r>
-            <w:proofErr w:type="spellEnd"/>
-          </w:p>
-        </w:tc>
-        <w:tc>
-          <w:tcPr>
-            <w:tcW w:w="6520" w:type="dxa"/>
-          </w:tcPr>
-          <w:p>
-            <w:pPr>
-              <w:cnfStyle w:val="000000000000" w:firstRow="0" w:lastRow="0" w:firstColumn="0" w:lastColumn="0" w:oddVBand="0" w:evenVBand="0" w:oddHBand="0" w:evenHBand="0" w:firstRowFirstColumn="0" w:firstRowLastColumn="0" w:lastRowFirstColumn="0" w:lastRowLastColumn="0"/>
-              <w:rPr>
-                <w:lang w:val="es-ES"/>
-              </w:rPr>
-            </w:pPr>
-            <w:r>
-              <w:rPr>
-                <w:lang w:val="es-ES"/>
-              </w:rPr>
-              <w:t xml:space="preserve">El sistema </w:t>
-            </w:r>
-          </w:p>
-        </w:tc>
-      </w:tr>
-      <w:tr>
-        <w:tc>
-          <w:tcPr>
-            <w:cnfStyle w:val="001000000000" w:firstRow="0" w:lastRow="0" w:firstColumn="1" w:lastColumn="0" w:oddVBand="0" w:evenVBand="0" w:oddHBand="0" w:evenHBand="0" w:firstRowFirstColumn="0" w:firstRowLastColumn="0" w:lastRowFirstColumn="0" w:lastRowLastColumn="0"/>
-            <w:tcW w:w="2830" w:type="dxa"/>
-          </w:tcPr>
-          <w:p>
-            <w:pPr>
-              <w:rPr>
-                <w:b w:val="0"/>
-                <w:bCs w:val="0"/>
-              </w:rPr>
-            </w:pPr>
-            <w:proofErr w:type="spellStart"/>
-            <w:r>
-              <w:rPr>
-                <w:b w:val="0"/>
-                <w:bCs w:val="0"/>
-              </w:rPr>
-              <w:t>Subobjetivos</w:t>
-            </w:r>
-            <w:proofErr w:type="spellEnd"/>
-          </w:p>
-        </w:tc>
-        <w:tc>
-          <w:tcPr>
-            <w:tcW w:w="6520" w:type="dxa"/>
-          </w:tcPr>
-          <w:p>
-            <w:pPr>
-              <w:cnfStyle w:val="000000000000" w:firstRow="0" w:lastRow="0" w:firstColumn="0" w:lastColumn="0" w:oddVBand="0" w:evenVBand="0" w:oddHBand="0" w:evenHBand="0" w:firstRowFirstColumn="0" w:firstRowLastColumn="0" w:lastRowFirstColumn="0" w:lastRowLastColumn="0"/>
-            </w:pPr>
-          </w:p>
-        </w:tc>
-      </w:tr>
-      <w:tr>
-        <w:tc>
-          <w:tcPr>
-            <w:cnfStyle w:val="001000000000" w:firstRow="0" w:lastRow="0" w:firstColumn="1" w:lastColumn="0" w:oddVBand="0" w:evenVBand="0" w:oddHBand="0" w:evenHBand="0" w:firstRowFirstColumn="0" w:firstRowLastColumn="0" w:lastRowFirstColumn="0" w:lastRowLastColumn="0"/>
-            <w:tcW w:w="2830" w:type="dxa"/>
-          </w:tcPr>
-          <w:p>
-            <w:pPr>
-              <w:rPr>
-                <w:b w:val="0"/>
-                <w:bCs w:val="0"/>
-              </w:rPr>
-            </w:pPr>
-            <w:proofErr w:type="spellStart"/>
-            <w:r>
-              <w:rPr>
-                <w:b w:val="0"/>
-                <w:bCs w:val="0"/>
-              </w:rPr>
+          </w:p>
+        </w:tc>
+        <w:tc>
+          <w:tcPr>
+            <w:tcW w:w="6520" w:type="dxa"/>
+          </w:tcPr>
+          <w:p>
+            <w:pPr>
+              <w:cnfStyle w:val="000000000000" w:firstRow="0" w:lastRow="0" w:firstColumn="0" w:lastColumn="0" w:oddVBand="0" w:evenVBand="0" w:oddHBand="0" w:evenHBand="0" w:firstRowFirstColumn="0" w:firstRowLastColumn="0" w:lastRowFirstColumn="0" w:lastRowLastColumn="0"/>
+              <w:rPr>
+                <w:u w:val="single"/>
+                <w:lang w:val="es-ES"/>
+              </w:rPr>
+            </w:pPr>
+            <w:r>
+              <w:rPr>
+                <w:lang w:val="es-ES"/>
+              </w:rPr>
+              <w:t>El sistema deberá</w:t>
+            </w:r>
+            <w:r>
+              <w:rPr>
+                <w:lang w:val="es-ES"/>
+              </w:rPr>
+              <w:t xml:space="preserve"> guardar las</w:t>
+            </w:r>
+            <w:r>
+              <w:rPr>
+                <w:lang w:val="es-ES"/>
+              </w:rPr>
+              <w:t xml:space="preserve"> puntuaciones </w:t>
+            </w:r>
+            <w:r>
+              <w:rPr>
+                <w:lang w:val="es-ES"/>
+              </w:rPr>
+              <w:t>y los coleccionables (monedas) de cada nivel.</w:t>
+            </w:r>
+          </w:p>
+        </w:tc>
+      </w:tr>
+      <w:tr>
+        <w:tc>
+          <w:tcPr>
+            <w:cnfStyle w:val="001000000000" w:firstRow="0" w:lastRow="0" w:firstColumn="1" w:lastColumn="0" w:oddVBand="0" w:evenVBand="0" w:oddHBand="0" w:evenHBand="0" w:firstRowFirstColumn="0" w:firstRowLastColumn="0" w:lastRowFirstColumn="0" w:lastRowLastColumn="0"/>
+            <w:tcW w:w="2830" w:type="dxa"/>
+          </w:tcPr>
+          <w:p>
+            <w:r>
+              <w:t>Datos Especificos</w:t>
+            </w:r>
+          </w:p>
+        </w:tc>
+        <w:tc>
+          <w:tcPr>
+            <w:tcW w:w="6520" w:type="dxa"/>
+          </w:tcPr>
+          <w:p>
+            <w:pPr>
+              <w:pStyle w:val="Prrafodelista"/>
+              <w:numPr>
+                <w:ilvl w:val="0"/>
+                <w:numId w:val="5"/>
+              </w:numPr>
+              <w:cnfStyle w:val="000000000000" w:firstRow="0" w:lastRow="0" w:firstColumn="0" w:lastColumn="0" w:oddVBand="0" w:evenVBand="0" w:oddHBand="0" w:evenHBand="0" w:firstRowFirstColumn="0" w:firstRowLastColumn="0" w:lastRowFirstColumn="0" w:lastRowLastColumn="0"/>
+              <w:rPr>
+                <w:lang w:val="es-ES"/>
+              </w:rPr>
+            </w:pPr>
+            <w:r>
+              <w:rPr>
+                <w:lang w:val="es-ES"/>
+              </w:rPr>
+              <w:t>Puntuación</w:t>
+            </w:r>
+          </w:p>
+          <w:p>
+            <w:pPr>
+              <w:pStyle w:val="Prrafodelista"/>
+              <w:numPr>
+                <w:ilvl w:val="0"/>
+                <w:numId w:val="5"/>
+              </w:numPr>
+              <w:cnfStyle w:val="000000000000" w:firstRow="0" w:lastRow="0" w:firstColumn="0" w:lastColumn="0" w:oddVBand="0" w:evenVBand="0" w:oddHBand="0" w:evenHBand="0" w:firstRowFirstColumn="0" w:firstRowLastColumn="0" w:lastRowFirstColumn="0" w:lastRowLastColumn="0"/>
+              <w:rPr>
+                <w:lang w:val="es-ES"/>
+              </w:rPr>
+            </w:pPr>
+            <w:r>
+              <w:rPr>
+                <w:lang w:val="es-ES"/>
+              </w:rPr>
+              <w:t>Monedas</w:t>
+            </w:r>
+          </w:p>
+        </w:tc>
+      </w:tr>
+      <w:tr>
+        <w:tc>
+          <w:tcPr>
+            <w:cnfStyle w:val="001000000000" w:firstRow="0" w:lastRow="0" w:firstColumn="1" w:lastColumn="0" w:oddVBand="0" w:evenVBand="0" w:oddHBand="0" w:evenHBand="0" w:firstRowFirstColumn="0" w:firstRowLastColumn="0" w:lastRowFirstColumn="0" w:lastRowLastColumn="0"/>
+            <w:tcW w:w="2830" w:type="dxa"/>
+          </w:tcPr>
+          <w:p>
+            <w:r>
+              <w:t>Tiempo de vida</w:t>
+            </w:r>
+          </w:p>
+        </w:tc>
+        <w:tc>
+          <w:tcPr>
+            <w:tcW w:w="6520" w:type="dxa"/>
+          </w:tcPr>
+          <w:p>
+            <w:pPr>
+              <w:cnfStyle w:val="000000000000" w:firstRow="0" w:lastRow="0" w:firstColumn="0" w:lastColumn="0" w:oddVBand="0" w:evenVBand="0" w:oddHBand="0" w:evenHBand="0" w:firstRowFirstColumn="0" w:firstRowLastColumn="0" w:lastRowFirstColumn="0" w:lastRowLastColumn="0"/>
+              <w:rPr>
+                <w:u w:val="single"/>
+                <w:lang w:val="es-ES"/>
+              </w:rPr>
+            </w:pPr>
+            <w:r>
+              <w:rPr>
+                <w:lang w:val="es-ES"/>
+              </w:rPr>
+              <w:t>Hasta que se eliminen los datos</w:t>
+            </w:r>
+          </w:p>
+        </w:tc>
+      </w:tr>
+      <w:tr>
+        <w:tc>
+          <w:tcPr>
+            <w:cnfStyle w:val="001000000000" w:firstRow="0" w:lastRow="0" w:firstColumn="1" w:lastColumn="0" w:oddVBand="0" w:evenVBand="0" w:oddHBand="0" w:evenHBand="0" w:firstRowFirstColumn="0" w:firstRowLastColumn="0" w:lastRowFirstColumn="0" w:lastRowLastColumn="0"/>
+            <w:tcW w:w="2830" w:type="dxa"/>
+          </w:tcPr>
+          <w:p>
+            <w:r>
               <w:t>Importancia</w:t>
             </w:r>
-            <w:proofErr w:type="spellEnd"/>
-          </w:p>
-        </w:tc>
-        <w:tc>
-          <w:tcPr>
-            <w:tcW w:w="6520" w:type="dxa"/>
-          </w:tcPr>
-          <w:p>
-            <w:pPr>
-              <w:cnfStyle w:val="000000000000" w:firstRow="0" w:lastRow="0" w:firstColumn="0" w:lastColumn="0" w:oddVBand="0" w:evenVBand="0" w:oddHBand="0" w:evenHBand="0" w:firstRowFirstColumn="0" w:firstRowLastColumn="0" w:lastRowFirstColumn="0" w:lastRowLastColumn="0"/>
-            </w:pPr>
-            <w:r>
-              <w:t xml:space="preserve">Vital </w:t>
-            </w:r>
-            <w:proofErr w:type="spellStart"/>
-            <w:r>
-              <w:t>importancia</w:t>
-            </w:r>
-            <w:proofErr w:type="spellEnd"/>
-          </w:p>
-        </w:tc>
-      </w:tr>
-      <w:tr>
-        <w:tc>
-          <w:tcPr>
-            <w:cnfStyle w:val="001000000000" w:firstRow="0" w:lastRow="0" w:firstColumn="1" w:lastColumn="0" w:oddVBand="0" w:evenVBand="0" w:oddHBand="0" w:evenHBand="0" w:firstRowFirstColumn="0" w:firstRowLastColumn="0" w:lastRowFirstColumn="0" w:lastRowLastColumn="0"/>
-            <w:tcW w:w="2830" w:type="dxa"/>
-          </w:tcPr>
-          <w:p>
-            <w:pPr>
-              <w:rPr>
-                <w:b w:val="0"/>
-                <w:bCs w:val="0"/>
-              </w:rPr>
-            </w:pPr>
-            <w:proofErr w:type="spellStart"/>
-            <w:r>
-              <w:rPr>
-                <w:b w:val="0"/>
-                <w:bCs w:val="0"/>
-              </w:rPr>
+          </w:p>
+        </w:tc>
+        <w:tc>
+          <w:tcPr>
+            <w:tcW w:w="6520" w:type="dxa"/>
+          </w:tcPr>
+          <w:p>
+            <w:pPr>
+              <w:cnfStyle w:val="000000000000" w:firstRow="0" w:lastRow="0" w:firstColumn="0" w:lastColumn="0" w:oddVBand="0" w:evenVBand="0" w:oddHBand="0" w:evenHBand="0" w:firstRowFirstColumn="0" w:firstRowLastColumn="0" w:lastRowFirstColumn="0" w:lastRowLastColumn="0"/>
+            </w:pPr>
+            <w:r>
+              <w:t>Alta</w:t>
+            </w:r>
+          </w:p>
+        </w:tc>
+      </w:tr>
+      <w:tr>
+        <w:tc>
+          <w:tcPr>
+            <w:cnfStyle w:val="001000000000" w:firstRow="0" w:lastRow="0" w:firstColumn="1" w:lastColumn="0" w:oddVBand="0" w:evenVBand="0" w:oddHBand="0" w:evenHBand="0" w:firstRowFirstColumn="0" w:firstRowLastColumn="0" w:lastRowFirstColumn="0" w:lastRowLastColumn="0"/>
+            <w:tcW w:w="2830" w:type="dxa"/>
+          </w:tcPr>
+          <w:p>
+            <w:r>
               <w:t>Urgencia</w:t>
             </w:r>
-            <w:proofErr w:type="spellEnd"/>
-          </w:p>
-        </w:tc>
-        <w:tc>
-          <w:tcPr>
-            <w:tcW w:w="6520" w:type="dxa"/>
-          </w:tcPr>
-          <w:p>
-            <w:pPr>
-              <w:cnfStyle w:val="000000000000" w:firstRow="0" w:lastRow="0" w:firstColumn="0" w:lastColumn="0" w:oddVBand="0" w:evenVBand="0" w:oddHBand="0" w:evenHBand="0" w:firstRowFirstColumn="0" w:firstRowLastColumn="0" w:lastRowFirstColumn="0" w:lastRowLastColumn="0"/>
-            </w:pPr>
-          </w:p>
-        </w:tc>
-      </w:tr>
-      <w:tr>
-        <w:tc>
-          <w:tcPr>
-            <w:cnfStyle w:val="001000000000" w:firstRow="0" w:lastRow="0" w:firstColumn="1" w:lastColumn="0" w:oddVBand="0" w:evenVBand="0" w:oddHBand="0" w:evenHBand="0" w:firstRowFirstColumn="0" w:firstRowLastColumn="0" w:lastRowFirstColumn="0" w:lastRowLastColumn="0"/>
-            <w:tcW w:w="2830" w:type="dxa"/>
-          </w:tcPr>
-          <w:p>
-            <w:pPr>
-              <w:rPr>
-                <w:b w:val="0"/>
-                <w:bCs w:val="0"/>
-              </w:rPr>
-            </w:pPr>
-            <w:r>
-              <w:rPr>
-                <w:b w:val="0"/>
-                <w:bCs w:val="0"/>
-              </w:rPr>
+          </w:p>
+        </w:tc>
+        <w:tc>
+          <w:tcPr>
+            <w:tcW w:w="6520" w:type="dxa"/>
+          </w:tcPr>
+          <w:p>
+            <w:pPr>
+              <w:cnfStyle w:val="000000000000" w:firstRow="0" w:lastRow="0" w:firstColumn="0" w:lastColumn="0" w:oddVBand="0" w:evenVBand="0" w:oddHBand="0" w:evenHBand="0" w:firstRowFirstColumn="0" w:firstRowLastColumn="0" w:lastRowFirstColumn="0" w:lastRowLastColumn="0"/>
+              <w:rPr>
+                <w:u w:val="single"/>
+              </w:rPr>
+            </w:pPr>
+            <w:r>
+              <w:t>Alta</w:t>
+            </w:r>
+          </w:p>
+        </w:tc>
+      </w:tr>
+      <w:tr>
+        <w:tc>
+          <w:tcPr>
+            <w:cnfStyle w:val="001000000000" w:firstRow="0" w:lastRow="0" w:firstColumn="1" w:lastColumn="0" w:oddVBand="0" w:evenVBand="0" w:oddHBand="0" w:evenHBand="0" w:firstRowFirstColumn="0" w:firstRowLastColumn="0" w:lastRowFirstColumn="0" w:lastRowLastColumn="0"/>
+            <w:tcW w:w="2830" w:type="dxa"/>
+          </w:tcPr>
+          <w:p>
+            <w:r>
               <w:t>Estado</w:t>
             </w:r>
           </w:p>
@@ -3868,72 +3038,54 @@
             <w:tcW w:w="2830" w:type="dxa"/>
           </w:tcPr>
           <w:p>
-            <w:pPr>
-              <w:rPr>
-                <w:b w:val="0"/>
-                <w:bCs w:val="0"/>
-              </w:rPr>
-            </w:pPr>
-            <w:proofErr w:type="spellStart"/>
-            <w:r>
-              <w:rPr>
-                <w:b w:val="0"/>
-                <w:bCs w:val="0"/>
-              </w:rPr>
+            <w:r>
               <w:t>Estabilidad</w:t>
             </w:r>
-            <w:proofErr w:type="spellEnd"/>
-          </w:p>
-        </w:tc>
-        <w:tc>
-          <w:tcPr>
-            <w:tcW w:w="6520" w:type="dxa"/>
-          </w:tcPr>
-          <w:p>
-            <w:pPr>
-              <w:cnfStyle w:val="000000000000" w:firstRow="0" w:lastRow="0" w:firstColumn="0" w:lastColumn="0" w:oddVBand="0" w:evenVBand="0" w:oddHBand="0" w:evenHBand="0" w:firstRowFirstColumn="0" w:firstRowLastColumn="0" w:lastRowFirstColumn="0" w:lastRowLastColumn="0"/>
-            </w:pPr>
-            <w:r>
-              <w:t>Muy Alta</w:t>
-            </w:r>
-          </w:p>
-        </w:tc>
-      </w:tr>
-      <w:tr>
-        <w:tc>
-          <w:tcPr>
-            <w:cnfStyle w:val="001000000000" w:firstRow="0" w:lastRow="0" w:firstColumn="1" w:lastColumn="0" w:oddVBand="0" w:evenVBand="0" w:oddHBand="0" w:evenHBand="0" w:firstRowFirstColumn="0" w:firstRowLastColumn="0" w:lastRowFirstColumn="0" w:lastRowLastColumn="0"/>
-            <w:tcW w:w="2830" w:type="dxa"/>
-          </w:tcPr>
-          <w:p>
-            <w:pPr>
-              <w:rPr>
-                <w:b w:val="0"/>
-                <w:bCs w:val="0"/>
-              </w:rPr>
-            </w:pPr>
-            <w:proofErr w:type="spellStart"/>
-            <w:r>
-              <w:rPr>
-                <w:b w:val="0"/>
-                <w:bCs w:val="0"/>
-              </w:rPr>
+          </w:p>
+        </w:tc>
+        <w:tc>
+          <w:tcPr>
+            <w:tcW w:w="6520" w:type="dxa"/>
+          </w:tcPr>
+          <w:p>
+            <w:pPr>
+              <w:cnfStyle w:val="000000000000" w:firstRow="0" w:lastRow="0" w:firstColumn="0" w:lastColumn="0" w:oddVBand="0" w:evenVBand="0" w:oddHBand="0" w:evenHBand="0" w:firstRowFirstColumn="0" w:firstRowLastColumn="0" w:lastRowFirstColumn="0" w:lastRowLastColumn="0"/>
+            </w:pPr>
+            <w:r>
+              <w:t>Media</w:t>
+            </w:r>
+          </w:p>
+        </w:tc>
+      </w:tr>
+      <w:tr>
+        <w:tc>
+          <w:tcPr>
+            <w:cnfStyle w:val="001000000000" w:firstRow="0" w:lastRow="0" w:firstColumn="1" w:lastColumn="0" w:oddVBand="0" w:evenVBand="0" w:oddHBand="0" w:evenHBand="0" w:firstRowFirstColumn="0" w:firstRowLastColumn="0" w:lastRowFirstColumn="0" w:lastRowLastColumn="0"/>
+            <w:tcW w:w="2830" w:type="dxa"/>
+          </w:tcPr>
+          <w:p>
+            <w:r>
               <w:t>Comentarios</w:t>
             </w:r>
-            <w:proofErr w:type="spellEnd"/>
-          </w:p>
-        </w:tc>
-        <w:tc>
-          <w:tcPr>
-            <w:tcW w:w="6520" w:type="dxa"/>
-          </w:tcPr>
-          <w:p>
-            <w:pPr>
-              <w:cnfStyle w:val="000000000000" w:firstRow="0" w:lastRow="0" w:firstColumn="0" w:lastColumn="0" w:oddVBand="0" w:evenVBand="0" w:oddHBand="0" w:evenHBand="0" w:firstRowFirstColumn="0" w:firstRowLastColumn="0" w:lastRowFirstColumn="0" w:lastRowLastColumn="0"/>
-              <w:rPr>
-                <w:lang w:val="es-ES"/>
-              </w:rPr>
-            </w:pPr>
+          </w:p>
+        </w:tc>
+        <w:tc>
+          <w:tcPr>
+            <w:tcW w:w="6520" w:type="dxa"/>
+          </w:tcPr>
+          <w:p>
+            <w:pPr>
+              <w:cnfStyle w:val="000000000000" w:firstRow="0" w:lastRow="0" w:firstColumn="0" w:lastColumn="0" w:oddVBand="0" w:evenVBand="0" w:oddHBand="0" w:evenHBand="0" w:firstRowFirstColumn="0" w:firstRowLastColumn="0" w:lastRowFirstColumn="0" w:lastRowLastColumn="0"/>
+              <w:rPr>
+                <w:lang w:val="es-ES"/>
+              </w:rPr>
+            </w:pPr>
+            <w:r>
+              <w:rPr>
+                <w:lang w:val="es-ES"/>
+              </w:rPr>
+              <w:t>Una vez completado el nivel, se mostrara la opción de borrar los datos.</w:t>
+            </w:r>
           </w:p>
         </w:tc>
       </w:tr>
@@ -3947,86 +3099,15 @@
     </w:p>
     <w:p>
       <w:pPr>
-        <w:pStyle w:val="Ttulo2"/>
-        <w:rPr>
-          <w:lang w:val="es-ES"/>
-        </w:rPr>
-      </w:pPr>
-      <w:r>
-        <w:rPr>
-          <w:lang w:val="es-ES"/>
-        </w:rPr>
-        <w:t>Actores</w:t>
-      </w:r>
-    </w:p>
-    <w:p>
-      <w:pPr>
-        <w:rPr>
-          <w:lang w:val="es-ES"/>
-        </w:rPr>
-      </w:pPr>
-    </w:p>
-    <w:p>
-      <w:pPr>
-        <w:rPr>
-          <w:lang w:val="es-ES"/>
-        </w:rPr>
-      </w:pPr>
-    </w:p>
-    <w:p>
-      <w:pPr>
-        <w:rPr>
-          <w:lang w:val="es-ES"/>
-        </w:rPr>
-      </w:pPr>
-    </w:p>
-    <w:p>
-      <w:pPr>
-        <w:pStyle w:val="Ttulo2"/>
-        <w:rPr>
-          <w:lang w:val="es-ES"/>
-        </w:rPr>
-      </w:pPr>
-      <w:r>
-        <w:rPr>
-          <w:lang w:val="es-ES"/>
-        </w:rPr>
-        <w:t>Requisitos del sistema</w:t>
-      </w:r>
-    </w:p>
-    <w:p>
-      <w:pPr>
-        <w:rPr>
-          <w:lang w:val="es-ES"/>
-        </w:rPr>
-      </w:pPr>
-      <w:proofErr w:type="spellStart"/>
-      <w:r>
-        <w:rPr>
-          <w:lang w:val="es-ES"/>
-        </w:rPr>
-        <w:t>Req</w:t>
-      </w:r>
-      <w:proofErr w:type="spellEnd"/>
-      <w:r>
-        <w:rPr>
-          <w:lang w:val="es-ES"/>
-        </w:rPr>
-        <w:t xml:space="preserve"> de </w:t>
-      </w:r>
-      <w:proofErr w:type="spellStart"/>
-      <w:r>
-        <w:rPr>
-          <w:lang w:val="es-ES"/>
-        </w:rPr>
-        <w:t>info</w:t>
-      </w:r>
-      <w:proofErr w:type="spellEnd"/>
-      <w:r>
-        <w:rPr>
-          <w:lang w:val="es-ES"/>
-        </w:rPr>
-        <w:t>:</w:t>
+        <w:rPr>
+          <w:lang w:val="es-ES"/>
+        </w:rPr>
+      </w:pPr>
+      <w:r>
+        <w:rPr>
+          <w:lang w:val="es-ES"/>
+        </w:rPr>
+        <w:t>Req func;</w:t>
       </w:r>
     </w:p>
     <w:p>
@@ -4040,40 +3121,11 @@
           <w:lang w:val="es-ES"/>
         </w:rPr>
       </w:pPr>
-    </w:p>
-    <w:p>
-      <w:pPr>
-        <w:rPr>
-          <w:lang w:val="es-ES"/>
-        </w:rPr>
-      </w:pPr>
-      <w:proofErr w:type="spellStart"/>
-      <w:r>
-        <w:rPr>
-          <w:lang w:val="es-ES"/>
-        </w:rPr>
-        <w:t>Req</w:t>
-      </w:r>
-      <w:proofErr w:type="spellEnd"/>
-      <w:r>
-        <w:rPr>
-          <w:lang w:val="es-ES"/>
-        </w:rPr>
-        <w:t xml:space="preserve"> </w:t>
-      </w:r>
-      <w:proofErr w:type="spellStart"/>
-      <w:r>
-        <w:rPr>
-          <w:lang w:val="es-ES"/>
-        </w:rPr>
-        <w:t>func</w:t>
-      </w:r>
-      <w:proofErr w:type="spellEnd"/>
-      <w:r>
-        <w:rPr>
-          <w:lang w:val="es-ES"/>
-        </w:rPr>
-        <w:t>;</w:t>
+      <w:r>
+        <w:rPr>
+          <w:lang w:val="es-ES"/>
+        </w:rPr>
+        <w:t>Movimiento básico</w:t>
       </w:r>
     </w:p>
     <w:p>
@@ -4091,7 +3143,7 @@
         <w:rPr>
           <w:lang w:val="es-ES"/>
         </w:rPr>
-        <w:t>Movimiento básico</w:t>
+        <w:t xml:space="preserve">Interfaz Intuitiva </w:t>
       </w:r>
     </w:p>
     <w:p>
@@ -4109,7 +3161,7 @@
         <w:rPr>
           <w:lang w:val="es-ES"/>
         </w:rPr>
-        <w:t xml:space="preserve">Interfaz Intuitiva </w:t>
+        <w:t>Vidas</w:t>
       </w:r>
     </w:p>
     <w:p>
@@ -4127,7 +3179,7 @@
         <w:rPr>
           <w:lang w:val="es-ES"/>
         </w:rPr>
-        <w:t>Vidas</w:t>
+        <w:t>Componente de ritmo</w:t>
       </w:r>
     </w:p>
     <w:p>
@@ -4145,7 +3197,7 @@
         <w:rPr>
           <w:lang w:val="es-ES"/>
         </w:rPr>
-        <w:t>Componente de ritmo</w:t>
+        <w:t>Modo Canción</w:t>
       </w:r>
     </w:p>
     <w:p>
@@ -4163,7 +3215,7 @@
         <w:rPr>
           <w:lang w:val="es-ES"/>
         </w:rPr>
-        <w:t>Modo Canción</w:t>
+        <w:t>Reapariciones y zonas de muerte</w:t>
       </w:r>
     </w:p>
     <w:p>
@@ -4181,7 +3233,7 @@
         <w:rPr>
           <w:lang w:val="es-ES"/>
         </w:rPr>
-        <w:t>Reapariciones y zonas de muerte</w:t>
+        <w:t>Habilidad1</w:t>
       </w:r>
     </w:p>
     <w:p>
@@ -4192,14 +3244,15 @@
           <w:numId w:val="3"/>
         </w:numPr>
         <w:rPr>
-          <w:lang w:val="es-ES"/>
-        </w:rPr>
-      </w:pPr>
-      <w:r>
-        <w:rPr>
-          <w:lang w:val="es-ES"/>
-        </w:rPr>
-        <w:t>Habilidad1</w:t>
+          <w:u w:val="single"/>
+          <w:lang w:val="es-ES"/>
+        </w:rPr>
+      </w:pPr>
+      <w:r>
+        <w:rPr>
+          <w:lang w:val="es-ES"/>
+        </w:rPr>
+        <w:t>Habilidad2</w:t>
       </w:r>
     </w:p>
     <w:p>
@@ -4210,15 +3263,14 @@
           <w:numId w:val="3"/>
         </w:numPr>
         <w:rPr>
-          <w:u w:val="single"/>
-          <w:lang w:val="es-ES"/>
-        </w:rPr>
-      </w:pPr>
-      <w:r>
-        <w:rPr>
-          <w:lang w:val="es-ES"/>
-        </w:rPr>
-        <w:t>Habilidad2</w:t>
+          <w:lang w:val="es-ES"/>
+        </w:rPr>
+      </w:pPr>
+      <w:r>
+        <w:rPr>
+          <w:lang w:val="es-ES"/>
+        </w:rPr>
+        <w:t>Menús</w:t>
       </w:r>
     </w:p>
     <w:p>
@@ -4236,7 +3288,7 @@
         <w:rPr>
           <w:lang w:val="es-ES"/>
         </w:rPr>
-        <w:t>Menús</w:t>
+        <w:t>Nivel</w:t>
       </w:r>
     </w:p>
     <w:p>
@@ -4254,7 +3306,7 @@
         <w:rPr>
           <w:lang w:val="es-ES"/>
         </w:rPr>
-        <w:t>Nivel</w:t>
+        <w:t>Movimiento de Camara</w:t>
       </w:r>
     </w:p>
     <w:p>
@@ -4272,16 +3324,8 @@
         <w:rPr>
           <w:lang w:val="es-ES"/>
         </w:rPr>
-        <w:t xml:space="preserve">Movimiento de </w:t>
-      </w:r>
-      <w:proofErr w:type="spellStart"/>
-      <w:r>
-        <w:rPr>
-          <w:lang w:val="es-ES"/>
-        </w:rPr>
-        <w:t>Camara</w:t>
-      </w:r>
-      <w:proofErr w:type="spellEnd"/>
+        <w:t>Coleccionables</w:t>
+      </w:r>
     </w:p>
     <w:p>
       <w:pPr>
@@ -4298,7 +3342,8 @@
         <w:rPr>
           <w:lang w:val="es-ES"/>
         </w:rPr>
-        <w:t>Coleccionables</w:t>
+        <w:lastRenderedPageBreak/>
+        <w:t>Tutoriales</w:t>
       </w:r>
     </w:p>
     <w:p>
@@ -4316,7 +3361,7 @@
         <w:rPr>
           <w:lang w:val="es-ES"/>
         </w:rPr>
-        <w:t>Tutoriales</w:t>
+        <w:t>Enemigos</w:t>
       </w:r>
     </w:p>
     <w:p>
@@ -4334,7 +3379,20 @@
         <w:rPr>
           <w:lang w:val="es-ES"/>
         </w:rPr>
-        <w:t>Enemigos</w:t>
+        <w:t>Obstaculos</w:t>
+      </w:r>
+    </w:p>
+    <w:p>
+      <w:pPr>
+        <w:rPr>
+          <w:lang w:val="es-ES"/>
+        </w:rPr>
+      </w:pPr>
+      <w:r>
+        <w:rPr>
+          <w:lang w:val="es-ES"/>
+        </w:rPr>
+        <w:t>Req no func:</w:t>
       </w:r>
     </w:p>
     <w:p>
@@ -4348,48 +3406,11 @@
           <w:lang w:val="es-ES"/>
         </w:rPr>
       </w:pPr>
-      <w:proofErr w:type="spellStart"/>
-      <w:r>
-        <w:rPr>
-          <w:lang w:val="es-ES"/>
-        </w:rPr>
-        <w:t>Obstaculos</w:t>
-      </w:r>
-      <w:proofErr w:type="spellEnd"/>
-    </w:p>
-    <w:p>
-      <w:pPr>
-        <w:rPr>
-          <w:lang w:val="es-ES"/>
-        </w:rPr>
-      </w:pPr>
-      <w:proofErr w:type="spellStart"/>
-      <w:r>
-        <w:rPr>
-          <w:lang w:val="es-ES"/>
-        </w:rPr>
-        <w:t>Req</w:t>
-      </w:r>
-      <w:proofErr w:type="spellEnd"/>
-      <w:r>
-        <w:rPr>
-          <w:lang w:val="es-ES"/>
-        </w:rPr>
-        <w:t xml:space="preserve"> no </w:t>
-      </w:r>
-      <w:proofErr w:type="spellStart"/>
-      <w:r>
-        <w:rPr>
-          <w:lang w:val="es-ES"/>
-        </w:rPr>
-        <w:t>func</w:t>
-      </w:r>
-      <w:proofErr w:type="spellEnd"/>
-      <w:r>
-        <w:rPr>
-          <w:lang w:val="es-ES"/>
-        </w:rPr>
-        <w:t>:</w:t>
+      <w:r>
+        <w:rPr>
+          <w:lang w:val="es-ES"/>
+        </w:rPr>
+        <w:t>Animaciones</w:t>
       </w:r>
     </w:p>
     <w:p>
@@ -4407,7 +3428,7 @@
         <w:rPr>
           <w:lang w:val="es-ES"/>
         </w:rPr>
-        <w:t>Animaciones</w:t>
+        <w:t>Interfaces</w:t>
       </w:r>
     </w:p>
     <w:p>
@@ -4425,7 +3446,7 @@
         <w:rPr>
           <w:lang w:val="es-ES"/>
         </w:rPr>
-        <w:t>Interfaces</w:t>
+        <w:t>Música</w:t>
       </w:r>
     </w:p>
     <w:p>
@@ -4443,7 +3464,7 @@
         <w:rPr>
           <w:lang w:val="es-ES"/>
         </w:rPr>
-        <w:t>Música</w:t>
+        <w:t>Fluidez</w:t>
       </w:r>
     </w:p>
     <w:p>
@@ -4461,7 +3482,7 @@
         <w:rPr>
           <w:lang w:val="es-ES"/>
         </w:rPr>
-        <w:t>Fluidez</w:t>
+        <w:t>Usabilidad</w:t>
       </w:r>
     </w:p>
     <w:p>
@@ -4479,7 +3500,7 @@
         <w:rPr>
           <w:lang w:val="es-ES"/>
         </w:rPr>
-        <w:t>Usabilidad</w:t>
+        <w:t>Fiabilidad</w:t>
       </w:r>
     </w:p>
     <w:p>
@@ -4497,7 +3518,7 @@
         <w:rPr>
           <w:lang w:val="es-ES"/>
         </w:rPr>
-        <w:t>Fiabilidad</w:t>
+        <w:t>Eficiencia</w:t>
       </w:r>
     </w:p>
     <w:p>
@@ -4515,8 +3536,7 @@
         <w:rPr>
           <w:lang w:val="es-ES"/>
         </w:rPr>
-        <w:lastRenderedPageBreak/>
-        <w:t>Eficiencia</w:t>
+        <w:t>Rendimiento</w:t>
       </w:r>
     </w:p>
     <w:p>
@@ -4534,7 +3554,7 @@
         <w:rPr>
           <w:lang w:val="es-ES"/>
         </w:rPr>
-        <w:t>Rendimiento</w:t>
+        <w:t>Manejo de errores</w:t>
       </w:r>
     </w:p>
     <w:p>
@@ -4552,32 +3572,7 @@
         <w:rPr>
           <w:lang w:val="es-ES"/>
         </w:rPr>
-        <w:t>Manejo de errores</w:t>
-      </w:r>
-    </w:p>
-    <w:p>
-      <w:pPr>
-        <w:pStyle w:val="Prrafodelista"/>
-        <w:numPr>
-          <w:ilvl w:val="0"/>
-          <w:numId w:val="3"/>
-        </w:numPr>
-        <w:rPr>
-          <w:lang w:val="es-ES"/>
-        </w:rPr>
-      </w:pPr>
-      <w:r>
-        <w:rPr>
-          <w:lang w:val="es-ES"/>
-        </w:rPr>
-        <w:t xml:space="preserve">Tutoriales para el </w:t>
-      </w:r>
-      <w:proofErr w:type="spellStart"/>
-      <w:r>
-        <w:rPr>
-          <w:lang w:val="es-ES"/>
-        </w:rPr>
-        <w:t>usuario</w:t>
+        <w:t>Tutoriales para el usuario</w:t>
       </w:r>
       <w:r>
         <w:rPr>
@@ -4585,7 +3580,6 @@
         </w:rPr>
         <w:t>d</w:t>
       </w:r>
-      <w:proofErr w:type="spellEnd"/>
     </w:p>
     <w:p>
       <w:pPr>
@@ -4672,7 +3666,6 @@
                 <w:bCs w:val="0"/>
               </w:rPr>
             </w:pPr>
-            <w:proofErr w:type="spellStart"/>
             <w:r>
               <w:rPr>
                 <w:b w:val="0"/>
@@ -4680,7 +3673,6 @@
               </w:rPr>
               <w:t>Versión</w:t>
             </w:r>
-            <w:proofErr w:type="spellEnd"/>
           </w:p>
         </w:tc>
         <w:tc>
@@ -4710,7 +3702,6 @@
                 <w:bCs w:val="0"/>
               </w:rPr>
             </w:pPr>
-            <w:proofErr w:type="spellStart"/>
             <w:r>
               <w:rPr>
                 <w:b w:val="0"/>
@@ -4718,7 +3709,6 @@
               </w:rPr>
               <w:t>Autores</w:t>
             </w:r>
-            <w:proofErr w:type="spellEnd"/>
           </w:p>
         </w:tc>
         <w:tc>
@@ -4778,7 +3768,6 @@
                 <w:bCs w:val="0"/>
               </w:rPr>
             </w:pPr>
-            <w:proofErr w:type="spellStart"/>
             <w:r>
               <w:rPr>
                 <w:b w:val="0"/>
@@ -4786,7 +3775,6 @@
               </w:rPr>
               <w:t>Descripción</w:t>
             </w:r>
-            <w:proofErr w:type="spellEnd"/>
           </w:p>
         </w:tc>
         <w:tc>
@@ -4813,7 +3801,6 @@
                 <w:bCs w:val="0"/>
               </w:rPr>
             </w:pPr>
-            <w:proofErr w:type="spellStart"/>
             <w:r>
               <w:rPr>
                 <w:b w:val="0"/>
@@ -4821,7 +3808,6 @@
               </w:rPr>
               <w:t>Subobjetivos</w:t>
             </w:r>
-            <w:proofErr w:type="spellEnd"/>
           </w:p>
         </w:tc>
         <w:tc>
@@ -4848,7 +3834,6 @@
                 <w:bCs w:val="0"/>
               </w:rPr>
             </w:pPr>
-            <w:proofErr w:type="spellStart"/>
             <w:r>
               <w:rPr>
                 <w:b w:val="0"/>
@@ -4856,7 +3841,6 @@
               </w:rPr>
               <w:t>Importancia</w:t>
             </w:r>
-            <w:proofErr w:type="spellEnd"/>
           </w:p>
         </w:tc>
         <w:tc>
@@ -4883,7 +3867,6 @@
                 <w:bCs w:val="0"/>
               </w:rPr>
             </w:pPr>
-            <w:proofErr w:type="spellStart"/>
             <w:r>
               <w:rPr>
                 <w:b w:val="0"/>
@@ -4891,7 +3874,6 @@
               </w:rPr>
               <w:t>Urgencia</w:t>
             </w:r>
-            <w:proofErr w:type="spellEnd"/>
           </w:p>
         </w:tc>
         <w:tc>
@@ -4951,7 +3933,6 @@
                 <w:bCs w:val="0"/>
               </w:rPr>
             </w:pPr>
-            <w:proofErr w:type="spellStart"/>
             <w:r>
               <w:rPr>
                 <w:b w:val="0"/>
@@ -4959,7 +3940,6 @@
               </w:rPr>
               <w:t>Estabilidad</w:t>
             </w:r>
-            <w:proofErr w:type="spellEnd"/>
           </w:p>
         </w:tc>
         <w:tc>
@@ -4986,7 +3966,6 @@
                 <w:bCs w:val="0"/>
               </w:rPr>
             </w:pPr>
-            <w:proofErr w:type="spellStart"/>
             <w:r>
               <w:rPr>
                 <w:b w:val="0"/>
@@ -4994,7 +3973,6 @@
               </w:rPr>
               <w:t>Comentarios</w:t>
             </w:r>
-            <w:proofErr w:type="spellEnd"/>
           </w:p>
         </w:tc>
         <w:tc>
@@ -5031,6 +4009,56 @@
     </w:sectPr>
   </w:body>
 </w:document>
+</file>
+
+<file path=word/endnotes.xml><?xml version="1.0" encoding="utf-8"?>
+<w:endnotes xmlns:wpc="http://schemas.microsoft.com/office/word/2010/wordprocessingCanvas" xmlns:cx="http://schemas.microsoft.com/office/drawing/2014/chartex" xmlns:cx1="http://schemas.microsoft.com/office/drawing/2015/9/8/chartex" xmlns:cx2="http://schemas.microsoft.com/office/drawing/2015/10/21/chartex" xmlns:cx3="http://schemas.microsoft.com/office/drawing/2016/5/9/chartex" xmlns:cx4="http://schemas.microsoft.com/office/drawing/2016/5/10/chartex" xmlns:cx5="http://schemas.microsoft.com/office/drawing/2016/5/11/chartex" xmlns:cx6="http://schemas.microsoft.com/office/drawing/2016/5/12/chartex" xmlns:cx7="http://schemas.microsoft.com/office/drawing/2016/5/13/chartex" xmlns:cx8="http://schemas.microsoft.com/office/drawing/2016/5/14/chartex" xmlns:mc="http://schemas.openxmlformats.org/markup-compatibility/2006" xmlns:aink="http://schemas.microsoft.com/office/drawing/2016/ink" xmlns:am3d="http://schemas.microsoft.com/office/drawing/2017/model3d" xmlns:o="urn:schemas-microsoft-com:office:office" xmlns:oel="http://schemas.microsoft.com/office/2019/extlst" xmlns:r="http://schemas.openxmlformats.org/officeDocument/2006/relationships" xmlns:m="http://schemas.openxmlformats.org/officeDocument/2006/math" xmlns:v="urn:schemas-microsoft-com:vml" xmlns:wp14="http://schemas.microsoft.com/office/word/2010/wordprocessingDrawing" xmlns:wp="http://schemas.openxmlformats.org/drawingml/2006/wordprocessingDrawing" xmlns:w10="urn:schemas-microsoft-com:office:word" xmlns:w="http://schemas.openxmlformats.org/wordprocessingml/2006/main" xmlns:w14="http://schemas.microsoft.com/office/word/2010/wordml" xmlns:w15="http://schemas.microsoft.com/office/word/2012/wordml" xmlns:w16cex="http://schemas.microsoft.com/office/word/2018/wordml/cex" xmlns:w16cid="http://schemas.microsoft.com/office/word/2016/wordml/cid" xmlns:w16="http://schemas.microsoft.com/office/word/2018/wordml" xmlns:w16du="http://schemas.microsoft.com/office/word/2023/wordml/word16du" xmlns:w16sdtdh="http://schemas.microsoft.com/office/word/2020/wordml/sdtdatahash" xmlns:w16se="http://schemas.microsoft.com/office/word/2015/wordml/symex" xmlns:wpg="http://schemas.microsoft.com/office/word/2010/wordprocessingGroup" xmlns:wpi="http://schemas.microsoft.com/office/word/2010/wordprocessingInk" xmlns:wne="http://schemas.microsoft.com/office/word/2006/wordml" xmlns:wps="http://schemas.microsoft.com/office/word/2010/wordprocessingShape" mc:Ignorable="w14 w15 w16se w16cid w16 w16cex w16sdtdh w16du wp14">
+  <w:endnote w:type="separator" w:id="-1">
+    <w:p>
+      <w:pPr>
+        <w:spacing w:after="0" w:line="240" w:lineRule="auto"/>
+      </w:pPr>
+      <w:r>
+        <w:separator/>
+      </w:r>
+    </w:p>
+  </w:endnote>
+  <w:endnote w:type="continuationSeparator" w:id="0">
+    <w:p>
+      <w:pPr>
+        <w:spacing w:after="0" w:line="240" w:lineRule="auto"/>
+      </w:pPr>
+      <w:r>
+        <w:continuationSeparator/>
+      </w:r>
+    </w:p>
+  </w:endnote>
+</w:endnotes>
+</file>
+
+<file path=word/footnotes.xml><?xml version="1.0" encoding="utf-8"?>
+<w:footnotes xmlns:wpc="http://schemas.microsoft.com/office/word/2010/wordprocessingCanvas" xmlns:cx="http://schemas.microsoft.com/office/drawing/2014/chartex" xmlns:cx1="http://schemas.microsoft.com/office/drawing/2015/9/8/chartex" xmlns:cx2="http://schemas.microsoft.com/office/drawing/2015/10/21/chartex" xmlns:cx3="http://schemas.microsoft.com/office/drawing/2016/5/9/chartex" xmlns:cx4="http://schemas.microsoft.com/office/drawing/2016/5/10/chartex" xmlns:cx5="http://schemas.microsoft.com/office/drawing/2016/5/11/chartex" xmlns:cx6="http://schemas.microsoft.com/office/drawing/2016/5/12/chartex" xmlns:cx7="http://schemas.microsoft.com/office/drawing/2016/5/13/chartex" xmlns:cx8="http://schemas.microsoft.com/office/drawing/2016/5/14/chartex" xmlns:mc="http://schemas.openxmlformats.org/markup-compatibility/2006" xmlns:aink="http://schemas.microsoft.com/office/drawing/2016/ink" xmlns:am3d="http://schemas.microsoft.com/office/drawing/2017/model3d" xmlns:o="urn:schemas-microsoft-com:office:office" xmlns:oel="http://schemas.microsoft.com/office/2019/extlst" xmlns:r="http://schemas.openxmlformats.org/officeDocument/2006/relationships" xmlns:m="http://schemas.openxmlformats.org/officeDocument/2006/math" xmlns:v="urn:schemas-microsoft-com:vml" xmlns:wp14="http://schemas.microsoft.com/office/word/2010/wordprocessingDrawing" xmlns:wp="http://schemas.openxmlformats.org/drawingml/2006/wordprocessingDrawing" xmlns:w10="urn:schemas-microsoft-com:office:word" xmlns:w="http://schemas.openxmlformats.org/wordprocessingml/2006/main" xmlns:w14="http://schemas.microsoft.com/office/word/2010/wordml" xmlns:w15="http://schemas.microsoft.com/office/word/2012/wordml" xmlns:w16cex="http://schemas.microsoft.com/office/word/2018/wordml/cex" xmlns:w16cid="http://schemas.microsoft.com/office/word/2016/wordml/cid" xmlns:w16="http://schemas.microsoft.com/office/word/2018/wordml" xmlns:w16du="http://schemas.microsoft.com/office/word/2023/wordml/word16du" xmlns:w16sdtdh="http://schemas.microsoft.com/office/word/2020/wordml/sdtdatahash" xmlns:w16se="http://schemas.microsoft.com/office/word/2015/wordml/symex" xmlns:wpg="http://schemas.microsoft.com/office/word/2010/wordprocessingGroup" xmlns:wpi="http://schemas.microsoft.com/office/word/2010/wordprocessingInk" xmlns:wne="http://schemas.microsoft.com/office/word/2006/wordml" xmlns:wps="http://schemas.microsoft.com/office/word/2010/wordprocessingShape" mc:Ignorable="w14 w15 w16se w16cid w16 w16cex w16sdtdh w16du wp14">
+  <w:footnote w:type="separator" w:id="-1">
+    <w:p>
+      <w:pPr>
+        <w:spacing w:after="0" w:line="240" w:lineRule="auto"/>
+      </w:pPr>
+      <w:r>
+        <w:separator/>
+      </w:r>
+    </w:p>
+  </w:footnote>
+  <w:footnote w:type="continuationSeparator" w:id="0">
+    <w:p>
+      <w:pPr>
+        <w:spacing w:after="0" w:line="240" w:lineRule="auto"/>
+      </w:pPr>
+      <w:r>
+        <w:continuationSeparator/>
+      </w:r>
+    </w:p>
+  </w:footnote>
+</w:footnotes>
 </file>
 
 <file path=word/numbering.xml><?xml version="1.0" encoding="utf-8"?>
@@ -6565,6 +5593,50 @@
       <w:contextualSpacing/>
     </w:pPr>
   </w:style>
+  <w:style w:type="paragraph" w:styleId="Encabezado">
+    <w:name w:val="header"/>
+    <w:basedOn w:val="Normal"/>
+    <w:link w:val="EncabezadoCar"/>
+    <w:uiPriority w:val="99"/>
+    <w:unhideWhenUsed/>
+    <w:rsid w:val="003478EF"/>
+    <w:pPr>
+      <w:tabs>
+        <w:tab w:val="center" w:pos="4252"/>
+        <w:tab w:val="right" w:pos="8504"/>
+      </w:tabs>
+      <w:spacing w:after="0" w:line="240" w:lineRule="auto"/>
+    </w:pPr>
+  </w:style>
+  <w:style w:type="character" w:customStyle="1" w:styleId="EncabezadoCar">
+    <w:name w:val="Encabezado Car"/>
+    <w:basedOn w:val="Fuentedeprrafopredeter"/>
+    <w:link w:val="Encabezado"/>
+    <w:uiPriority w:val="99"/>
+    <w:rsid w:val="003478EF"/>
+  </w:style>
+  <w:style w:type="paragraph" w:styleId="Piedepgina">
+    <w:name w:val="footer"/>
+    <w:basedOn w:val="Normal"/>
+    <w:link w:val="PiedepginaCar"/>
+    <w:uiPriority w:val="99"/>
+    <w:unhideWhenUsed/>
+    <w:rsid w:val="003478EF"/>
+    <w:pPr>
+      <w:tabs>
+        <w:tab w:val="center" w:pos="4252"/>
+        <w:tab w:val="right" w:pos="8504"/>
+      </w:tabs>
+      <w:spacing w:after="0" w:line="240" w:lineRule="auto"/>
+    </w:pPr>
+  </w:style>
+  <w:style w:type="character" w:customStyle="1" w:styleId="PiedepginaCar">
+    <w:name w:val="Pie de página Car"/>
+    <w:basedOn w:val="Fuentedeprrafopredeter"/>
+    <w:link w:val="Piedepgina"/>
+    <w:uiPriority w:val="99"/>
+    <w:rsid w:val="003478EF"/>
+  </w:style>
 </w:styles>
 </file>
 

</xml_diff>

<commit_message>
some changes and documentation
</commit_message>
<xml_diff>
--- a/docu/Anexo II.docx
+++ b/docu/Anexo II.docx
@@ -137,12 +137,18 @@
         </w:rPr>
         <w:t xml:space="preserve"> y de la herramienta </w:t>
       </w:r>
+      <w:r>
+        <w:rPr>
+          <w:lang w:val="es-ES"/>
+        </w:rPr>
+        <w:t xml:space="preserve">Visual </w:t>
+      </w:r>
       <w:proofErr w:type="spellStart"/>
       <w:r>
         <w:rPr>
           <w:lang w:val="es-ES"/>
         </w:rPr>
-        <w:t>PlantUML</w:t>
+        <w:t>Paradigm</w:t>
       </w:r>
       <w:proofErr w:type="spellEnd"/>
       <w:r>
@@ -363,21 +369,7 @@
         <w:rPr>
           <w:lang w:val="es-ES"/>
         </w:rPr>
-        <w:t xml:space="preserve">el componente rítmico es muy importante, se ha contado con la ayuda externa de un compositor para hacer la música. Por otro lado, se ha elegido una metodología ágil de tipo SCRUM en base a prototipos, por lo que se han requerido de un grupo de </w:t>
-      </w:r>
-      <w:proofErr w:type="spellStart"/>
-      <w:r>
-        <w:rPr>
-          <w:lang w:val="es-ES"/>
-        </w:rPr>
-        <w:t>testers</w:t>
-      </w:r>
-      <w:proofErr w:type="spellEnd"/>
-      <w:r>
-        <w:rPr>
-          <w:lang w:val="es-ES"/>
-        </w:rPr>
-        <w:t xml:space="preserve"> que realizaran pruebas sobre el software. Por último, </w:t>
+        <w:t xml:space="preserve">el componente rítmico es muy importante, se ha contado con la ayuda externa de un compositor para hacer la música. Por otro lado, se ha elegido una metodología ágil de tipo SCRUM en base a prototipos, por lo que se han requerido de un grupo de testers que realizaran pruebas sobre el software. Por último, </w:t>
       </w:r>
       <w:r>
         <w:rPr>
@@ -3657,27 +3649,55 @@
         <w:rPr>
           <w:lang w:val="es-ES"/>
         </w:rPr>
-        <w:t xml:space="preserve">Estos requisitos definen el tipo de información que se almacenará y </w:t>
-      </w:r>
-      <w:proofErr w:type="spellStart"/>
-      <w:r>
-        <w:rPr>
-          <w:lang w:val="es-ES"/>
-        </w:rPr>
-        <w:t>Gestión</w:t>
+        <w:t xml:space="preserve">Estos requisitos definen el tipo de información que se </w:t>
       </w:r>
       <w:r>
         <w:rPr>
           <w:lang w:val="es-ES"/>
         </w:rPr>
-        <w:t>ará</w:t>
+        <w:t>almacena</w:t>
       </w:r>
-      <w:proofErr w:type="spellEnd"/>
       <w:r>
         <w:rPr>
           <w:lang w:val="es-ES"/>
         </w:rPr>
-        <w:t xml:space="preserve"> nuestro sistema. En nuestro caso, al ser un videojuego la única información que querremos almacenar es la puntuación de los niveles y los coleccionables de cada uno.</w:t>
+        <w:t xml:space="preserve"> y </w:t>
+      </w:r>
+      <w:r>
+        <w:rPr>
+          <w:lang w:val="es-ES"/>
+        </w:rPr>
+        <w:t>gestiona en</w:t>
+      </w:r>
+      <w:r>
+        <w:rPr>
+          <w:lang w:val="es-ES"/>
+        </w:rPr>
+        <w:t xml:space="preserve"> </w:t>
+      </w:r>
+      <w:r>
+        <w:rPr>
+          <w:lang w:val="es-ES"/>
+        </w:rPr>
+        <w:t xml:space="preserve">el </w:t>
+      </w:r>
+      <w:r>
+        <w:rPr>
+          <w:lang w:val="es-ES"/>
+        </w:rPr>
+        <w:t xml:space="preserve">sistema. En </w:t>
+      </w:r>
+      <w:r>
+        <w:rPr>
+          <w:lang w:val="es-ES"/>
+        </w:rPr>
+        <w:t>este</w:t>
+      </w:r>
+      <w:r>
+        <w:rPr>
+          <w:lang w:val="es-ES"/>
+        </w:rPr>
+        <w:t xml:space="preserve"> caso, al ser un videojuego la única información que querremos almacenar es la puntuación de los niveles y los coleccionables de cada uno.</w:t>
       </w:r>
     </w:p>
     <w:p>
@@ -5108,7 +5128,21 @@
               <w:rPr>
                 <w:lang w:val="es-ES"/>
               </w:rPr>
-              <w:t>) del jugador, haciendo saber cuanta vida tiene al jugador. Esta vida se actualizará cada vez que aumente o disminuya.</w:t>
+              <w:t xml:space="preserve">) del jugador, haciendo saber </w:t>
+            </w:r>
+            <w:proofErr w:type="spellStart"/>
+            <w:r>
+              <w:rPr>
+                <w:lang w:val="es-ES"/>
+              </w:rPr>
+              <w:t>cuanta</w:t>
+            </w:r>
+            <w:proofErr w:type="spellEnd"/>
+            <w:r>
+              <w:rPr>
+                <w:lang w:val="es-ES"/>
+              </w:rPr>
+              <w:t xml:space="preserve"> vida tiene al jugador. Esta vida se actualizará cada vez que aumente o disminuya.</w:t>
             </w:r>
           </w:p>
         </w:tc>
@@ -5155,6 +5189,7 @@
             <w:shd w:val="clear" w:color="auto" w:fill="B3E5A1" w:themeFill="accent6" w:themeFillTint="66"/>
           </w:tcPr>
           <w:p>
+            <w:bookmarkStart w:id="0" w:name="_Hlk176194293"/>
             <w:r>
               <w:lastRenderedPageBreak/>
               <w:t>CRQ-01</w:t>
@@ -5646,6 +5681,7 @@
           </w:p>
         </w:tc>
       </w:tr>
+      <w:bookmarkEnd w:id="0"/>
     </w:tbl>
     <w:p>
       <w:pPr>
@@ -6835,6 +6871,7 @@
           </w:tcPr>
           <w:p>
             <w:pPr>
+              <w:ind w:left="720" w:hanging="720"/>
               <w:cnfStyle w:val="000000000000" w:firstRow="0" w:lastRow="0" w:firstColumn="0" w:lastColumn="0" w:oddVBand="0" w:evenVBand="0" w:oddHBand="0" w:evenHBand="0" w:firstRowFirstColumn="0" w:firstRowLastColumn="0" w:lastRowFirstColumn="0" w:lastRowLastColumn="0"/>
               <w:rPr>
                 <w:lang w:val="es-ES"/>
@@ -6856,7 +6893,13 @@
               <w:rPr>
                 <w:lang w:val="es-ES"/>
               </w:rPr>
-              <w:t>ofrecer un entorno por el que el avatar del jugador pueda desenvolverse-</w:t>
+              <w:t>ofrecer un entorno por el que el avatar del jugador pueda desenvolverse</w:t>
+            </w:r>
+            <w:r>
+              <w:rPr>
+                <w:lang w:val="es-ES"/>
+              </w:rPr>
+              <w:t>.</w:t>
             </w:r>
           </w:p>
         </w:tc>
@@ -7367,6 +7410,7 @@
                 <w:lang w:val="es-ES"/>
               </w:rPr>
             </w:pPr>
+            <w:bookmarkStart w:id="1" w:name="_Hlk176203553"/>
             <w:r>
               <w:rPr>
                 <w:lang w:val="es-ES"/>
@@ -7379,6 +7423,7 @@
               </w:rPr>
               <w:t>al y como se describe a continuación cuando el jugador presione las teclas de movimiento.</w:t>
             </w:r>
+            <w:bookmarkEnd w:id="1"/>
           </w:p>
         </w:tc>
       </w:tr>
@@ -7436,7 +7481,19 @@
               <w:rPr>
                 <w:lang w:val="es-ES"/>
               </w:rPr>
-              <w:t xml:space="preserve"> y además tiene que estar fuera del modo Canción, el cuál se explicará más adelante.</w:t>
+              <w:t xml:space="preserve"> y además tiene que estar fuera del modo Canción, el </w:t>
+            </w:r>
+            <w:r>
+              <w:rPr>
+                <w:lang w:val="es-ES"/>
+              </w:rPr>
+              <w:t>cual</w:t>
+            </w:r>
+            <w:r>
+              <w:rPr>
+                <w:lang w:val="es-ES"/>
+              </w:rPr>
+              <w:t xml:space="preserve"> se explicará más adelante.</w:t>
             </w:r>
           </w:p>
         </w:tc>
@@ -7990,6 +8047,7 @@
                 <w:lang w:val="es-ES"/>
               </w:rPr>
             </w:pPr>
+            <w:bookmarkStart w:id="2" w:name="_Hlk176203624"/>
             <w:r>
               <w:rPr>
                 <w:lang w:val="es-ES"/>
@@ -8002,6 +8060,7 @@
               </w:rPr>
               <w:t>n un juego plataformas 2D</w:t>
             </w:r>
+            <w:bookmarkEnd w:id="2"/>
           </w:p>
         </w:tc>
       </w:tr>
@@ -8406,6 +8465,7 @@
                 <w:lang w:val="es-ES"/>
               </w:rPr>
             </w:pPr>
+            <w:bookmarkStart w:id="3" w:name="_Hlk176203574"/>
             <w:r>
               <w:rPr>
                 <w:lang w:val="es-ES"/>
@@ -8418,6 +8478,7 @@
               </w:rPr>
               <w:t>al y como se describe a continuación mientras está en el nivel, llevando el ritmo de la canción que esté sonando</w:t>
             </w:r>
+            <w:bookmarkEnd w:id="3"/>
           </w:p>
         </w:tc>
       </w:tr>
@@ -9074,6 +9135,7 @@
                 <w:lang w:val="es-ES"/>
               </w:rPr>
             </w:pPr>
+            <w:bookmarkStart w:id="4" w:name="_Hlk176203632"/>
             <w:r>
               <w:rPr>
                 <w:lang w:val="es-ES"/>
@@ -9086,6 +9148,7 @@
               </w:rPr>
               <w:t>e las habilidades rítmicas, en el modo canción el jugador deberá tocar 3 de 8 corcheas especificas en el compás 4/4 que dura dicho modo.</w:t>
             </w:r>
+            <w:bookmarkEnd w:id="4"/>
           </w:p>
         </w:tc>
       </w:tr>
@@ -9141,12 +9204,14 @@
                 <w:lang w:val="es-ES"/>
               </w:rPr>
             </w:pPr>
+            <w:bookmarkStart w:id="5" w:name="_Hlk176203583"/>
             <w:r>
               <w:rPr>
                 <w:lang w:val="es-ES"/>
               </w:rPr>
               <w:t>Habilidad 1 - Impulso</w:t>
             </w:r>
+            <w:bookmarkEnd w:id="5"/>
           </w:p>
         </w:tc>
       </w:tr>
@@ -9532,6 +9597,7 @@
             <w:tcW w:w="2830" w:type="dxa"/>
           </w:tcPr>
           <w:p>
+            <w:bookmarkStart w:id="6" w:name="_Hlk176203654"/>
             <w:proofErr w:type="spellStart"/>
             <w:r>
               <w:t>Precondici</w:t>
@@ -9557,6 +9623,7 @@
                 <w:lang w:val="es-ES"/>
               </w:rPr>
             </w:pPr>
+            <w:bookmarkStart w:id="7" w:name="_Hlk176203663"/>
             <w:r>
               <w:rPr>
                 <w:lang w:val="es-ES"/>
@@ -9569,9 +9636,11 @@
               </w:rPr>
               <w:t>n el nivel manejando a Baqueta y haber tocado el ritmo dedicado al Impulso en el modo canción.</w:t>
             </w:r>
-          </w:p>
-        </w:tc>
-      </w:tr>
+            <w:bookmarkEnd w:id="7"/>
+          </w:p>
+        </w:tc>
+      </w:tr>
+      <w:bookmarkEnd w:id="6"/>
       <w:tr>
         <w:trPr>
           <w:trHeight w:val="160"/>
@@ -9977,6 +10046,7 @@
                 <w:lang w:val="es-ES"/>
               </w:rPr>
             </w:pPr>
+            <w:bookmarkStart w:id="8" w:name="_Hlk176203641"/>
             <w:r>
               <w:rPr>
                 <w:lang w:val="es-ES"/>
@@ -9989,6 +10059,7 @@
               </w:rPr>
               <w:t>l avatar no podrá realizar ninguna acción, pero eliminará enemigos al tocarlos y atravesará barreras de sonido, un tipo de obstáculo del que se hablará posteriormente.</w:t>
             </w:r>
+            <w:bookmarkEnd w:id="8"/>
           </w:p>
         </w:tc>
       </w:tr>
@@ -10058,6 +10129,7 @@
                 <w:lang w:val="es-ES"/>
               </w:rPr>
             </w:pPr>
+            <w:bookmarkStart w:id="9" w:name="_Hlk176203732"/>
             <w:r>
               <w:rPr>
                 <w:lang w:val="es-ES"/>
@@ -10076,6 +10148,7 @@
               </w:rPr>
               <w:t xml:space="preserve"> – Onda Sonora</w:t>
             </w:r>
+            <w:bookmarkEnd w:id="9"/>
           </w:p>
         </w:tc>
       </w:tr>
@@ -10860,6 +10933,7 @@
                 <w:lang w:val="es-ES"/>
               </w:rPr>
             </w:pPr>
+            <w:bookmarkStart w:id="10" w:name="_Hlk176203767"/>
             <w:r>
               <w:rPr>
                 <w:lang w:val="es-ES"/>
@@ -10902,6 +10976,7 @@
               </w:rPr>
               <w:t>implementar interruptores accionables únicamente con el disparo.</w:t>
             </w:r>
+            <w:bookmarkEnd w:id="10"/>
           </w:p>
         </w:tc>
       </w:tr>
@@ -10967,12 +11042,14 @@
                 <w:lang w:val="es-ES"/>
               </w:rPr>
             </w:pPr>
+            <w:bookmarkStart w:id="11" w:name="_Hlk176203773"/>
             <w:r>
               <w:rPr>
                 <w:lang w:val="es-ES"/>
               </w:rPr>
               <w:t>Recolección de vidas</w:t>
             </w:r>
+            <w:bookmarkEnd w:id="11"/>
           </w:p>
         </w:tc>
       </w:tr>
@@ -14396,12 +14473,14 @@
                 <w:lang w:val="es-ES"/>
               </w:rPr>
             </w:pPr>
+            <w:bookmarkStart w:id="12" w:name="_Hlk176204157"/>
             <w:r>
               <w:rPr>
                 <w:lang w:val="es-ES"/>
               </w:rPr>
               <w:t>La cámara mantendrá siempre al avatar en el centro de la pantalla y ajustándose a unos máximos y mínimos de posición para mostrar siempre la información necesaria al jugador sobre el nivel.</w:t>
             </w:r>
+            <w:bookmarkEnd w:id="12"/>
           </w:p>
         </w:tc>
       </w:tr>
@@ -15075,7 +15154,21 @@
               <w:rPr>
                 <w:lang w:val="es-ES"/>
               </w:rPr>
-              <w:t>El HUD del jugador se vera actualizado con el nuevo valor de coleccionables recogidos.</w:t>
+              <w:t xml:space="preserve">El HUD del jugador se </w:t>
+            </w:r>
+            <w:proofErr w:type="spellStart"/>
+            <w:r>
+              <w:rPr>
+                <w:lang w:val="es-ES"/>
+              </w:rPr>
+              <w:t>vera</w:t>
+            </w:r>
+            <w:proofErr w:type="spellEnd"/>
+            <w:r>
+              <w:rPr>
+                <w:lang w:val="es-ES"/>
+              </w:rPr>
+              <w:t xml:space="preserve"> actualizado con el nuevo valor de coleccionables recogidos.</w:t>
             </w:r>
           </w:p>
         </w:tc>
@@ -15305,12 +15398,14 @@
                 <w:lang w:val="es-ES"/>
               </w:rPr>
             </w:pPr>
+            <w:bookmarkStart w:id="13" w:name="_Hlk176204260"/>
             <w:r>
               <w:rPr>
                 <w:lang w:val="es-ES"/>
               </w:rPr>
               <w:t>Obstáculos – Elementos dañinos</w:t>
             </w:r>
+            <w:bookmarkEnd w:id="13"/>
           </w:p>
         </w:tc>
       </w:tr>
@@ -15916,44 +16011,6 @@
               <w:t>) y durante un tiempo corto será invulnerable a otro golpe.</w:t>
             </w:r>
           </w:p>
-        </w:tc>
-      </w:tr>
-      <w:tr>
-        <w:trPr>
-          <w:trHeight w:val="325"/>
-        </w:trPr>
-        <w:tc>
-          <w:tcPr>
-            <w:cnfStyle w:val="001000000000" w:firstRow="0" w:lastRow="0" w:firstColumn="1" w:lastColumn="0" w:oddVBand="0" w:evenVBand="0" w:oddHBand="0" w:evenHBand="0" w:firstRowFirstColumn="0" w:firstRowLastColumn="0" w:lastRowFirstColumn="0" w:lastRowLastColumn="0"/>
-            <w:tcW w:w="2830" w:type="dxa"/>
-            <w:vMerge/>
-          </w:tcPr>
-          <w:p>
-            <w:pPr>
-              <w:rPr>
-                <w:lang w:val="es-ES"/>
-              </w:rPr>
-            </w:pPr>
-          </w:p>
-        </w:tc>
-        <w:tc>
-          <w:tcPr>
-            <w:tcW w:w="1418" w:type="dxa"/>
-          </w:tcPr>
-          <w:p>
-            <w:pPr>
-              <w:jc w:val="center"/>
-              <w:cnfStyle w:val="000000000000" w:firstRow="0" w:lastRow="0" w:firstColumn="0" w:lastColumn="0" w:oddVBand="0" w:evenVBand="0" w:oddHBand="0" w:evenHBand="0" w:firstRowFirstColumn="0" w:firstRowLastColumn="0" w:lastRowFirstColumn="0" w:lastRowLastColumn="0"/>
-            </w:pPr>
-            <w:r>
-              <w:t>4</w:t>
-            </w:r>
-          </w:p>
-        </w:tc>
-        <w:tc>
-          <w:tcPr>
-            <w:tcW w:w="5102" w:type="dxa"/>
-          </w:tcPr>
           <w:p>
             <w:pPr>
               <w:cnfStyle w:val="000000000000" w:firstRow="0" w:lastRow="0" w:firstColumn="0" w:lastColumn="0" w:oddVBand="0" w:evenVBand="0" w:oddHBand="0" w:evenHBand="0" w:firstRowFirstColumn="0" w:firstRowLastColumn="0" w:lastRowFirstColumn="0" w:lastRowLastColumn="0"/>
@@ -16226,7 +16283,21 @@
               <w:rPr>
                 <w:lang w:val="es-ES"/>
               </w:rPr>
-              <w:t>El jugador colisiona con el objeto mientras esta en el estado Impulsado del UC-03. El sistema aplicará una fuerza al avatar sin dañarlo haciendo un efecto de rebote.</w:t>
+              <w:t xml:space="preserve">El jugador colisiona con el objeto mientras </w:t>
+            </w:r>
+            <w:proofErr w:type="spellStart"/>
+            <w:r>
+              <w:rPr>
+                <w:lang w:val="es-ES"/>
+              </w:rPr>
+              <w:t>esta</w:t>
+            </w:r>
+            <w:proofErr w:type="spellEnd"/>
+            <w:r>
+              <w:rPr>
+                <w:lang w:val="es-ES"/>
+              </w:rPr>
+              <w:t xml:space="preserve"> en el estado Impulsado del UC-03. El sistema aplicará una fuerza al avatar sin dañarlo haciendo un efecto de rebote.</w:t>
             </w:r>
           </w:p>
         </w:tc>
@@ -16382,7 +16453,14 @@
               <w:rPr>
                 <w:lang w:val="es-ES"/>
               </w:rPr>
-              <w:t xml:space="preserve">Estos obstáculos pretenden condicionar al jugador a la hora de realizar acciones y también prestan opciones de movimiento </w:t>
+              <w:t xml:space="preserve">Estos obstáculos pretenden condicionar al jugador a la hora de realizar acciones y </w:t>
+            </w:r>
+            <w:bookmarkStart w:id="14" w:name="_Hlk176204384"/>
+            <w:r>
+              <w:rPr>
+                <w:lang w:val="es-ES"/>
+              </w:rPr>
+              <w:t xml:space="preserve">también prestan opciones de movimiento </w:t>
             </w:r>
             <w:r>
               <w:rPr>
@@ -16396,6 +16474,7 @@
               </w:rPr>
               <w:t xml:space="preserve"> complejas al usarse junto con la habilidad de impulso.</w:t>
             </w:r>
+            <w:bookmarkEnd w:id="14"/>
           </w:p>
         </w:tc>
       </w:tr>
@@ -16452,12 +16531,14 @@
                 <w:lang w:val="es-ES"/>
               </w:rPr>
             </w:pPr>
+            <w:bookmarkStart w:id="15" w:name="_Hlk176204337"/>
             <w:r>
               <w:rPr>
                 <w:lang w:val="es-ES"/>
               </w:rPr>
               <w:t>Obstáculos – Barreras de sonido</w:t>
             </w:r>
+            <w:bookmarkEnd w:id="15"/>
           </w:p>
         </w:tc>
       </w:tr>
@@ -18329,26 +18410,54 @@
                 <w:lang w:val="es-ES"/>
               </w:rPr>
             </w:pPr>
+            <w:bookmarkStart w:id="16" w:name="_Hlk176204439"/>
             <w:r>
               <w:rPr>
                 <w:lang w:val="es-ES"/>
               </w:rPr>
               <w:t xml:space="preserve">Estos tutoriales estarán por el nivel y darán pruebas visuales y sonoras de como realizar los ritmos ligados a las habilidades del avatar. Las claves visuales se verán independientemente </w:t>
             </w:r>
+            <w:r>
+              <w:rPr>
+                <w:lang w:val="es-ES"/>
+              </w:rPr>
+              <w:t>que</w:t>
+            </w:r>
+            <w:r>
+              <w:rPr>
+                <w:lang w:val="es-ES"/>
+              </w:rPr>
+              <w:t xml:space="preserve"> el jugador entre en colisión con ellas. Las claves </w:t>
+            </w:r>
+            <w:bookmarkStart w:id="17" w:name="_Hlk176204507"/>
+            <w:r>
+              <w:rPr>
+                <w:lang w:val="es-ES"/>
+              </w:rPr>
+              <w:t xml:space="preserve">sonoras </w:t>
+            </w:r>
+            <w:bookmarkEnd w:id="16"/>
+            <w:r>
+              <w:rPr>
+                <w:lang w:val="es-ES"/>
+              </w:rPr>
+              <w:t xml:space="preserve">sólo se </w:t>
+            </w:r>
             <w:proofErr w:type="gramStart"/>
             <w:r>
               <w:rPr>
                 <w:lang w:val="es-ES"/>
               </w:rPr>
-              <w:t>de que</w:t>
+              <w:t>escucharan</w:t>
             </w:r>
             <w:proofErr w:type="gramEnd"/>
             <w:r>
               <w:rPr>
                 <w:lang w:val="es-ES"/>
               </w:rPr>
-              <w:t xml:space="preserve"> el jugador entre en colisión con ellas. Las claves sonoras </w:t>
-            </w:r>
+              <w:t xml:space="preserve"> si el jugador entra en una zona de acción ligada al tutorial.</w:t>
+            </w:r>
+            <w:bookmarkEnd w:id="17"/>
           </w:p>
         </w:tc>
       </w:tr>
@@ -19065,44 +19174,6 @@
               <w:t>) y durante un tiempo corto será invulnerable a otro golpe.</w:t>
             </w:r>
           </w:p>
-        </w:tc>
-      </w:tr>
-      <w:tr>
-        <w:trPr>
-          <w:trHeight w:val="325"/>
-        </w:trPr>
-        <w:tc>
-          <w:tcPr>
-            <w:cnfStyle w:val="001000000000" w:firstRow="0" w:lastRow="0" w:firstColumn="1" w:lastColumn="0" w:oddVBand="0" w:evenVBand="0" w:oddHBand="0" w:evenHBand="0" w:firstRowFirstColumn="0" w:firstRowLastColumn="0" w:lastRowFirstColumn="0" w:lastRowLastColumn="0"/>
-            <w:tcW w:w="2830" w:type="dxa"/>
-            <w:vMerge/>
-          </w:tcPr>
-          <w:p>
-            <w:pPr>
-              <w:rPr>
-                <w:lang w:val="es-ES"/>
-              </w:rPr>
-            </w:pPr>
-          </w:p>
-        </w:tc>
-        <w:tc>
-          <w:tcPr>
-            <w:tcW w:w="1418" w:type="dxa"/>
-          </w:tcPr>
-          <w:p>
-            <w:pPr>
-              <w:jc w:val="center"/>
-              <w:cnfStyle w:val="000000000000" w:firstRow="0" w:lastRow="0" w:firstColumn="0" w:lastColumn="0" w:oddVBand="0" w:evenVBand="0" w:oddHBand="0" w:evenHBand="0" w:firstRowFirstColumn="0" w:firstRowLastColumn="0" w:lastRowFirstColumn="0" w:lastRowLastColumn="0"/>
-            </w:pPr>
-            <w:r>
-              <w:t>4</w:t>
-            </w:r>
-          </w:p>
-        </w:tc>
-        <w:tc>
-          <w:tcPr>
-            <w:tcW w:w="5102" w:type="dxa"/>
-          </w:tcPr>
           <w:p>
             <w:pPr>
               <w:cnfStyle w:val="000000000000" w:firstRow="0" w:lastRow="0" w:firstColumn="0" w:lastColumn="0" w:oddVBand="0" w:evenVBand="0" w:oddHBand="0" w:evenHBand="0" w:firstRowFirstColumn="0" w:firstRowLastColumn="0" w:lastRowFirstColumn="0" w:lastRowLastColumn="0"/>
@@ -20491,6 +20562,1049 @@
                 <w:lang w:val="es-ES"/>
               </w:rPr>
               <w:t>Derrotar enemigos es una pieza muy importante del nivel ya que ofrece un orden de acciones que el jugador debe seguir para superar el nivel.</w:t>
+            </w:r>
+          </w:p>
+        </w:tc>
+      </w:tr>
+    </w:tbl>
+    <w:p>
+      <w:pPr>
+        <w:rPr>
+          <w:lang w:val="es-ES"/>
+        </w:rPr>
+      </w:pPr>
+    </w:p>
+    <w:tbl>
+      <w:tblPr>
+        <w:tblStyle w:val="Tablaconcuadrcula1clara"/>
+        <w:tblW w:w="0" w:type="auto"/>
+        <w:tblLook w:val="04A0" w:firstRow="1" w:lastRow="0" w:firstColumn="1" w:lastColumn="0" w:noHBand="0" w:noVBand="1"/>
+      </w:tblPr>
+      <w:tblGrid>
+        <w:gridCol w:w="2830"/>
+        <w:gridCol w:w="1418"/>
+        <w:gridCol w:w="142"/>
+        <w:gridCol w:w="4960"/>
+      </w:tblGrid>
+      <w:tr>
+        <w:trPr>
+          <w:cnfStyle w:val="100000000000" w:firstRow="1" w:lastRow="0" w:firstColumn="0" w:lastColumn="0" w:oddVBand="0" w:evenVBand="0" w:oddHBand="0" w:evenHBand="0" w:firstRowFirstColumn="0" w:firstRowLastColumn="0" w:lastRowFirstColumn="0" w:lastRowLastColumn="0"/>
+        </w:trPr>
+        <w:tc>
+          <w:tcPr>
+            <w:cnfStyle w:val="001000000000" w:firstRow="0" w:lastRow="0" w:firstColumn="1" w:lastColumn="0" w:oddVBand="0" w:evenVBand="0" w:oddHBand="0" w:evenHBand="0" w:firstRowFirstColumn="0" w:firstRowLastColumn="0" w:lastRowFirstColumn="0" w:lastRowLastColumn="0"/>
+            <w:tcW w:w="2830" w:type="dxa"/>
+            <w:shd w:val="clear" w:color="auto" w:fill="B3E5A1" w:themeFill="accent6" w:themeFillTint="66"/>
+          </w:tcPr>
+          <w:p>
+            <w:r>
+              <w:t>UC-15</w:t>
+            </w:r>
+          </w:p>
+        </w:tc>
+        <w:tc>
+          <w:tcPr>
+            <w:tcW w:w="6520" w:type="dxa"/>
+            <w:gridSpan w:val="3"/>
+            <w:shd w:val="clear" w:color="auto" w:fill="B3E5A1" w:themeFill="accent6" w:themeFillTint="66"/>
+          </w:tcPr>
+          <w:p>
+            <w:pPr>
+              <w:cnfStyle w:val="100000000000" w:firstRow="1" w:lastRow="0" w:firstColumn="0" w:lastColumn="0" w:oddVBand="0" w:evenVBand="0" w:oddHBand="0" w:evenHBand="0" w:firstRowFirstColumn="0" w:firstRowLastColumn="0" w:lastRowFirstColumn="0" w:lastRowLastColumn="0"/>
+              <w:rPr>
+                <w:lang w:val="es-ES"/>
+              </w:rPr>
+            </w:pPr>
+            <w:r>
+              <w:rPr>
+                <w:lang w:val="es-ES"/>
+              </w:rPr>
+              <w:t>Completar nivel</w:t>
+            </w:r>
+          </w:p>
+        </w:tc>
+      </w:tr>
+      <w:tr>
+        <w:tc>
+          <w:tcPr>
+            <w:cnfStyle w:val="001000000000" w:firstRow="0" w:lastRow="0" w:firstColumn="1" w:lastColumn="0" w:oddVBand="0" w:evenVBand="0" w:oddHBand="0" w:evenHBand="0" w:firstRowFirstColumn="0" w:firstRowLastColumn="0" w:lastRowFirstColumn="0" w:lastRowLastColumn="0"/>
+            <w:tcW w:w="2830" w:type="dxa"/>
+          </w:tcPr>
+          <w:p>
+            <w:proofErr w:type="spellStart"/>
+            <w:r>
+              <w:t>Versión</w:t>
+            </w:r>
+            <w:proofErr w:type="spellEnd"/>
+          </w:p>
+        </w:tc>
+        <w:tc>
+          <w:tcPr>
+            <w:tcW w:w="6520" w:type="dxa"/>
+            <w:gridSpan w:val="3"/>
+          </w:tcPr>
+          <w:p>
+            <w:pPr>
+              <w:cnfStyle w:val="000000000000" w:firstRow="0" w:lastRow="0" w:firstColumn="0" w:lastColumn="0" w:oddVBand="0" w:evenVBand="0" w:oddHBand="0" w:evenHBand="0" w:firstRowFirstColumn="0" w:firstRowLastColumn="0" w:lastRowFirstColumn="0" w:lastRowLastColumn="0"/>
+            </w:pPr>
+            <w:r>
+              <w:t>1.0</w:t>
+            </w:r>
+          </w:p>
+        </w:tc>
+      </w:tr>
+      <w:tr>
+        <w:tc>
+          <w:tcPr>
+            <w:cnfStyle w:val="001000000000" w:firstRow="0" w:lastRow="0" w:firstColumn="1" w:lastColumn="0" w:oddVBand="0" w:evenVBand="0" w:oddHBand="0" w:evenHBand="0" w:firstRowFirstColumn="0" w:firstRowLastColumn="0" w:lastRowFirstColumn="0" w:lastRowLastColumn="0"/>
+            <w:tcW w:w="2830" w:type="dxa"/>
+          </w:tcPr>
+          <w:p>
+            <w:proofErr w:type="spellStart"/>
+            <w:r>
+              <w:t>Autores</w:t>
+            </w:r>
+            <w:proofErr w:type="spellEnd"/>
+          </w:p>
+        </w:tc>
+        <w:tc>
+          <w:tcPr>
+            <w:tcW w:w="6520" w:type="dxa"/>
+            <w:gridSpan w:val="3"/>
+          </w:tcPr>
+          <w:p>
+            <w:pPr>
+              <w:cnfStyle w:val="000000000000" w:firstRow="0" w:lastRow="0" w:firstColumn="0" w:lastColumn="0" w:oddVBand="0" w:evenVBand="0" w:oddHBand="0" w:evenHBand="0" w:firstRowFirstColumn="0" w:firstRowLastColumn="0" w:lastRowFirstColumn="0" w:lastRowLastColumn="0"/>
+            </w:pPr>
+            <w:r>
+              <w:t xml:space="preserve">Ángel </w:t>
+            </w:r>
+            <w:proofErr w:type="spellStart"/>
+            <w:r>
+              <w:t>Torijano</w:t>
+            </w:r>
+            <w:proofErr w:type="spellEnd"/>
+            <w:r>
+              <w:t xml:space="preserve"> </w:t>
+            </w:r>
+            <w:proofErr w:type="spellStart"/>
+            <w:r>
+              <w:t>Sexmero</w:t>
+            </w:r>
+            <w:proofErr w:type="spellEnd"/>
+          </w:p>
+        </w:tc>
+      </w:tr>
+      <w:tr>
+        <w:tc>
+          <w:tcPr>
+            <w:cnfStyle w:val="001000000000" w:firstRow="0" w:lastRow="0" w:firstColumn="1" w:lastColumn="0" w:oddVBand="0" w:evenVBand="0" w:oddHBand="0" w:evenHBand="0" w:firstRowFirstColumn="0" w:firstRowLastColumn="0" w:lastRowFirstColumn="0" w:lastRowLastColumn="0"/>
+            <w:tcW w:w="2830" w:type="dxa"/>
+          </w:tcPr>
+          <w:p>
+            <w:r>
+              <w:t>Fuentes</w:t>
+            </w:r>
+          </w:p>
+        </w:tc>
+        <w:tc>
+          <w:tcPr>
+            <w:tcW w:w="6520" w:type="dxa"/>
+            <w:gridSpan w:val="3"/>
+          </w:tcPr>
+          <w:p>
+            <w:pPr>
+              <w:cnfStyle w:val="000000000000" w:firstRow="0" w:lastRow="0" w:firstColumn="0" w:lastColumn="0" w:oddVBand="0" w:evenVBand="0" w:oddHBand="0" w:evenHBand="0" w:firstRowFirstColumn="0" w:firstRowLastColumn="0" w:lastRowFirstColumn="0" w:lastRowLastColumn="0"/>
+            </w:pPr>
+            <w:r>
+              <w:t>Guillermo Hernández González</w:t>
+            </w:r>
+          </w:p>
+        </w:tc>
+      </w:tr>
+      <w:tr>
+        <w:tc>
+          <w:tcPr>
+            <w:cnfStyle w:val="001000000000" w:firstRow="0" w:lastRow="0" w:firstColumn="1" w:lastColumn="0" w:oddVBand="0" w:evenVBand="0" w:oddHBand="0" w:evenHBand="0" w:firstRowFirstColumn="0" w:firstRowLastColumn="0" w:lastRowFirstColumn="0" w:lastRowLastColumn="0"/>
+            <w:tcW w:w="2830" w:type="dxa"/>
+          </w:tcPr>
+          <w:p>
+            <w:proofErr w:type="spellStart"/>
+            <w:r>
+              <w:t>Objetivos</w:t>
+            </w:r>
+            <w:proofErr w:type="spellEnd"/>
+            <w:r>
+              <w:t xml:space="preserve"> </w:t>
+            </w:r>
+            <w:proofErr w:type="spellStart"/>
+            <w:r>
+              <w:t>Asociados</w:t>
+            </w:r>
+            <w:proofErr w:type="spellEnd"/>
+          </w:p>
+        </w:tc>
+        <w:tc>
+          <w:tcPr>
+            <w:tcW w:w="6520" w:type="dxa"/>
+            <w:gridSpan w:val="3"/>
+          </w:tcPr>
+          <w:p>
+            <w:pPr>
+              <w:pStyle w:val="Prrafodelista"/>
+              <w:numPr>
+                <w:ilvl w:val="0"/>
+                <w:numId w:val="5"/>
+              </w:numPr>
+              <w:cnfStyle w:val="000000000000" w:firstRow="0" w:lastRow="0" w:firstColumn="0" w:lastColumn="0" w:oddVBand="0" w:evenVBand="0" w:oddHBand="0" w:evenHBand="0" w:firstRowFirstColumn="0" w:firstRowLastColumn="0" w:lastRowFirstColumn="0" w:lastRowLastColumn="0"/>
+              <w:rPr>
+                <w:lang w:val="es-ES"/>
+              </w:rPr>
+            </w:pPr>
+            <w:r>
+              <w:rPr>
+                <w:lang w:val="es-ES"/>
+              </w:rPr>
+              <w:t xml:space="preserve">OBJ-01: </w:t>
+            </w:r>
+            <w:r>
+              <w:rPr>
+                <w:lang w:val="es-ES"/>
+              </w:rPr>
+              <w:t>Desarrollo de la base del videojuego</w:t>
+            </w:r>
+          </w:p>
+          <w:p>
+            <w:pPr>
+              <w:pStyle w:val="Prrafodelista"/>
+              <w:numPr>
+                <w:ilvl w:val="0"/>
+                <w:numId w:val="5"/>
+              </w:numPr>
+              <w:cnfStyle w:val="000000000000" w:firstRow="0" w:lastRow="0" w:firstColumn="0" w:lastColumn="0" w:oddVBand="0" w:evenVBand="0" w:oddHBand="0" w:evenHBand="0" w:firstRowFirstColumn="0" w:firstRowLastColumn="0" w:lastRowFirstColumn="0" w:lastRowLastColumn="0"/>
+              <w:rPr>
+                <w:lang w:val="es-ES"/>
+              </w:rPr>
+            </w:pPr>
+            <w:r>
+              <w:rPr>
+                <w:lang w:val="es-ES"/>
+              </w:rPr>
+              <w:t xml:space="preserve">OBJ-04: </w:t>
+            </w:r>
+            <w:r>
+              <w:rPr>
+                <w:lang w:val="es-ES"/>
+              </w:rPr>
+              <w:t>G</w:t>
+            </w:r>
+            <w:r>
+              <w:rPr>
+                <w:lang w:val="es-ES"/>
+              </w:rPr>
+              <w:t>estión de puntuaciones</w:t>
+            </w:r>
+          </w:p>
+        </w:tc>
+      </w:tr>
+      <w:tr>
+        <w:tc>
+          <w:tcPr>
+            <w:cnfStyle w:val="001000000000" w:firstRow="0" w:lastRow="0" w:firstColumn="1" w:lastColumn="0" w:oddVBand="0" w:evenVBand="0" w:oddHBand="0" w:evenHBand="0" w:firstRowFirstColumn="0" w:firstRowLastColumn="0" w:lastRowFirstColumn="0" w:lastRowLastColumn="0"/>
+            <w:tcW w:w="2830" w:type="dxa"/>
+          </w:tcPr>
+          <w:p>
+            <w:proofErr w:type="spellStart"/>
+            <w:r>
+              <w:t>Requisitos</w:t>
+            </w:r>
+            <w:proofErr w:type="spellEnd"/>
+            <w:r>
+              <w:t xml:space="preserve"> </w:t>
+            </w:r>
+            <w:proofErr w:type="spellStart"/>
+            <w:r>
+              <w:t>Asociados</w:t>
+            </w:r>
+            <w:proofErr w:type="spellEnd"/>
+          </w:p>
+        </w:tc>
+        <w:tc>
+          <w:tcPr>
+            <w:tcW w:w="6520" w:type="dxa"/>
+            <w:gridSpan w:val="3"/>
+          </w:tcPr>
+          <w:p>
+            <w:pPr>
+              <w:pStyle w:val="Prrafodelista"/>
+              <w:numPr>
+                <w:ilvl w:val="0"/>
+                <w:numId w:val="5"/>
+              </w:numPr>
+              <w:cnfStyle w:val="000000000000" w:firstRow="0" w:lastRow="0" w:firstColumn="0" w:lastColumn="0" w:oddVBand="0" w:evenVBand="0" w:oddHBand="0" w:evenHBand="0" w:firstRowFirstColumn="0" w:firstRowLastColumn="0" w:lastRowFirstColumn="0" w:lastRowLastColumn="0"/>
+            </w:pPr>
+            <w:r>
+              <w:t xml:space="preserve">IRQ-01: </w:t>
+            </w:r>
+            <w:proofErr w:type="spellStart"/>
+            <w:r>
+              <w:t>Información</w:t>
+            </w:r>
+            <w:proofErr w:type="spellEnd"/>
+            <w:r>
+              <w:t xml:space="preserve"> de </w:t>
+            </w:r>
+            <w:proofErr w:type="spellStart"/>
+            <w:r>
+              <w:t>puntuaciones</w:t>
+            </w:r>
+            <w:proofErr w:type="spellEnd"/>
+          </w:p>
+          <w:p>
+            <w:pPr>
+              <w:pStyle w:val="Prrafodelista"/>
+              <w:numPr>
+                <w:ilvl w:val="0"/>
+                <w:numId w:val="5"/>
+              </w:numPr>
+              <w:cnfStyle w:val="000000000000" w:firstRow="0" w:lastRow="0" w:firstColumn="0" w:lastColumn="0" w:oddVBand="0" w:evenVBand="0" w:oddHBand="0" w:evenHBand="0" w:firstRowFirstColumn="0" w:firstRowLastColumn="0" w:lastRowFirstColumn="0" w:lastRowLastColumn="0"/>
+            </w:pPr>
+            <w:r>
+              <w:t xml:space="preserve">CRQ-02: </w:t>
+            </w:r>
+            <w:proofErr w:type="spellStart"/>
+            <w:r>
+              <w:t>Diseño</w:t>
+            </w:r>
+            <w:proofErr w:type="spellEnd"/>
+            <w:r>
+              <w:t xml:space="preserve"> de interfaces </w:t>
+            </w:r>
+            <w:proofErr w:type="spellStart"/>
+            <w:r>
+              <w:t>interactivas</w:t>
+            </w:r>
+            <w:proofErr w:type="spellEnd"/>
+          </w:p>
+          <w:p>
+            <w:pPr>
+              <w:pStyle w:val="Prrafodelista"/>
+              <w:numPr>
+                <w:ilvl w:val="0"/>
+                <w:numId w:val="5"/>
+              </w:numPr>
+              <w:cnfStyle w:val="000000000000" w:firstRow="0" w:lastRow="0" w:firstColumn="0" w:lastColumn="0" w:oddVBand="0" w:evenVBand="0" w:oddHBand="0" w:evenHBand="0" w:firstRowFirstColumn="0" w:firstRowLastColumn="0" w:lastRowFirstColumn="0" w:lastRowLastColumn="0"/>
+            </w:pPr>
+            <w:r>
+              <w:lastRenderedPageBreak/>
+              <w:t xml:space="preserve">CRQ-03: </w:t>
+            </w:r>
+            <w:proofErr w:type="spellStart"/>
+            <w:r>
+              <w:t>Diseño</w:t>
+            </w:r>
+            <w:proofErr w:type="spellEnd"/>
+            <w:r>
+              <w:t xml:space="preserve"> de </w:t>
+            </w:r>
+            <w:proofErr w:type="spellStart"/>
+            <w:r>
+              <w:t>nivel</w:t>
+            </w:r>
+            <w:proofErr w:type="spellEnd"/>
+            <w:r>
+              <w:t xml:space="preserve"> </w:t>
+            </w:r>
+            <w:proofErr w:type="spellStart"/>
+            <w:r>
+              <w:t>interactivo</w:t>
+            </w:r>
+            <w:proofErr w:type="spellEnd"/>
+          </w:p>
+          <w:p>
+            <w:pPr>
+              <w:pStyle w:val="Prrafodelista"/>
+              <w:numPr>
+                <w:ilvl w:val="0"/>
+                <w:numId w:val="5"/>
+              </w:numPr>
+              <w:cnfStyle w:val="000000000000" w:firstRow="0" w:lastRow="0" w:firstColumn="0" w:lastColumn="0" w:oddVBand="0" w:evenVBand="0" w:oddHBand="0" w:evenHBand="0" w:firstRowFirstColumn="0" w:firstRowLastColumn="0" w:lastRowFirstColumn="0" w:lastRowLastColumn="0"/>
+            </w:pPr>
+            <w:r>
+              <w:t xml:space="preserve">UC-17: </w:t>
+            </w:r>
+            <w:proofErr w:type="spellStart"/>
+            <w:r>
+              <w:t>Jugar</w:t>
+            </w:r>
+            <w:proofErr w:type="spellEnd"/>
+            <w:r>
+              <w:t xml:space="preserve"> </w:t>
+            </w:r>
+            <w:proofErr w:type="spellStart"/>
+            <w:r>
+              <w:t>el</w:t>
+            </w:r>
+            <w:proofErr w:type="spellEnd"/>
+            <w:r>
+              <w:t xml:space="preserve"> </w:t>
+            </w:r>
+            <w:proofErr w:type="spellStart"/>
+            <w:r>
+              <w:t>nivel</w:t>
+            </w:r>
+            <w:proofErr w:type="spellEnd"/>
+          </w:p>
+          <w:p>
+            <w:pPr>
+              <w:pStyle w:val="Prrafodelista"/>
+              <w:numPr>
+                <w:ilvl w:val="0"/>
+                <w:numId w:val="5"/>
+              </w:numPr>
+              <w:cnfStyle w:val="000000000000" w:firstRow="0" w:lastRow="0" w:firstColumn="0" w:lastColumn="0" w:oddVBand="0" w:evenVBand="0" w:oddHBand="0" w:evenHBand="0" w:firstRowFirstColumn="0" w:firstRowLastColumn="0" w:lastRowFirstColumn="0" w:lastRowLastColumn="0"/>
+            </w:pPr>
+            <w:r>
+              <w:t xml:space="preserve">UC-18: </w:t>
+            </w:r>
+            <w:proofErr w:type="spellStart"/>
+            <w:r>
+              <w:t>Eliminación</w:t>
+            </w:r>
+            <w:proofErr w:type="spellEnd"/>
+            <w:r>
+              <w:t xml:space="preserve"> de </w:t>
+            </w:r>
+            <w:proofErr w:type="spellStart"/>
+            <w:r>
+              <w:t>datos</w:t>
+            </w:r>
+            <w:proofErr w:type="spellEnd"/>
+          </w:p>
+        </w:tc>
+      </w:tr>
+      <w:tr>
+        <w:tc>
+          <w:tcPr>
+            <w:cnfStyle w:val="001000000000" w:firstRow="0" w:lastRow="0" w:firstColumn="1" w:lastColumn="0" w:oddVBand="0" w:evenVBand="0" w:oddHBand="0" w:evenHBand="0" w:firstRowFirstColumn="0" w:firstRowLastColumn="0" w:lastRowFirstColumn="0" w:lastRowLastColumn="0"/>
+            <w:tcW w:w="2830" w:type="dxa"/>
+          </w:tcPr>
+          <w:p>
+            <w:proofErr w:type="spellStart"/>
+            <w:r>
+              <w:lastRenderedPageBreak/>
+              <w:t>Descripción</w:t>
+            </w:r>
+            <w:proofErr w:type="spellEnd"/>
+          </w:p>
+        </w:tc>
+        <w:tc>
+          <w:tcPr>
+            <w:tcW w:w="6520" w:type="dxa"/>
+            <w:gridSpan w:val="3"/>
+          </w:tcPr>
+          <w:p>
+            <w:pPr>
+              <w:cnfStyle w:val="000000000000" w:firstRow="0" w:lastRow="0" w:firstColumn="0" w:lastColumn="0" w:oddVBand="0" w:evenVBand="0" w:oddHBand="0" w:evenHBand="0" w:firstRowFirstColumn="0" w:firstRowLastColumn="0" w:lastRowFirstColumn="0" w:lastRowLastColumn="0"/>
+              <w:rPr>
+                <w:lang w:val="es-ES"/>
+              </w:rPr>
+            </w:pPr>
+            <w:r>
+              <w:rPr>
+                <w:lang w:val="es-ES"/>
+              </w:rPr>
+              <w:t>El Sistema deberá comportarse t</w:t>
+            </w:r>
+            <w:r>
+              <w:rPr>
+                <w:lang w:val="es-ES"/>
+              </w:rPr>
+              <w:t>al y como se describe a continuación cuando el jugador interactúe con la meta del nivel</w:t>
+            </w:r>
+          </w:p>
+        </w:tc>
+      </w:tr>
+      <w:tr>
+        <w:tc>
+          <w:tcPr>
+            <w:cnfStyle w:val="001000000000" w:firstRow="0" w:lastRow="0" w:firstColumn="1" w:lastColumn="0" w:oddVBand="0" w:evenVBand="0" w:oddHBand="0" w:evenHBand="0" w:firstRowFirstColumn="0" w:firstRowLastColumn="0" w:lastRowFirstColumn="0" w:lastRowLastColumn="0"/>
+            <w:tcW w:w="2830" w:type="dxa"/>
+          </w:tcPr>
+          <w:p>
+            <w:proofErr w:type="spellStart"/>
+            <w:r>
+              <w:t>Precondici</w:t>
+            </w:r>
+            <w:r>
+              <w:t>ó</w:t>
+            </w:r>
+            <w:r>
+              <w:t>n</w:t>
+            </w:r>
+            <w:proofErr w:type="spellEnd"/>
+          </w:p>
+        </w:tc>
+        <w:tc>
+          <w:tcPr>
+            <w:tcW w:w="6520" w:type="dxa"/>
+            <w:gridSpan w:val="3"/>
+          </w:tcPr>
+          <w:p>
+            <w:pPr>
+              <w:cnfStyle w:val="000000000000" w:firstRow="0" w:lastRow="0" w:firstColumn="0" w:lastColumn="0" w:oddVBand="0" w:evenVBand="0" w:oddHBand="0" w:evenHBand="0" w:firstRowFirstColumn="0" w:firstRowLastColumn="0" w:lastRowFirstColumn="0" w:lastRowLastColumn="0"/>
+              <w:rPr>
+                <w:lang w:val="es-ES"/>
+              </w:rPr>
+            </w:pPr>
+            <w:r>
+              <w:rPr>
+                <w:lang w:val="es-ES"/>
+              </w:rPr>
+              <w:t>El Jugador debe estar e</w:t>
+            </w:r>
+            <w:r>
+              <w:rPr>
+                <w:lang w:val="es-ES"/>
+              </w:rPr>
+              <w:t>n el nivel manejando a Baqueta y tiene que entrar en colisión con la meta.</w:t>
+            </w:r>
+          </w:p>
+        </w:tc>
+      </w:tr>
+      <w:tr>
+        <w:trPr>
+          <w:trHeight w:val="160"/>
+        </w:trPr>
+        <w:tc>
+          <w:tcPr>
+            <w:cnfStyle w:val="001000000000" w:firstRow="0" w:lastRow="0" w:firstColumn="1" w:lastColumn="0" w:oddVBand="0" w:evenVBand="0" w:oddHBand="0" w:evenHBand="0" w:firstRowFirstColumn="0" w:firstRowLastColumn="0" w:lastRowFirstColumn="0" w:lastRowLastColumn="0"/>
+            <w:tcW w:w="2830" w:type="dxa"/>
+            <w:vMerge w:val="restart"/>
+          </w:tcPr>
+          <w:p>
+            <w:proofErr w:type="spellStart"/>
+            <w:r>
+              <w:t>Secuencia</w:t>
+            </w:r>
+            <w:proofErr w:type="spellEnd"/>
+          </w:p>
+        </w:tc>
+        <w:tc>
+          <w:tcPr>
+            <w:tcW w:w="1418" w:type="dxa"/>
+          </w:tcPr>
+          <w:p>
+            <w:pPr>
+              <w:jc w:val="center"/>
+              <w:cnfStyle w:val="000000000000" w:firstRow="0" w:lastRow="0" w:firstColumn="0" w:lastColumn="0" w:oddVBand="0" w:evenVBand="0" w:oddHBand="0" w:evenHBand="0" w:firstRowFirstColumn="0" w:firstRowLastColumn="0" w:lastRowFirstColumn="0" w:lastRowLastColumn="0"/>
+              <w:rPr>
+                <w:b/>
+                <w:bCs/>
+              </w:rPr>
+            </w:pPr>
+            <w:r>
+              <w:rPr>
+                <w:b/>
+                <w:bCs/>
+              </w:rPr>
+              <w:t>Paso</w:t>
+            </w:r>
+          </w:p>
+        </w:tc>
+        <w:tc>
+          <w:tcPr>
+            <w:tcW w:w="5102" w:type="dxa"/>
+            <w:gridSpan w:val="2"/>
+          </w:tcPr>
+          <w:p>
+            <w:pPr>
+              <w:cnfStyle w:val="000000000000" w:firstRow="0" w:lastRow="0" w:firstColumn="0" w:lastColumn="0" w:oddVBand="0" w:evenVBand="0" w:oddHBand="0" w:evenHBand="0" w:firstRowFirstColumn="0" w:firstRowLastColumn="0" w:lastRowFirstColumn="0" w:lastRowLastColumn="0"/>
+              <w:rPr>
+                <w:b/>
+                <w:bCs/>
+              </w:rPr>
+            </w:pPr>
+            <w:proofErr w:type="spellStart"/>
+            <w:r>
+              <w:rPr>
+                <w:b/>
+                <w:bCs/>
+              </w:rPr>
+              <w:t>Acción</w:t>
+            </w:r>
+            <w:proofErr w:type="spellEnd"/>
+          </w:p>
+        </w:tc>
+      </w:tr>
+      <w:tr>
+        <w:trPr>
+          <w:trHeight w:val="54"/>
+        </w:trPr>
+        <w:tc>
+          <w:tcPr>
+            <w:cnfStyle w:val="001000000000" w:firstRow="0" w:lastRow="0" w:firstColumn="1" w:lastColumn="0" w:oddVBand="0" w:evenVBand="0" w:oddHBand="0" w:evenHBand="0" w:firstRowFirstColumn="0" w:firstRowLastColumn="0" w:lastRowFirstColumn="0" w:lastRowLastColumn="0"/>
+            <w:tcW w:w="2830" w:type="dxa"/>
+            <w:vMerge/>
+          </w:tcPr>
+          <w:p/>
+        </w:tc>
+        <w:tc>
+          <w:tcPr>
+            <w:tcW w:w="1418" w:type="dxa"/>
+          </w:tcPr>
+          <w:p>
+            <w:pPr>
+              <w:jc w:val="center"/>
+              <w:cnfStyle w:val="000000000000" w:firstRow="0" w:lastRow="0" w:firstColumn="0" w:lastColumn="0" w:oddVBand="0" w:evenVBand="0" w:oddHBand="0" w:evenHBand="0" w:firstRowFirstColumn="0" w:firstRowLastColumn="0" w:lastRowFirstColumn="0" w:lastRowLastColumn="0"/>
+            </w:pPr>
+            <w:r>
+              <w:t>1</w:t>
+            </w:r>
+          </w:p>
+        </w:tc>
+        <w:tc>
+          <w:tcPr>
+            <w:tcW w:w="5102" w:type="dxa"/>
+            <w:gridSpan w:val="2"/>
+          </w:tcPr>
+          <w:p>
+            <w:pPr>
+              <w:cnfStyle w:val="000000000000" w:firstRow="0" w:lastRow="0" w:firstColumn="0" w:lastColumn="0" w:oddVBand="0" w:evenVBand="0" w:oddHBand="0" w:evenHBand="0" w:firstRowFirstColumn="0" w:firstRowLastColumn="0" w:lastRowFirstColumn="0" w:lastRowLastColumn="0"/>
+              <w:rPr>
+                <w:lang w:val="es-ES"/>
+              </w:rPr>
+            </w:pPr>
+            <w:r>
+              <w:rPr>
+                <w:lang w:val="es-ES"/>
+              </w:rPr>
+              <w:t xml:space="preserve">El jugador </w:t>
+            </w:r>
+            <w:r>
+              <w:rPr>
+                <w:lang w:val="es-ES"/>
+              </w:rPr>
+              <w:t>colisiona con el objeto.</w:t>
+            </w:r>
+          </w:p>
+        </w:tc>
+      </w:tr>
+      <w:tr>
+        <w:trPr>
+          <w:trHeight w:val="325"/>
+        </w:trPr>
+        <w:tc>
+          <w:tcPr>
+            <w:cnfStyle w:val="001000000000" w:firstRow="0" w:lastRow="0" w:firstColumn="1" w:lastColumn="0" w:oddVBand="0" w:evenVBand="0" w:oddHBand="0" w:evenHBand="0" w:firstRowFirstColumn="0" w:firstRowLastColumn="0" w:lastRowFirstColumn="0" w:lastRowLastColumn="0"/>
+            <w:tcW w:w="2830" w:type="dxa"/>
+            <w:vMerge/>
+          </w:tcPr>
+          <w:p>
+            <w:pPr>
+              <w:rPr>
+                <w:lang w:val="es-ES"/>
+              </w:rPr>
+            </w:pPr>
+          </w:p>
+        </w:tc>
+        <w:tc>
+          <w:tcPr>
+            <w:tcW w:w="1418" w:type="dxa"/>
+          </w:tcPr>
+          <w:p>
+            <w:pPr>
+              <w:jc w:val="center"/>
+              <w:cnfStyle w:val="000000000000" w:firstRow="0" w:lastRow="0" w:firstColumn="0" w:lastColumn="0" w:oddVBand="0" w:evenVBand="0" w:oddHBand="0" w:evenHBand="0" w:firstRowFirstColumn="0" w:firstRowLastColumn="0" w:lastRowFirstColumn="0" w:lastRowLastColumn="0"/>
+            </w:pPr>
+            <w:r>
+              <w:t>2</w:t>
+            </w:r>
+          </w:p>
+        </w:tc>
+        <w:tc>
+          <w:tcPr>
+            <w:tcW w:w="5102" w:type="dxa"/>
+            <w:gridSpan w:val="2"/>
+          </w:tcPr>
+          <w:p>
+            <w:pPr>
+              <w:cnfStyle w:val="000000000000" w:firstRow="0" w:lastRow="0" w:firstColumn="0" w:lastColumn="0" w:oddVBand="0" w:evenVBand="0" w:oddHBand="0" w:evenHBand="0" w:firstRowFirstColumn="0" w:firstRowLastColumn="0" w:lastRowFirstColumn="0" w:lastRowLastColumn="0"/>
+              <w:rPr>
+                <w:lang w:val="es-ES"/>
+              </w:rPr>
+            </w:pPr>
+            <w:r>
+              <w:rPr>
+                <w:lang w:val="es-ES"/>
+              </w:rPr>
+              <w:t>El sistema</w:t>
+            </w:r>
+            <w:r>
+              <w:rPr>
+                <w:lang w:val="es-ES"/>
+              </w:rPr>
+              <w:t xml:space="preserve"> muestra pruebas visuales y sonoras de que se ha alcanzado la meta. EL sistema calculará la puntuación total del nivel y mostrará la pantalla de victoria.</w:t>
+            </w:r>
+          </w:p>
+        </w:tc>
+      </w:tr>
+      <w:tr>
+        <w:trPr>
+          <w:trHeight w:val="325"/>
+        </w:trPr>
+        <w:tc>
+          <w:tcPr>
+            <w:cnfStyle w:val="001000000000" w:firstRow="0" w:lastRow="0" w:firstColumn="1" w:lastColumn="0" w:oddVBand="0" w:evenVBand="0" w:oddHBand="0" w:evenHBand="0" w:firstRowFirstColumn="0" w:firstRowLastColumn="0" w:lastRowFirstColumn="0" w:lastRowLastColumn="0"/>
+            <w:tcW w:w="2830" w:type="dxa"/>
+            <w:vMerge/>
+          </w:tcPr>
+          <w:p>
+            <w:pPr>
+              <w:rPr>
+                <w:lang w:val="es-ES"/>
+              </w:rPr>
+            </w:pPr>
+          </w:p>
+        </w:tc>
+        <w:tc>
+          <w:tcPr>
+            <w:tcW w:w="1418" w:type="dxa"/>
+          </w:tcPr>
+          <w:p>
+            <w:pPr>
+              <w:jc w:val="center"/>
+              <w:cnfStyle w:val="000000000000" w:firstRow="0" w:lastRow="0" w:firstColumn="0" w:lastColumn="0" w:oddVBand="0" w:evenVBand="0" w:oddHBand="0" w:evenHBand="0" w:firstRowFirstColumn="0" w:firstRowLastColumn="0" w:lastRowFirstColumn="0" w:lastRowLastColumn="0"/>
+            </w:pPr>
+            <w:r>
+              <w:t>3</w:t>
+            </w:r>
+          </w:p>
+        </w:tc>
+        <w:tc>
+          <w:tcPr>
+            <w:tcW w:w="5102" w:type="dxa"/>
+            <w:gridSpan w:val="2"/>
+          </w:tcPr>
+          <w:p>
+            <w:pPr>
+              <w:cnfStyle w:val="000000000000" w:firstRow="0" w:lastRow="0" w:firstColumn="0" w:lastColumn="0" w:oddVBand="0" w:evenVBand="0" w:oddHBand="0" w:evenHBand="0" w:firstRowFirstColumn="0" w:firstRowLastColumn="0" w:lastRowFirstColumn="0" w:lastRowLastColumn="0"/>
+              <w:rPr>
+                <w:lang w:val="es-ES"/>
+              </w:rPr>
+            </w:pPr>
+            <w:r>
+              <w:rPr>
+                <w:lang w:val="es-ES"/>
+              </w:rPr>
+              <w:t>El jugador ya no tendrá control sobre el avatar. Seleccionará entonces salir del nivel mediante los menús.</w:t>
+            </w:r>
+          </w:p>
+        </w:tc>
+      </w:tr>
+      <w:tr>
+        <w:trPr>
+          <w:trHeight w:val="325"/>
+        </w:trPr>
+        <w:tc>
+          <w:tcPr>
+            <w:cnfStyle w:val="001000000000" w:firstRow="0" w:lastRow="0" w:firstColumn="1" w:lastColumn="0" w:oddVBand="0" w:evenVBand="0" w:oddHBand="0" w:evenHBand="0" w:firstRowFirstColumn="0" w:firstRowLastColumn="0" w:lastRowFirstColumn="0" w:lastRowLastColumn="0"/>
+            <w:tcW w:w="2830" w:type="dxa"/>
+            <w:vMerge/>
+          </w:tcPr>
+          <w:p>
+            <w:pPr>
+              <w:rPr>
+                <w:lang w:val="es-ES"/>
+              </w:rPr>
+            </w:pPr>
+          </w:p>
+        </w:tc>
+        <w:tc>
+          <w:tcPr>
+            <w:tcW w:w="1418" w:type="dxa"/>
+          </w:tcPr>
+          <w:p>
+            <w:pPr>
+              <w:jc w:val="center"/>
+              <w:cnfStyle w:val="000000000000" w:firstRow="0" w:lastRow="0" w:firstColumn="0" w:lastColumn="0" w:oddVBand="0" w:evenVBand="0" w:oddHBand="0" w:evenHBand="0" w:firstRowFirstColumn="0" w:firstRowLastColumn="0" w:lastRowFirstColumn="0" w:lastRowLastColumn="0"/>
+            </w:pPr>
+            <w:r>
+              <w:t>4</w:t>
+            </w:r>
+          </w:p>
+        </w:tc>
+        <w:tc>
+          <w:tcPr>
+            <w:tcW w:w="5102" w:type="dxa"/>
+            <w:gridSpan w:val="2"/>
+          </w:tcPr>
+          <w:p>
+            <w:pPr>
+              <w:cnfStyle w:val="000000000000" w:firstRow="0" w:lastRow="0" w:firstColumn="0" w:lastColumn="0" w:oddVBand="0" w:evenVBand="0" w:oddHBand="0" w:evenHBand="0" w:firstRowFirstColumn="0" w:firstRowLastColumn="0" w:lastRowFirstColumn="0" w:lastRowLastColumn="0"/>
+              <w:rPr>
+                <w:lang w:val="es-ES"/>
+              </w:rPr>
+            </w:pPr>
+            <w:r>
+              <w:rPr>
+                <w:lang w:val="es-ES"/>
+              </w:rPr>
+              <w:t>El sistema enviará al jugador a la pantalla principal del juego, mostrando la puntuación y coleccionables obtenidos en el nivel.</w:t>
+            </w:r>
+          </w:p>
+        </w:tc>
+      </w:tr>
+      <w:tr>
+        <w:tc>
+          <w:tcPr>
+            <w:cnfStyle w:val="001000000000" w:firstRow="0" w:lastRow="0" w:firstColumn="1" w:lastColumn="0" w:oddVBand="0" w:evenVBand="0" w:oddHBand="0" w:evenHBand="0" w:firstRowFirstColumn="0" w:firstRowLastColumn="0" w:lastRowFirstColumn="0" w:lastRowLastColumn="0"/>
+            <w:tcW w:w="2830" w:type="dxa"/>
+          </w:tcPr>
+          <w:p>
+            <w:proofErr w:type="spellStart"/>
+            <w:r>
+              <w:t>Postcondición</w:t>
+            </w:r>
+            <w:proofErr w:type="spellEnd"/>
+          </w:p>
+        </w:tc>
+        <w:tc>
+          <w:tcPr>
+            <w:tcW w:w="6520" w:type="dxa"/>
+            <w:gridSpan w:val="3"/>
+          </w:tcPr>
+          <w:p>
+            <w:pPr>
+              <w:cnfStyle w:val="000000000000" w:firstRow="0" w:lastRow="0" w:firstColumn="0" w:lastColumn="0" w:oddVBand="0" w:evenVBand="0" w:oddHBand="0" w:evenHBand="0" w:firstRowFirstColumn="0" w:firstRowLastColumn="0" w:lastRowFirstColumn="0" w:lastRowLastColumn="0"/>
+              <w:rPr>
+                <w:lang w:val="es-ES"/>
+              </w:rPr>
+            </w:pPr>
+            <w:r>
+              <w:rPr>
+                <w:lang w:val="es-ES"/>
+              </w:rPr>
+              <w:t>El jugador habrá completado el nivel y su puntuación se guardará (UC-16).</w:t>
+            </w:r>
+          </w:p>
+        </w:tc>
+      </w:tr>
+      <w:tr>
+        <w:trPr>
+          <w:trHeight w:val="160"/>
+        </w:trPr>
+        <w:tc>
+          <w:tcPr>
+            <w:cnfStyle w:val="001000000000" w:firstRow="0" w:lastRow="0" w:firstColumn="1" w:lastColumn="0" w:oddVBand="0" w:evenVBand="0" w:oddHBand="0" w:evenHBand="0" w:firstRowFirstColumn="0" w:firstRowLastColumn="0" w:lastRowFirstColumn="0" w:lastRowLastColumn="0"/>
+            <w:tcW w:w="2830" w:type="dxa"/>
+            <w:vMerge w:val="restart"/>
+          </w:tcPr>
+          <w:p>
+            <w:proofErr w:type="spellStart"/>
+            <w:r>
+              <w:t>Excepciones</w:t>
+            </w:r>
+            <w:proofErr w:type="spellEnd"/>
+          </w:p>
+        </w:tc>
+        <w:tc>
+          <w:tcPr>
+            <w:tcW w:w="1560" w:type="dxa"/>
+            <w:gridSpan w:val="2"/>
+          </w:tcPr>
+          <w:p>
+            <w:pPr>
+              <w:jc w:val="center"/>
+              <w:cnfStyle w:val="000000000000" w:firstRow="0" w:lastRow="0" w:firstColumn="0" w:lastColumn="0" w:oddVBand="0" w:evenVBand="0" w:oddHBand="0" w:evenHBand="0" w:firstRowFirstColumn="0" w:firstRowLastColumn="0" w:lastRowFirstColumn="0" w:lastRowLastColumn="0"/>
+            </w:pPr>
+            <w:r>
+              <w:rPr>
+                <w:b/>
+                <w:bCs/>
+              </w:rPr>
+              <w:t>Paso</w:t>
+            </w:r>
+          </w:p>
+        </w:tc>
+        <w:tc>
+          <w:tcPr>
+            <w:tcW w:w="4960" w:type="dxa"/>
+          </w:tcPr>
+          <w:p>
+            <w:pPr>
+              <w:cnfStyle w:val="000000000000" w:firstRow="0" w:lastRow="0" w:firstColumn="0" w:lastColumn="0" w:oddVBand="0" w:evenVBand="0" w:oddHBand="0" w:evenHBand="0" w:firstRowFirstColumn="0" w:firstRowLastColumn="0" w:lastRowFirstColumn="0" w:lastRowLastColumn="0"/>
+              <w:rPr>
+                <w:lang w:val="es-ES"/>
+              </w:rPr>
+            </w:pPr>
+            <w:proofErr w:type="spellStart"/>
+            <w:r>
+              <w:rPr>
+                <w:b/>
+                <w:bCs/>
+              </w:rPr>
+              <w:t>Acción</w:t>
+            </w:r>
+            <w:proofErr w:type="spellEnd"/>
+          </w:p>
+        </w:tc>
+      </w:tr>
+      <w:tr>
+        <w:trPr>
+          <w:trHeight w:val="160"/>
+        </w:trPr>
+        <w:tc>
+          <w:tcPr>
+            <w:cnfStyle w:val="001000000000" w:firstRow="0" w:lastRow="0" w:firstColumn="1" w:lastColumn="0" w:oddVBand="0" w:evenVBand="0" w:oddHBand="0" w:evenHBand="0" w:firstRowFirstColumn="0" w:firstRowLastColumn="0" w:lastRowFirstColumn="0" w:lastRowLastColumn="0"/>
+            <w:tcW w:w="2830" w:type="dxa"/>
+            <w:vMerge/>
+          </w:tcPr>
+          <w:p>
+            <w:pPr>
+              <w:rPr>
+                <w:lang w:val="es-ES"/>
+              </w:rPr>
+            </w:pPr>
+          </w:p>
+        </w:tc>
+        <w:tc>
+          <w:tcPr>
+            <w:tcW w:w="1560" w:type="dxa"/>
+            <w:gridSpan w:val="2"/>
+          </w:tcPr>
+          <w:p>
+            <w:pPr>
+              <w:jc w:val="center"/>
+              <w:cnfStyle w:val="000000000000" w:firstRow="0" w:lastRow="0" w:firstColumn="0" w:lastColumn="0" w:oddVBand="0" w:evenVBand="0" w:oddHBand="0" w:evenHBand="0" w:firstRowFirstColumn="0" w:firstRowLastColumn="0" w:lastRowFirstColumn="0" w:lastRowLastColumn="0"/>
+            </w:pPr>
+            <w:r>
+              <w:t>3</w:t>
+            </w:r>
+          </w:p>
+        </w:tc>
+        <w:tc>
+          <w:tcPr>
+            <w:tcW w:w="4960" w:type="dxa"/>
+          </w:tcPr>
+          <w:p>
+            <w:pPr>
+              <w:cnfStyle w:val="000000000000" w:firstRow="0" w:lastRow="0" w:firstColumn="0" w:lastColumn="0" w:oddVBand="0" w:evenVBand="0" w:oddHBand="0" w:evenHBand="0" w:firstRowFirstColumn="0" w:firstRowLastColumn="0" w:lastRowFirstColumn="0" w:lastRowLastColumn="0"/>
+              <w:rPr>
+                <w:lang w:val="es-ES"/>
+              </w:rPr>
+            </w:pPr>
+            <w:r>
+              <w:rPr>
+                <w:lang w:val="es-ES"/>
+              </w:rPr>
+              <w:t>El jugador selecciona reintentar el nivel y el sistema vuelve a empezar el nivel, guardando la puntuación y coleccionables obtenidos.</w:t>
+            </w:r>
+          </w:p>
+        </w:tc>
+      </w:tr>
+      <w:tr>
+        <w:tc>
+          <w:tcPr>
+            <w:cnfStyle w:val="001000000000" w:firstRow="0" w:lastRow="0" w:firstColumn="1" w:lastColumn="0" w:oddVBand="0" w:evenVBand="0" w:oddHBand="0" w:evenHBand="0" w:firstRowFirstColumn="0" w:firstRowLastColumn="0" w:lastRowFirstColumn="0" w:lastRowLastColumn="0"/>
+            <w:tcW w:w="2830" w:type="dxa"/>
+          </w:tcPr>
+          <w:p>
+            <w:proofErr w:type="spellStart"/>
+            <w:r>
+              <w:t>Importancia</w:t>
+            </w:r>
+            <w:proofErr w:type="spellEnd"/>
+          </w:p>
+        </w:tc>
+        <w:tc>
+          <w:tcPr>
+            <w:tcW w:w="6520" w:type="dxa"/>
+            <w:gridSpan w:val="3"/>
+          </w:tcPr>
+          <w:p>
+            <w:pPr>
+              <w:cnfStyle w:val="000000000000" w:firstRow="0" w:lastRow="0" w:firstColumn="0" w:lastColumn="0" w:oddVBand="0" w:evenVBand="0" w:oddHBand="0" w:evenHBand="0" w:firstRowFirstColumn="0" w:firstRowLastColumn="0" w:lastRowFirstColumn="0" w:lastRowLastColumn="0"/>
+            </w:pPr>
+            <w:r>
+              <w:t xml:space="preserve">Muy </w:t>
+            </w:r>
+            <w:proofErr w:type="spellStart"/>
+            <w:r>
+              <w:t>alta</w:t>
+            </w:r>
+            <w:proofErr w:type="spellEnd"/>
+          </w:p>
+        </w:tc>
+      </w:tr>
+      <w:tr>
+        <w:tc>
+          <w:tcPr>
+            <w:cnfStyle w:val="001000000000" w:firstRow="0" w:lastRow="0" w:firstColumn="1" w:lastColumn="0" w:oddVBand="0" w:evenVBand="0" w:oddHBand="0" w:evenHBand="0" w:firstRowFirstColumn="0" w:firstRowLastColumn="0" w:lastRowFirstColumn="0" w:lastRowLastColumn="0"/>
+            <w:tcW w:w="2830" w:type="dxa"/>
+          </w:tcPr>
+          <w:p>
+            <w:proofErr w:type="spellStart"/>
+            <w:r>
+              <w:t>Urgencia</w:t>
+            </w:r>
+            <w:proofErr w:type="spellEnd"/>
+          </w:p>
+        </w:tc>
+        <w:tc>
+          <w:tcPr>
+            <w:tcW w:w="6520" w:type="dxa"/>
+            <w:gridSpan w:val="3"/>
+          </w:tcPr>
+          <w:p>
+            <w:pPr>
+              <w:cnfStyle w:val="000000000000" w:firstRow="0" w:lastRow="0" w:firstColumn="0" w:lastColumn="0" w:oddVBand="0" w:evenVBand="0" w:oddHBand="0" w:evenHBand="0" w:firstRowFirstColumn="0" w:firstRowLastColumn="0" w:lastRowFirstColumn="0" w:lastRowLastColumn="0"/>
+            </w:pPr>
+            <w:r>
+              <w:t xml:space="preserve">Muy </w:t>
+            </w:r>
+            <w:proofErr w:type="spellStart"/>
+            <w:r>
+              <w:t>alta</w:t>
+            </w:r>
+            <w:proofErr w:type="spellEnd"/>
+          </w:p>
+        </w:tc>
+      </w:tr>
+      <w:tr>
+        <w:trPr>
+          <w:trHeight w:val="915"/>
+        </w:trPr>
+        <w:tc>
+          <w:tcPr>
+            <w:cnfStyle w:val="001000000000" w:firstRow="0" w:lastRow="0" w:firstColumn="1" w:lastColumn="0" w:oddVBand="0" w:evenVBand="0" w:oddHBand="0" w:evenHBand="0" w:firstRowFirstColumn="0" w:firstRowLastColumn="0" w:lastRowFirstColumn="0" w:lastRowLastColumn="0"/>
+            <w:tcW w:w="2830" w:type="dxa"/>
+          </w:tcPr>
+          <w:p>
+            <w:proofErr w:type="spellStart"/>
+            <w:r>
+              <w:t>Comentarios</w:t>
+            </w:r>
+            <w:proofErr w:type="spellEnd"/>
+          </w:p>
+        </w:tc>
+        <w:tc>
+          <w:tcPr>
+            <w:tcW w:w="6520" w:type="dxa"/>
+            <w:gridSpan w:val="3"/>
+          </w:tcPr>
+          <w:p>
+            <w:pPr>
+              <w:cnfStyle w:val="000000000000" w:firstRow="0" w:lastRow="0" w:firstColumn="0" w:lastColumn="0" w:oddVBand="0" w:evenVBand="0" w:oddHBand="0" w:evenHBand="0" w:firstRowFirstColumn="0" w:firstRowLastColumn="0" w:lastRowFirstColumn="0" w:lastRowLastColumn="0"/>
+              <w:rPr>
+                <w:lang w:val="es-ES"/>
+              </w:rPr>
+            </w:pPr>
+            <w:r>
+              <w:rPr>
+                <w:lang w:val="es-ES"/>
+              </w:rPr>
+              <w:t>Una vez alcanzada la condición de victoria, el nivel acabará mostrando la puntuación final. De ahí el jugador tendrá la opción de salir al menú principal o reintentar el nivel.</w:t>
             </w:r>
           </w:p>
         </w:tc>
@@ -20541,7 +21655,7 @@
           <w:p>
             <w:r>
               <w:lastRenderedPageBreak/>
-              <w:t>UC-15</w:t>
+              <w:t>UC-16</w:t>
             </w:r>
           </w:p>
         </w:tc>
@@ -20562,7 +21676,13 @@
               <w:rPr>
                 <w:lang w:val="es-ES"/>
               </w:rPr>
-              <w:t>Completar nivel</w:t>
+              <w:t>Menú</w:t>
+            </w:r>
+            <w:r>
+              <w:rPr>
+                <w:lang w:val="es-ES"/>
+              </w:rPr>
+              <w:t xml:space="preserve"> de Pausa</w:t>
             </w:r>
           </w:p>
         </w:tc>
@@ -20717,6 +21837,35 @@
               <w:t>Desarrollo de la base del videojuego</w:t>
             </w:r>
           </w:p>
+        </w:tc>
+      </w:tr>
+      <w:tr>
+        <w:tc>
+          <w:tcPr>
+            <w:cnfStyle w:val="001000000000" w:firstRow="0" w:lastRow="0" w:firstColumn="1" w:lastColumn="0" w:oddVBand="0" w:evenVBand="0" w:oddHBand="0" w:evenHBand="0" w:firstRowFirstColumn="0" w:firstRowLastColumn="0" w:lastRowFirstColumn="0" w:lastRowLastColumn="0"/>
+            <w:tcW w:w="2830" w:type="dxa"/>
+          </w:tcPr>
+          <w:p>
+            <w:proofErr w:type="spellStart"/>
+            <w:r>
+              <w:t>Requisitos</w:t>
+            </w:r>
+            <w:proofErr w:type="spellEnd"/>
+            <w:r>
+              <w:t xml:space="preserve"> </w:t>
+            </w:r>
+            <w:proofErr w:type="spellStart"/>
+            <w:r>
+              <w:t>Asociados</w:t>
+            </w:r>
+            <w:proofErr w:type="spellEnd"/>
+          </w:p>
+        </w:tc>
+        <w:tc>
+          <w:tcPr>
+            <w:tcW w:w="6520" w:type="dxa"/>
+            <w:gridSpan w:val="3"/>
+          </w:tcPr>
           <w:p>
             <w:pPr>
               <w:pStyle w:val="Prrafodelista"/>
@@ -20733,50 +21882,9 @@
               <w:rPr>
                 <w:lang w:val="es-ES"/>
               </w:rPr>
-              <w:t xml:space="preserve">OBJ-04: </w:t>
-            </w:r>
-            <w:r>
-              <w:rPr>
-                <w:lang w:val="es-ES"/>
-              </w:rPr>
-              <w:t>G</w:t>
-            </w:r>
-            <w:r>
-              <w:rPr>
-                <w:lang w:val="es-ES"/>
-              </w:rPr>
-              <w:t>estión de puntuaciones</w:t>
-            </w:r>
-          </w:p>
-        </w:tc>
-      </w:tr>
-      <w:tr>
-        <w:tc>
-          <w:tcPr>
-            <w:cnfStyle w:val="001000000000" w:firstRow="0" w:lastRow="0" w:firstColumn="1" w:lastColumn="0" w:oddVBand="0" w:evenVBand="0" w:oddHBand="0" w:evenHBand="0" w:firstRowFirstColumn="0" w:firstRowLastColumn="0" w:lastRowFirstColumn="0" w:lastRowLastColumn="0"/>
-            <w:tcW w:w="2830" w:type="dxa"/>
-          </w:tcPr>
-          <w:p>
-            <w:proofErr w:type="spellStart"/>
-            <w:r>
-              <w:t>Requisitos</w:t>
-            </w:r>
-            <w:proofErr w:type="spellEnd"/>
-            <w:r>
-              <w:t xml:space="preserve"> </w:t>
-            </w:r>
-            <w:proofErr w:type="spellStart"/>
-            <w:r>
-              <w:t>Asociados</w:t>
-            </w:r>
-            <w:proofErr w:type="spellEnd"/>
-          </w:p>
-        </w:tc>
-        <w:tc>
-          <w:tcPr>
-            <w:tcW w:w="6520" w:type="dxa"/>
-            <w:gridSpan w:val="3"/>
-          </w:tcPr>
+              <w:t>CRQ-02: Diseño de interfaces interactivas</w:t>
+            </w:r>
+          </w:p>
           <w:p>
             <w:pPr>
               <w:pStyle w:val="Prrafodelista"/>
@@ -20785,135 +21893,16 @@
                 <w:numId w:val="5"/>
               </w:numPr>
               <w:cnfStyle w:val="000000000000" w:firstRow="0" w:lastRow="0" w:firstColumn="0" w:lastColumn="0" w:oddVBand="0" w:evenVBand="0" w:oddHBand="0" w:evenHBand="0" w:firstRowFirstColumn="0" w:firstRowLastColumn="0" w:lastRowFirstColumn="0" w:lastRowLastColumn="0"/>
-            </w:pPr>
-            <w:r>
-              <w:t xml:space="preserve">IRQ-01: </w:t>
-            </w:r>
-            <w:proofErr w:type="spellStart"/>
-            <w:r>
-              <w:t>Información</w:t>
-            </w:r>
-            <w:proofErr w:type="spellEnd"/>
-            <w:r>
-              <w:t xml:space="preserve"> de </w:t>
-            </w:r>
-            <w:proofErr w:type="spellStart"/>
-            <w:r>
-              <w:t>puntuaciones</w:t>
-            </w:r>
-            <w:proofErr w:type="spellEnd"/>
-          </w:p>
-          <w:p>
-            <w:pPr>
-              <w:pStyle w:val="Prrafodelista"/>
-              <w:numPr>
-                <w:ilvl w:val="0"/>
-                <w:numId w:val="5"/>
-              </w:numPr>
-              <w:cnfStyle w:val="000000000000" w:firstRow="0" w:lastRow="0" w:firstColumn="0" w:lastColumn="0" w:oddVBand="0" w:evenVBand="0" w:oddHBand="0" w:evenHBand="0" w:firstRowFirstColumn="0" w:firstRowLastColumn="0" w:lastRowFirstColumn="0" w:lastRowLastColumn="0"/>
-            </w:pPr>
-            <w:r>
-              <w:t xml:space="preserve">CRQ-02: </w:t>
-            </w:r>
-            <w:proofErr w:type="spellStart"/>
-            <w:r>
-              <w:t>Diseño</w:t>
-            </w:r>
-            <w:proofErr w:type="spellEnd"/>
-            <w:r>
-              <w:t xml:space="preserve"> de interfaces </w:t>
-            </w:r>
-            <w:proofErr w:type="spellStart"/>
-            <w:r>
-              <w:t>interactivas</w:t>
-            </w:r>
-            <w:proofErr w:type="spellEnd"/>
-          </w:p>
-          <w:p>
-            <w:pPr>
-              <w:pStyle w:val="Prrafodelista"/>
-              <w:numPr>
-                <w:ilvl w:val="0"/>
-                <w:numId w:val="5"/>
-              </w:numPr>
-              <w:cnfStyle w:val="000000000000" w:firstRow="0" w:lastRow="0" w:firstColumn="0" w:lastColumn="0" w:oddVBand="0" w:evenVBand="0" w:oddHBand="0" w:evenHBand="0" w:firstRowFirstColumn="0" w:firstRowLastColumn="0" w:lastRowFirstColumn="0" w:lastRowLastColumn="0"/>
-            </w:pPr>
-            <w:r>
-              <w:t xml:space="preserve">CRQ-03: </w:t>
-            </w:r>
-            <w:proofErr w:type="spellStart"/>
-            <w:r>
-              <w:t>Diseño</w:t>
-            </w:r>
-            <w:proofErr w:type="spellEnd"/>
-            <w:r>
-              <w:t xml:space="preserve"> de </w:t>
-            </w:r>
-            <w:proofErr w:type="spellStart"/>
-            <w:r>
-              <w:t>nivel</w:t>
-            </w:r>
-            <w:proofErr w:type="spellEnd"/>
-            <w:r>
-              <w:t xml:space="preserve"> </w:t>
-            </w:r>
-            <w:proofErr w:type="spellStart"/>
-            <w:r>
-              <w:t>interactivo</w:t>
-            </w:r>
-            <w:proofErr w:type="spellEnd"/>
-          </w:p>
-          <w:p>
-            <w:pPr>
-              <w:pStyle w:val="Prrafodelista"/>
-              <w:numPr>
-                <w:ilvl w:val="0"/>
-                <w:numId w:val="5"/>
-              </w:numPr>
-              <w:cnfStyle w:val="000000000000" w:firstRow="0" w:lastRow="0" w:firstColumn="0" w:lastColumn="0" w:oddVBand="0" w:evenVBand="0" w:oddHBand="0" w:evenHBand="0" w:firstRowFirstColumn="0" w:firstRowLastColumn="0" w:lastRowFirstColumn="0" w:lastRowLastColumn="0"/>
-            </w:pPr>
-            <w:r>
-              <w:t xml:space="preserve">UC-17: </w:t>
-            </w:r>
-            <w:proofErr w:type="spellStart"/>
-            <w:r>
-              <w:t>Jugar</w:t>
-            </w:r>
-            <w:proofErr w:type="spellEnd"/>
-            <w:r>
-              <w:t xml:space="preserve"> el </w:t>
-            </w:r>
-            <w:proofErr w:type="spellStart"/>
-            <w:r>
-              <w:t>nivel</w:t>
-            </w:r>
-            <w:proofErr w:type="spellEnd"/>
-          </w:p>
-          <w:p>
-            <w:pPr>
-              <w:pStyle w:val="Prrafodelista"/>
-              <w:numPr>
-                <w:ilvl w:val="0"/>
-                <w:numId w:val="5"/>
-              </w:numPr>
-              <w:cnfStyle w:val="000000000000" w:firstRow="0" w:lastRow="0" w:firstColumn="0" w:lastColumn="0" w:oddVBand="0" w:evenVBand="0" w:oddHBand="0" w:evenHBand="0" w:firstRowFirstColumn="0" w:firstRowLastColumn="0" w:lastRowFirstColumn="0" w:lastRowLastColumn="0"/>
-            </w:pPr>
-            <w:r>
-              <w:t xml:space="preserve">UC-18: </w:t>
-            </w:r>
-            <w:proofErr w:type="spellStart"/>
-            <w:r>
-              <w:t>Eliminación</w:t>
-            </w:r>
-            <w:proofErr w:type="spellEnd"/>
-            <w:r>
-              <w:t xml:space="preserve"> de </w:t>
-            </w:r>
-            <w:proofErr w:type="spellStart"/>
-            <w:r>
-              <w:t>datos</w:t>
-            </w:r>
-            <w:proofErr w:type="spellEnd"/>
+              <w:rPr>
+                <w:lang w:val="es-ES"/>
+              </w:rPr>
+            </w:pPr>
+            <w:r>
+              <w:rPr>
+                <w:lang w:val="es-ES"/>
+              </w:rPr>
+              <w:t>CRQ-03: Diseño de nivel interactivo</w:t>
+            </w:r>
           </w:p>
         </w:tc>
       </w:tr>
@@ -20943,6 +21932,7 @@
                 <w:lang w:val="es-ES"/>
               </w:rPr>
             </w:pPr>
+            <w:bookmarkStart w:id="18" w:name="_Hlk176204957"/>
             <w:r>
               <w:rPr>
                 <w:lang w:val="es-ES"/>
@@ -20953,8 +21943,15 @@
               <w:rPr>
                 <w:lang w:val="es-ES"/>
               </w:rPr>
-              <w:t>al y como se describe a continuación cuando el jugador interactúe con la meta del nivel</w:t>
-            </w:r>
+              <w:t xml:space="preserve">al y como se describe a continuación cuando el jugador </w:t>
+            </w:r>
+            <w:r>
+              <w:rPr>
+                <w:lang w:val="es-ES"/>
+              </w:rPr>
+              <w:t>presione el botón de pausa.</w:t>
+            </w:r>
+            <w:bookmarkEnd w:id="18"/>
           </w:p>
         </w:tc>
       </w:tr>
@@ -21000,7 +21997,7 @@
               <w:rPr>
                 <w:lang w:val="es-ES"/>
               </w:rPr>
-              <w:t>n el nivel manejando a Baqueta y tiene que entrar en colisión con la meta.</w:t>
+              <w:t>n el nivel manejando a Baqueta y presionar el botón de pausa.</w:t>
             </w:r>
           </w:p>
         </w:tc>
@@ -21118,7 +22115,7 @@
               <w:rPr>
                 <w:lang w:val="es-ES"/>
               </w:rPr>
-              <w:t>colisiona con el objeto.</w:t>
+              <w:t>presiona el botón de pausa.</w:t>
             </w:r>
           </w:p>
         </w:tc>
@@ -21177,25 +22174,13 @@
               <w:rPr>
                 <w:lang w:val="es-ES"/>
               </w:rPr>
-              <w:t xml:space="preserve"> muestra pruebas visuales y sonoras de que </w:t>
-            </w:r>
-            <w:r>
-              <w:rPr>
-                <w:lang w:val="es-ES"/>
-              </w:rPr>
-              <w:t>se ha alcanzado la meta</w:t>
-            </w:r>
-            <w:r>
-              <w:rPr>
-                <w:lang w:val="es-ES"/>
-              </w:rPr>
-              <w:t xml:space="preserve">. </w:t>
-            </w:r>
-            <w:r>
-              <w:rPr>
-                <w:lang w:val="es-ES"/>
-              </w:rPr>
-              <w:t>EL sistema calculará la puntuación total del nivel y mostrará la pantalla de victoria.</w:t>
+              <w:t xml:space="preserve"> responde parando el juego y mostrando la pantalla de pausa</w:t>
+            </w:r>
+            <w:r>
+              <w:rPr>
+                <w:lang w:val="es-ES"/>
+              </w:rPr>
+              <w:t>.</w:t>
             </w:r>
           </w:p>
         </w:tc>
@@ -21248,19 +22233,13 @@
               <w:rPr>
                 <w:lang w:val="es-ES"/>
               </w:rPr>
-              <w:t xml:space="preserve">El </w:t>
-            </w:r>
-            <w:r>
-              <w:rPr>
-                <w:lang w:val="es-ES"/>
-              </w:rPr>
-              <w:t>jugador ya no tendrá control sobre el avatar</w:t>
-            </w:r>
-            <w:r>
-              <w:rPr>
-                <w:lang w:val="es-ES"/>
-              </w:rPr>
-              <w:t>. Seleccionará entonces salir del nivel mediante los menús.</w:t>
+              <w:t xml:space="preserve">El jugador ya no tendrá control sobre el avatar. </w:t>
+            </w:r>
+            <w:r>
+              <w:rPr>
+                <w:lang w:val="es-ES"/>
+              </w:rPr>
+              <w:t>Tendrá las opciones presentes en el menú. El jugador podrá seleccionar reanudar la partida</w:t>
             </w:r>
           </w:p>
         </w:tc>
@@ -21312,7 +22291,13 @@
               <w:rPr>
                 <w:lang w:val="es-ES"/>
               </w:rPr>
-              <w:t>El sistema enviará al jugador a la pantalla principal del juego, mostrando la puntuación y coleccionables obtenidos en el nivel.</w:t>
+              <w:t xml:space="preserve">El sistema </w:t>
+            </w:r>
+            <w:r>
+              <w:rPr>
+                <w:lang w:val="es-ES"/>
+              </w:rPr>
+              <w:t xml:space="preserve">reanudará la partida desde el punto en el que se dejó. </w:t>
             </w:r>
           </w:p>
         </w:tc>
@@ -21343,12 +22328,6 @@
                 <w:lang w:val="es-ES"/>
               </w:rPr>
             </w:pPr>
-            <w:r>
-              <w:rPr>
-                <w:lang w:val="es-ES"/>
-              </w:rPr>
-              <w:t>El jugador habrá completado el nivel y su puntuación se guardará (UC-16).</w:t>
-            </w:r>
           </w:p>
         </w:tc>
       </w:tr>
@@ -21460,506 +22439,25 @@
               <w:rPr>
                 <w:lang w:val="es-ES"/>
               </w:rPr>
-              <w:t>El jugador selecciona reintentar el nivel y el sistema vuelve a empezar el nivel, guardando la puntuación y coleccionables obtenidos.</w:t>
-            </w:r>
-          </w:p>
-        </w:tc>
-      </w:tr>
-      <w:tr>
-        <w:tc>
-          <w:tcPr>
-            <w:cnfStyle w:val="001000000000" w:firstRow="0" w:lastRow="0" w:firstColumn="1" w:lastColumn="0" w:oddVBand="0" w:evenVBand="0" w:oddHBand="0" w:evenHBand="0" w:firstRowFirstColumn="0" w:firstRowLastColumn="0" w:lastRowFirstColumn="0" w:lastRowLastColumn="0"/>
-            <w:tcW w:w="2830" w:type="dxa"/>
-          </w:tcPr>
-          <w:p>
-            <w:proofErr w:type="spellStart"/>
-            <w:r>
-              <w:t>Importancia</w:t>
-            </w:r>
-            <w:proofErr w:type="spellEnd"/>
-          </w:p>
-        </w:tc>
-        <w:tc>
-          <w:tcPr>
-            <w:tcW w:w="6520" w:type="dxa"/>
-            <w:gridSpan w:val="3"/>
-          </w:tcPr>
-          <w:p>
-            <w:pPr>
-              <w:cnfStyle w:val="000000000000" w:firstRow="0" w:lastRow="0" w:firstColumn="0" w:lastColumn="0" w:oddVBand="0" w:evenVBand="0" w:oddHBand="0" w:evenHBand="0" w:firstRowFirstColumn="0" w:firstRowLastColumn="0" w:lastRowFirstColumn="0" w:lastRowLastColumn="0"/>
-            </w:pPr>
-            <w:r>
-              <w:t xml:space="preserve">Muy </w:t>
-            </w:r>
-            <w:proofErr w:type="spellStart"/>
-            <w:r>
-              <w:t>alta</w:t>
-            </w:r>
-            <w:proofErr w:type="spellEnd"/>
-          </w:p>
-        </w:tc>
-      </w:tr>
-      <w:tr>
-        <w:tc>
-          <w:tcPr>
-            <w:cnfStyle w:val="001000000000" w:firstRow="0" w:lastRow="0" w:firstColumn="1" w:lastColumn="0" w:oddVBand="0" w:evenVBand="0" w:oddHBand="0" w:evenHBand="0" w:firstRowFirstColumn="0" w:firstRowLastColumn="0" w:lastRowFirstColumn="0" w:lastRowLastColumn="0"/>
-            <w:tcW w:w="2830" w:type="dxa"/>
-          </w:tcPr>
-          <w:p>
-            <w:proofErr w:type="spellStart"/>
-            <w:r>
-              <w:t>Urgencia</w:t>
-            </w:r>
-            <w:proofErr w:type="spellEnd"/>
-          </w:p>
-        </w:tc>
-        <w:tc>
-          <w:tcPr>
-            <w:tcW w:w="6520" w:type="dxa"/>
-            <w:gridSpan w:val="3"/>
-          </w:tcPr>
-          <w:p>
-            <w:pPr>
-              <w:cnfStyle w:val="000000000000" w:firstRow="0" w:lastRow="0" w:firstColumn="0" w:lastColumn="0" w:oddVBand="0" w:evenVBand="0" w:oddHBand="0" w:evenHBand="0" w:firstRowFirstColumn="0" w:firstRowLastColumn="0" w:lastRowFirstColumn="0" w:lastRowLastColumn="0"/>
-            </w:pPr>
-            <w:r>
-              <w:t xml:space="preserve">Muy </w:t>
-            </w:r>
-            <w:proofErr w:type="spellStart"/>
-            <w:r>
-              <w:t>alta</w:t>
-            </w:r>
-            <w:proofErr w:type="spellEnd"/>
-          </w:p>
-        </w:tc>
-      </w:tr>
-      <w:tr>
-        <w:trPr>
-          <w:trHeight w:val="915"/>
-        </w:trPr>
-        <w:tc>
-          <w:tcPr>
-            <w:cnfStyle w:val="001000000000" w:firstRow="0" w:lastRow="0" w:firstColumn="1" w:lastColumn="0" w:oddVBand="0" w:evenVBand="0" w:oddHBand="0" w:evenHBand="0" w:firstRowFirstColumn="0" w:firstRowLastColumn="0" w:lastRowFirstColumn="0" w:lastRowLastColumn="0"/>
-            <w:tcW w:w="2830" w:type="dxa"/>
-          </w:tcPr>
-          <w:p>
-            <w:proofErr w:type="spellStart"/>
-            <w:r>
-              <w:t>Comentarios</w:t>
-            </w:r>
-            <w:proofErr w:type="spellEnd"/>
-          </w:p>
-        </w:tc>
-        <w:tc>
-          <w:tcPr>
-            <w:tcW w:w="6520" w:type="dxa"/>
-            <w:gridSpan w:val="3"/>
-          </w:tcPr>
-          <w:p>
-            <w:pPr>
-              <w:cnfStyle w:val="000000000000" w:firstRow="0" w:lastRow="0" w:firstColumn="0" w:lastColumn="0" w:oddVBand="0" w:evenVBand="0" w:oddHBand="0" w:evenHBand="0" w:firstRowFirstColumn="0" w:firstRowLastColumn="0" w:lastRowFirstColumn="0" w:lastRowLastColumn="0"/>
-              <w:rPr>
-                <w:lang w:val="es-ES"/>
-              </w:rPr>
-            </w:pPr>
-            <w:r>
-              <w:rPr>
-                <w:lang w:val="es-ES"/>
-              </w:rPr>
-              <w:t>Una vez alcanzada la condición de victoria, el nivel acabará mostrando la puntuación final. De ahí el jugador tendrá la opción de salir al menú principal o reintentar el nivel.</w:t>
-            </w:r>
-          </w:p>
-        </w:tc>
-      </w:tr>
-    </w:tbl>
-    <w:p>
-      <w:pPr>
-        <w:rPr>
-          <w:lang w:val="es-ES"/>
-        </w:rPr>
-      </w:pPr>
-    </w:p>
-    <w:p>
-      <w:pPr>
-        <w:rPr>
-          <w:lang w:val="es-ES"/>
-        </w:rPr>
-      </w:pPr>
-      <w:r>
-        <w:rPr>
-          <w:lang w:val="es-ES"/>
-        </w:rPr>
-        <w:br w:type="page"/>
-      </w:r>
-    </w:p>
-    <w:tbl>
-      <w:tblPr>
-        <w:tblStyle w:val="Tablaconcuadrcula1clara"/>
-        <w:tblW w:w="0" w:type="auto"/>
-        <w:tblLook w:val="04A0" w:firstRow="1" w:lastRow="0" w:firstColumn="1" w:lastColumn="0" w:noHBand="0" w:noVBand="1"/>
-      </w:tblPr>
-      <w:tblGrid>
-        <w:gridCol w:w="2830"/>
-        <w:gridCol w:w="1418"/>
-        <w:gridCol w:w="142"/>
-        <w:gridCol w:w="4960"/>
-      </w:tblGrid>
-      <w:tr>
-        <w:trPr>
-          <w:cnfStyle w:val="100000000000" w:firstRow="1" w:lastRow="0" w:firstColumn="0" w:lastColumn="0" w:oddVBand="0" w:evenVBand="0" w:oddHBand="0" w:evenHBand="0" w:firstRowFirstColumn="0" w:firstRowLastColumn="0" w:lastRowFirstColumn="0" w:lastRowLastColumn="0"/>
-        </w:trPr>
-        <w:tc>
-          <w:tcPr>
-            <w:cnfStyle w:val="001000000000" w:firstRow="0" w:lastRow="0" w:firstColumn="1" w:lastColumn="0" w:oddVBand="0" w:evenVBand="0" w:oddHBand="0" w:evenHBand="0" w:firstRowFirstColumn="0" w:firstRowLastColumn="0" w:lastRowFirstColumn="0" w:lastRowLastColumn="0"/>
-            <w:tcW w:w="2830" w:type="dxa"/>
-            <w:shd w:val="clear" w:color="auto" w:fill="B3E5A1" w:themeFill="accent6" w:themeFillTint="66"/>
-          </w:tcPr>
-          <w:p>
-            <w:r>
-              <w:lastRenderedPageBreak/>
-              <w:t>UC-16</w:t>
-            </w:r>
-          </w:p>
-        </w:tc>
-        <w:tc>
-          <w:tcPr>
-            <w:tcW w:w="6520" w:type="dxa"/>
-            <w:gridSpan w:val="3"/>
-            <w:shd w:val="clear" w:color="auto" w:fill="B3E5A1" w:themeFill="accent6" w:themeFillTint="66"/>
-          </w:tcPr>
-          <w:p>
-            <w:pPr>
-              <w:cnfStyle w:val="100000000000" w:firstRow="1" w:lastRow="0" w:firstColumn="0" w:lastColumn="0" w:oddVBand="0" w:evenVBand="0" w:oddHBand="0" w:evenHBand="0" w:firstRowFirstColumn="0" w:firstRowLastColumn="0" w:lastRowFirstColumn="0" w:lastRowLastColumn="0"/>
-              <w:rPr>
-                <w:lang w:val="es-ES"/>
-              </w:rPr>
-            </w:pPr>
-            <w:proofErr w:type="spellStart"/>
-            <w:r>
-              <w:rPr>
-                <w:lang w:val="es-ES"/>
-              </w:rPr>
-              <w:t>Menu</w:t>
-            </w:r>
-            <w:proofErr w:type="spellEnd"/>
-            <w:r>
-              <w:rPr>
-                <w:lang w:val="es-ES"/>
-              </w:rPr>
-              <w:t xml:space="preserve"> de Pausa</w:t>
-            </w:r>
-          </w:p>
-        </w:tc>
-      </w:tr>
-      <w:tr>
-        <w:tc>
-          <w:tcPr>
-            <w:cnfStyle w:val="001000000000" w:firstRow="0" w:lastRow="0" w:firstColumn="1" w:lastColumn="0" w:oddVBand="0" w:evenVBand="0" w:oddHBand="0" w:evenHBand="0" w:firstRowFirstColumn="0" w:firstRowLastColumn="0" w:lastRowFirstColumn="0" w:lastRowLastColumn="0"/>
-            <w:tcW w:w="2830" w:type="dxa"/>
-          </w:tcPr>
-          <w:p>
-            <w:proofErr w:type="spellStart"/>
-            <w:r>
-              <w:t>Versión</w:t>
-            </w:r>
-            <w:proofErr w:type="spellEnd"/>
-          </w:p>
-        </w:tc>
-        <w:tc>
-          <w:tcPr>
-            <w:tcW w:w="6520" w:type="dxa"/>
-            <w:gridSpan w:val="3"/>
-          </w:tcPr>
-          <w:p>
-            <w:pPr>
-              <w:cnfStyle w:val="000000000000" w:firstRow="0" w:lastRow="0" w:firstColumn="0" w:lastColumn="0" w:oddVBand="0" w:evenVBand="0" w:oddHBand="0" w:evenHBand="0" w:firstRowFirstColumn="0" w:firstRowLastColumn="0" w:lastRowFirstColumn="0" w:lastRowLastColumn="0"/>
-            </w:pPr>
-            <w:r>
-              <w:t>1.0</w:t>
-            </w:r>
-          </w:p>
-        </w:tc>
-      </w:tr>
-      <w:tr>
-        <w:tc>
-          <w:tcPr>
-            <w:cnfStyle w:val="001000000000" w:firstRow="0" w:lastRow="0" w:firstColumn="1" w:lastColumn="0" w:oddVBand="0" w:evenVBand="0" w:oddHBand="0" w:evenHBand="0" w:firstRowFirstColumn="0" w:firstRowLastColumn="0" w:lastRowFirstColumn="0" w:lastRowLastColumn="0"/>
-            <w:tcW w:w="2830" w:type="dxa"/>
-          </w:tcPr>
-          <w:p>
-            <w:proofErr w:type="spellStart"/>
-            <w:r>
-              <w:t>Autores</w:t>
-            </w:r>
-            <w:proofErr w:type="spellEnd"/>
-          </w:p>
-        </w:tc>
-        <w:tc>
-          <w:tcPr>
-            <w:tcW w:w="6520" w:type="dxa"/>
-            <w:gridSpan w:val="3"/>
-          </w:tcPr>
-          <w:p>
-            <w:pPr>
-              <w:cnfStyle w:val="000000000000" w:firstRow="0" w:lastRow="0" w:firstColumn="0" w:lastColumn="0" w:oddVBand="0" w:evenVBand="0" w:oddHBand="0" w:evenHBand="0" w:firstRowFirstColumn="0" w:firstRowLastColumn="0" w:lastRowFirstColumn="0" w:lastRowLastColumn="0"/>
-            </w:pPr>
-            <w:r>
-              <w:t xml:space="preserve">Ángel </w:t>
-            </w:r>
-            <w:proofErr w:type="spellStart"/>
-            <w:r>
-              <w:t>Torijano</w:t>
-            </w:r>
-            <w:proofErr w:type="spellEnd"/>
-            <w:r>
-              <w:t xml:space="preserve"> </w:t>
-            </w:r>
-            <w:proofErr w:type="spellStart"/>
-            <w:r>
-              <w:t>Sexmero</w:t>
-            </w:r>
-            <w:proofErr w:type="spellEnd"/>
-          </w:p>
-        </w:tc>
-      </w:tr>
-      <w:tr>
-        <w:tc>
-          <w:tcPr>
-            <w:cnfStyle w:val="001000000000" w:firstRow="0" w:lastRow="0" w:firstColumn="1" w:lastColumn="0" w:oddVBand="0" w:evenVBand="0" w:oddHBand="0" w:evenHBand="0" w:firstRowFirstColumn="0" w:firstRowLastColumn="0" w:lastRowFirstColumn="0" w:lastRowLastColumn="0"/>
-            <w:tcW w:w="2830" w:type="dxa"/>
-          </w:tcPr>
-          <w:p>
-            <w:r>
-              <w:t>Fuentes</w:t>
-            </w:r>
-          </w:p>
-        </w:tc>
-        <w:tc>
-          <w:tcPr>
-            <w:tcW w:w="6520" w:type="dxa"/>
-            <w:gridSpan w:val="3"/>
-          </w:tcPr>
-          <w:p>
-            <w:pPr>
-              <w:cnfStyle w:val="000000000000" w:firstRow="0" w:lastRow="0" w:firstColumn="0" w:lastColumn="0" w:oddVBand="0" w:evenVBand="0" w:oddHBand="0" w:evenHBand="0" w:firstRowFirstColumn="0" w:firstRowLastColumn="0" w:lastRowFirstColumn="0" w:lastRowLastColumn="0"/>
-            </w:pPr>
-            <w:r>
-              <w:t>Guillermo Hernández González</w:t>
-            </w:r>
-          </w:p>
-        </w:tc>
-      </w:tr>
-      <w:tr>
-        <w:tc>
-          <w:tcPr>
-            <w:cnfStyle w:val="001000000000" w:firstRow="0" w:lastRow="0" w:firstColumn="1" w:lastColumn="0" w:oddVBand="0" w:evenVBand="0" w:oddHBand="0" w:evenHBand="0" w:firstRowFirstColumn="0" w:firstRowLastColumn="0" w:lastRowFirstColumn="0" w:lastRowLastColumn="0"/>
-            <w:tcW w:w="2830" w:type="dxa"/>
-          </w:tcPr>
-          <w:p>
-            <w:proofErr w:type="spellStart"/>
-            <w:r>
-              <w:t>Objetivos</w:t>
-            </w:r>
-            <w:proofErr w:type="spellEnd"/>
-            <w:r>
-              <w:t xml:space="preserve"> </w:t>
-            </w:r>
-            <w:proofErr w:type="spellStart"/>
-            <w:r>
-              <w:t>Asociados</w:t>
-            </w:r>
-            <w:proofErr w:type="spellEnd"/>
-          </w:p>
-        </w:tc>
-        <w:tc>
-          <w:tcPr>
-            <w:tcW w:w="6520" w:type="dxa"/>
-            <w:gridSpan w:val="3"/>
-          </w:tcPr>
-          <w:p>
-            <w:pPr>
-              <w:pStyle w:val="Prrafodelista"/>
-              <w:numPr>
-                <w:ilvl w:val="0"/>
-                <w:numId w:val="5"/>
-              </w:numPr>
-              <w:cnfStyle w:val="000000000000" w:firstRow="0" w:lastRow="0" w:firstColumn="0" w:lastColumn="0" w:oddVBand="0" w:evenVBand="0" w:oddHBand="0" w:evenHBand="0" w:firstRowFirstColumn="0" w:firstRowLastColumn="0" w:lastRowFirstColumn="0" w:lastRowLastColumn="0"/>
-              <w:rPr>
-                <w:lang w:val="es-ES"/>
-              </w:rPr>
-            </w:pPr>
-            <w:r>
-              <w:rPr>
-                <w:lang w:val="es-ES"/>
-              </w:rPr>
-              <w:t xml:space="preserve">OBJ-01: </w:t>
-            </w:r>
-            <w:r>
-              <w:rPr>
-                <w:lang w:val="es-ES"/>
-              </w:rPr>
-              <w:t>Desarrollo de la base del videojuego</w:t>
-            </w:r>
-          </w:p>
-        </w:tc>
-      </w:tr>
-      <w:tr>
-        <w:tc>
-          <w:tcPr>
-            <w:cnfStyle w:val="001000000000" w:firstRow="0" w:lastRow="0" w:firstColumn="1" w:lastColumn="0" w:oddVBand="0" w:evenVBand="0" w:oddHBand="0" w:evenHBand="0" w:firstRowFirstColumn="0" w:firstRowLastColumn="0" w:lastRowFirstColumn="0" w:lastRowLastColumn="0"/>
-            <w:tcW w:w="2830" w:type="dxa"/>
-          </w:tcPr>
-          <w:p>
-            <w:proofErr w:type="spellStart"/>
-            <w:r>
-              <w:t>Requisitos</w:t>
-            </w:r>
-            <w:proofErr w:type="spellEnd"/>
-            <w:r>
-              <w:t xml:space="preserve"> </w:t>
-            </w:r>
-            <w:proofErr w:type="spellStart"/>
-            <w:r>
-              <w:t>Asociados</w:t>
-            </w:r>
-            <w:proofErr w:type="spellEnd"/>
-          </w:p>
-        </w:tc>
-        <w:tc>
-          <w:tcPr>
-            <w:tcW w:w="6520" w:type="dxa"/>
-            <w:gridSpan w:val="3"/>
-          </w:tcPr>
-          <w:p>
-            <w:pPr>
-              <w:pStyle w:val="Prrafodelista"/>
-              <w:numPr>
-                <w:ilvl w:val="0"/>
-                <w:numId w:val="5"/>
-              </w:numPr>
-              <w:cnfStyle w:val="000000000000" w:firstRow="0" w:lastRow="0" w:firstColumn="0" w:lastColumn="0" w:oddVBand="0" w:evenVBand="0" w:oddHBand="0" w:evenHBand="0" w:firstRowFirstColumn="0" w:firstRowLastColumn="0" w:lastRowFirstColumn="0" w:lastRowLastColumn="0"/>
-              <w:rPr>
-                <w:lang w:val="es-ES"/>
-              </w:rPr>
-            </w:pPr>
-            <w:r>
-              <w:rPr>
-                <w:lang w:val="es-ES"/>
-              </w:rPr>
-              <w:t>CRQ-02: Diseño de interfaces interactivas</w:t>
-            </w:r>
-          </w:p>
-          <w:p>
-            <w:pPr>
-              <w:pStyle w:val="Prrafodelista"/>
-              <w:numPr>
-                <w:ilvl w:val="0"/>
-                <w:numId w:val="5"/>
-              </w:numPr>
-              <w:cnfStyle w:val="000000000000" w:firstRow="0" w:lastRow="0" w:firstColumn="0" w:lastColumn="0" w:oddVBand="0" w:evenVBand="0" w:oddHBand="0" w:evenHBand="0" w:firstRowFirstColumn="0" w:firstRowLastColumn="0" w:lastRowFirstColumn="0" w:lastRowLastColumn="0"/>
-              <w:rPr>
-                <w:lang w:val="es-ES"/>
-              </w:rPr>
-            </w:pPr>
-            <w:r>
-              <w:rPr>
-                <w:lang w:val="es-ES"/>
-              </w:rPr>
-              <w:t>CRQ-03: Diseño de nivel interactivo</w:t>
-            </w:r>
-          </w:p>
-        </w:tc>
-      </w:tr>
-      <w:tr>
-        <w:tc>
-          <w:tcPr>
-            <w:cnfStyle w:val="001000000000" w:firstRow="0" w:lastRow="0" w:firstColumn="1" w:lastColumn="0" w:oddVBand="0" w:evenVBand="0" w:oddHBand="0" w:evenHBand="0" w:firstRowFirstColumn="0" w:firstRowLastColumn="0" w:lastRowFirstColumn="0" w:lastRowLastColumn="0"/>
-            <w:tcW w:w="2830" w:type="dxa"/>
-          </w:tcPr>
-          <w:p>
-            <w:proofErr w:type="spellStart"/>
-            <w:r>
-              <w:t>Descripción</w:t>
-            </w:r>
-            <w:proofErr w:type="spellEnd"/>
-          </w:p>
-        </w:tc>
-        <w:tc>
-          <w:tcPr>
-            <w:tcW w:w="6520" w:type="dxa"/>
-            <w:gridSpan w:val="3"/>
-          </w:tcPr>
-          <w:p>
-            <w:pPr>
-              <w:cnfStyle w:val="000000000000" w:firstRow="0" w:lastRow="0" w:firstColumn="0" w:lastColumn="0" w:oddVBand="0" w:evenVBand="0" w:oddHBand="0" w:evenHBand="0" w:firstRowFirstColumn="0" w:firstRowLastColumn="0" w:lastRowFirstColumn="0" w:lastRowLastColumn="0"/>
-              <w:rPr>
-                <w:lang w:val="es-ES"/>
-              </w:rPr>
-            </w:pPr>
-            <w:r>
-              <w:rPr>
-                <w:lang w:val="es-ES"/>
-              </w:rPr>
-              <w:t>El Sistema deberá comportarse t</w:t>
-            </w:r>
-            <w:r>
-              <w:rPr>
-                <w:lang w:val="es-ES"/>
-              </w:rPr>
-              <w:t xml:space="preserve">al y como se describe a continuación cuando el jugador </w:t>
-            </w:r>
-            <w:r>
-              <w:rPr>
-                <w:lang w:val="es-ES"/>
-              </w:rPr>
-              <w:t>presione el botón de pausa.</w:t>
-            </w:r>
-          </w:p>
-        </w:tc>
-      </w:tr>
-      <w:tr>
-        <w:tc>
-          <w:tcPr>
-            <w:cnfStyle w:val="001000000000" w:firstRow="0" w:lastRow="0" w:firstColumn="1" w:lastColumn="0" w:oddVBand="0" w:evenVBand="0" w:oddHBand="0" w:evenHBand="0" w:firstRowFirstColumn="0" w:firstRowLastColumn="0" w:lastRowFirstColumn="0" w:lastRowLastColumn="0"/>
-            <w:tcW w:w="2830" w:type="dxa"/>
-          </w:tcPr>
-          <w:p>
-            <w:proofErr w:type="spellStart"/>
-            <w:r>
-              <w:t>Precondici</w:t>
-            </w:r>
-            <w:r>
-              <w:t>ó</w:t>
-            </w:r>
-            <w:r>
-              <w:t>n</w:t>
-            </w:r>
-            <w:proofErr w:type="spellEnd"/>
-          </w:p>
-        </w:tc>
-        <w:tc>
-          <w:tcPr>
-            <w:tcW w:w="6520" w:type="dxa"/>
-            <w:gridSpan w:val="3"/>
-          </w:tcPr>
-          <w:p>
-            <w:pPr>
-              <w:cnfStyle w:val="000000000000" w:firstRow="0" w:lastRow="0" w:firstColumn="0" w:lastColumn="0" w:oddVBand="0" w:evenVBand="0" w:oddHBand="0" w:evenHBand="0" w:firstRowFirstColumn="0" w:firstRowLastColumn="0" w:lastRowFirstColumn="0" w:lastRowLastColumn="0"/>
-              <w:rPr>
-                <w:lang w:val="es-ES"/>
-              </w:rPr>
-            </w:pPr>
-            <w:r>
-              <w:rPr>
-                <w:lang w:val="es-ES"/>
-              </w:rPr>
-              <w:t>El Jugador debe estar e</w:t>
-            </w:r>
-            <w:r>
-              <w:rPr>
-                <w:lang w:val="es-ES"/>
-              </w:rPr>
-              <w:t>n el nivel manejando a Baqueta y presionar el botón de pausa.</w:t>
+              <w:t xml:space="preserve">El jugador selecciona </w:t>
+            </w:r>
+            <w:r>
+              <w:rPr>
+                <w:lang w:val="es-ES"/>
+              </w:rPr>
+              <w:t>salir d</w:t>
+            </w:r>
+            <w:r>
+              <w:rPr>
+                <w:lang w:val="es-ES"/>
+              </w:rPr>
+              <w:t xml:space="preserve">el nivel y el sistema </w:t>
+            </w:r>
+            <w:r>
+              <w:rPr>
+                <w:lang w:val="es-ES"/>
+              </w:rPr>
+              <w:t>mandará al jugador a la pantalla de inicio sin guardar ningún dato.</w:t>
             </w:r>
           </w:p>
         </w:tc>
@@ -21972,466 +22470,6 @@
           <w:tcPr>
             <w:cnfStyle w:val="001000000000" w:firstRow="0" w:lastRow="0" w:firstColumn="1" w:lastColumn="0" w:oddVBand="0" w:evenVBand="0" w:oddHBand="0" w:evenHBand="0" w:firstRowFirstColumn="0" w:firstRowLastColumn="0" w:lastRowFirstColumn="0" w:lastRowLastColumn="0"/>
             <w:tcW w:w="2830" w:type="dxa"/>
-            <w:vMerge w:val="restart"/>
-          </w:tcPr>
-          <w:p>
-            <w:proofErr w:type="spellStart"/>
-            <w:r>
-              <w:t>Secuencia</w:t>
-            </w:r>
-            <w:proofErr w:type="spellEnd"/>
-          </w:p>
-        </w:tc>
-        <w:tc>
-          <w:tcPr>
-            <w:tcW w:w="1418" w:type="dxa"/>
-          </w:tcPr>
-          <w:p>
-            <w:pPr>
-              <w:jc w:val="center"/>
-              <w:cnfStyle w:val="000000000000" w:firstRow="0" w:lastRow="0" w:firstColumn="0" w:lastColumn="0" w:oddVBand="0" w:evenVBand="0" w:oddHBand="0" w:evenHBand="0" w:firstRowFirstColumn="0" w:firstRowLastColumn="0" w:lastRowFirstColumn="0" w:lastRowLastColumn="0"/>
-              <w:rPr>
-                <w:b/>
-                <w:bCs/>
-              </w:rPr>
-            </w:pPr>
-            <w:r>
-              <w:rPr>
-                <w:b/>
-                <w:bCs/>
-              </w:rPr>
-              <w:t>Paso</w:t>
-            </w:r>
-          </w:p>
-        </w:tc>
-        <w:tc>
-          <w:tcPr>
-            <w:tcW w:w="5102" w:type="dxa"/>
-            <w:gridSpan w:val="2"/>
-          </w:tcPr>
-          <w:p>
-            <w:pPr>
-              <w:cnfStyle w:val="000000000000" w:firstRow="0" w:lastRow="0" w:firstColumn="0" w:lastColumn="0" w:oddVBand="0" w:evenVBand="0" w:oddHBand="0" w:evenHBand="0" w:firstRowFirstColumn="0" w:firstRowLastColumn="0" w:lastRowFirstColumn="0" w:lastRowLastColumn="0"/>
-              <w:rPr>
-                <w:b/>
-                <w:bCs/>
-              </w:rPr>
-            </w:pPr>
-            <w:proofErr w:type="spellStart"/>
-            <w:r>
-              <w:rPr>
-                <w:b/>
-                <w:bCs/>
-              </w:rPr>
-              <w:t>Acción</w:t>
-            </w:r>
-            <w:proofErr w:type="spellEnd"/>
-          </w:p>
-        </w:tc>
-      </w:tr>
-      <w:tr>
-        <w:trPr>
-          <w:trHeight w:val="54"/>
-        </w:trPr>
-        <w:tc>
-          <w:tcPr>
-            <w:cnfStyle w:val="001000000000" w:firstRow="0" w:lastRow="0" w:firstColumn="1" w:lastColumn="0" w:oddVBand="0" w:evenVBand="0" w:oddHBand="0" w:evenHBand="0" w:firstRowFirstColumn="0" w:firstRowLastColumn="0" w:lastRowFirstColumn="0" w:lastRowLastColumn="0"/>
-            <w:tcW w:w="2830" w:type="dxa"/>
-            <w:vMerge/>
-          </w:tcPr>
-          <w:p/>
-        </w:tc>
-        <w:tc>
-          <w:tcPr>
-            <w:tcW w:w="1418" w:type="dxa"/>
-          </w:tcPr>
-          <w:p>
-            <w:pPr>
-              <w:jc w:val="center"/>
-              <w:cnfStyle w:val="000000000000" w:firstRow="0" w:lastRow="0" w:firstColumn="0" w:lastColumn="0" w:oddVBand="0" w:evenVBand="0" w:oddHBand="0" w:evenHBand="0" w:firstRowFirstColumn="0" w:firstRowLastColumn="0" w:lastRowFirstColumn="0" w:lastRowLastColumn="0"/>
-            </w:pPr>
-            <w:r>
-              <w:t>1</w:t>
-            </w:r>
-          </w:p>
-        </w:tc>
-        <w:tc>
-          <w:tcPr>
-            <w:tcW w:w="5102" w:type="dxa"/>
-            <w:gridSpan w:val="2"/>
-          </w:tcPr>
-          <w:p>
-            <w:pPr>
-              <w:cnfStyle w:val="000000000000" w:firstRow="0" w:lastRow="0" w:firstColumn="0" w:lastColumn="0" w:oddVBand="0" w:evenVBand="0" w:oddHBand="0" w:evenHBand="0" w:firstRowFirstColumn="0" w:firstRowLastColumn="0" w:lastRowFirstColumn="0" w:lastRowLastColumn="0"/>
-              <w:rPr>
-                <w:lang w:val="es-ES"/>
-              </w:rPr>
-            </w:pPr>
-            <w:r>
-              <w:rPr>
-                <w:lang w:val="es-ES"/>
-              </w:rPr>
-              <w:t xml:space="preserve">El jugador </w:t>
-            </w:r>
-            <w:r>
-              <w:rPr>
-                <w:lang w:val="es-ES"/>
-              </w:rPr>
-              <w:t>presiona el botón de pausa.</w:t>
-            </w:r>
-          </w:p>
-        </w:tc>
-      </w:tr>
-      <w:tr>
-        <w:trPr>
-          <w:trHeight w:val="325"/>
-        </w:trPr>
-        <w:tc>
-          <w:tcPr>
-            <w:cnfStyle w:val="001000000000" w:firstRow="0" w:lastRow="0" w:firstColumn="1" w:lastColumn="0" w:oddVBand="0" w:evenVBand="0" w:oddHBand="0" w:evenHBand="0" w:firstRowFirstColumn="0" w:firstRowLastColumn="0" w:lastRowFirstColumn="0" w:lastRowLastColumn="0"/>
-            <w:tcW w:w="2830" w:type="dxa"/>
-            <w:vMerge/>
-          </w:tcPr>
-          <w:p>
-            <w:pPr>
-              <w:rPr>
-                <w:lang w:val="es-ES"/>
-              </w:rPr>
-            </w:pPr>
-          </w:p>
-        </w:tc>
-        <w:tc>
-          <w:tcPr>
-            <w:tcW w:w="1418" w:type="dxa"/>
-          </w:tcPr>
-          <w:p>
-            <w:pPr>
-              <w:jc w:val="center"/>
-              <w:cnfStyle w:val="000000000000" w:firstRow="0" w:lastRow="0" w:firstColumn="0" w:lastColumn="0" w:oddVBand="0" w:evenVBand="0" w:oddHBand="0" w:evenHBand="0" w:firstRowFirstColumn="0" w:firstRowLastColumn="0" w:lastRowFirstColumn="0" w:lastRowLastColumn="0"/>
-            </w:pPr>
-            <w:r>
-              <w:t>2</w:t>
-            </w:r>
-          </w:p>
-        </w:tc>
-        <w:tc>
-          <w:tcPr>
-            <w:tcW w:w="5102" w:type="dxa"/>
-            <w:gridSpan w:val="2"/>
-          </w:tcPr>
-          <w:p>
-            <w:pPr>
-              <w:cnfStyle w:val="000000000000" w:firstRow="0" w:lastRow="0" w:firstColumn="0" w:lastColumn="0" w:oddVBand="0" w:evenVBand="0" w:oddHBand="0" w:evenHBand="0" w:firstRowFirstColumn="0" w:firstRowLastColumn="0" w:lastRowFirstColumn="0" w:lastRowLastColumn="0"/>
-              <w:rPr>
-                <w:lang w:val="es-ES"/>
-              </w:rPr>
-            </w:pPr>
-            <w:r>
-              <w:rPr>
-                <w:lang w:val="es-ES"/>
-              </w:rPr>
-              <w:t>El sistema</w:t>
-            </w:r>
-            <w:r>
-              <w:rPr>
-                <w:lang w:val="es-ES"/>
-              </w:rPr>
-              <w:t xml:space="preserve"> responde parando el juego y mostrando la pantalla de pausa</w:t>
-            </w:r>
-            <w:r>
-              <w:rPr>
-                <w:lang w:val="es-ES"/>
-              </w:rPr>
-              <w:t>.</w:t>
-            </w:r>
-          </w:p>
-        </w:tc>
-      </w:tr>
-      <w:tr>
-        <w:trPr>
-          <w:trHeight w:val="325"/>
-        </w:trPr>
-        <w:tc>
-          <w:tcPr>
-            <w:cnfStyle w:val="001000000000" w:firstRow="0" w:lastRow="0" w:firstColumn="1" w:lastColumn="0" w:oddVBand="0" w:evenVBand="0" w:oddHBand="0" w:evenHBand="0" w:firstRowFirstColumn="0" w:firstRowLastColumn="0" w:lastRowFirstColumn="0" w:lastRowLastColumn="0"/>
-            <w:tcW w:w="2830" w:type="dxa"/>
-            <w:vMerge/>
-          </w:tcPr>
-          <w:p>
-            <w:pPr>
-              <w:rPr>
-                <w:lang w:val="es-ES"/>
-              </w:rPr>
-            </w:pPr>
-          </w:p>
-        </w:tc>
-        <w:tc>
-          <w:tcPr>
-            <w:tcW w:w="1418" w:type="dxa"/>
-          </w:tcPr>
-          <w:p>
-            <w:pPr>
-              <w:jc w:val="center"/>
-              <w:cnfStyle w:val="000000000000" w:firstRow="0" w:lastRow="0" w:firstColumn="0" w:lastColumn="0" w:oddVBand="0" w:evenVBand="0" w:oddHBand="0" w:evenHBand="0" w:firstRowFirstColumn="0" w:firstRowLastColumn="0" w:lastRowFirstColumn="0" w:lastRowLastColumn="0"/>
-            </w:pPr>
-            <w:r>
-              <w:t>3</w:t>
-            </w:r>
-          </w:p>
-        </w:tc>
-        <w:tc>
-          <w:tcPr>
-            <w:tcW w:w="5102" w:type="dxa"/>
-            <w:gridSpan w:val="2"/>
-          </w:tcPr>
-          <w:p>
-            <w:pPr>
-              <w:cnfStyle w:val="000000000000" w:firstRow="0" w:lastRow="0" w:firstColumn="0" w:lastColumn="0" w:oddVBand="0" w:evenVBand="0" w:oddHBand="0" w:evenHBand="0" w:firstRowFirstColumn="0" w:firstRowLastColumn="0" w:lastRowFirstColumn="0" w:lastRowLastColumn="0"/>
-              <w:rPr>
-                <w:lang w:val="es-ES"/>
-              </w:rPr>
-            </w:pPr>
-            <w:r>
-              <w:rPr>
-                <w:lang w:val="es-ES"/>
-              </w:rPr>
-              <w:t xml:space="preserve">El jugador ya no tendrá control sobre el avatar. </w:t>
-            </w:r>
-            <w:r>
-              <w:rPr>
-                <w:lang w:val="es-ES"/>
-              </w:rPr>
-              <w:t>Tendrá las opciones presentes en el menú. El jugador podrá seleccionar reanudar la partida</w:t>
-            </w:r>
-          </w:p>
-        </w:tc>
-      </w:tr>
-      <w:tr>
-        <w:trPr>
-          <w:trHeight w:val="325"/>
-        </w:trPr>
-        <w:tc>
-          <w:tcPr>
-            <w:cnfStyle w:val="001000000000" w:firstRow="0" w:lastRow="0" w:firstColumn="1" w:lastColumn="0" w:oddVBand="0" w:evenVBand="0" w:oddHBand="0" w:evenHBand="0" w:firstRowFirstColumn="0" w:firstRowLastColumn="0" w:lastRowFirstColumn="0" w:lastRowLastColumn="0"/>
-            <w:tcW w:w="2830" w:type="dxa"/>
-          </w:tcPr>
-          <w:p>
-            <w:pPr>
-              <w:rPr>
-                <w:lang w:val="es-ES"/>
-              </w:rPr>
-            </w:pPr>
-          </w:p>
-        </w:tc>
-        <w:tc>
-          <w:tcPr>
-            <w:tcW w:w="1418" w:type="dxa"/>
-          </w:tcPr>
-          <w:p>
-            <w:pPr>
-              <w:jc w:val="center"/>
-              <w:cnfStyle w:val="000000000000" w:firstRow="0" w:lastRow="0" w:firstColumn="0" w:lastColumn="0" w:oddVBand="0" w:evenVBand="0" w:oddHBand="0" w:evenHBand="0" w:firstRowFirstColumn="0" w:firstRowLastColumn="0" w:lastRowFirstColumn="0" w:lastRowLastColumn="0"/>
-            </w:pPr>
-            <w:r>
-              <w:t>4</w:t>
-            </w:r>
-          </w:p>
-        </w:tc>
-        <w:tc>
-          <w:tcPr>
-            <w:tcW w:w="5102" w:type="dxa"/>
-            <w:gridSpan w:val="2"/>
-          </w:tcPr>
-          <w:p>
-            <w:pPr>
-              <w:cnfStyle w:val="000000000000" w:firstRow="0" w:lastRow="0" w:firstColumn="0" w:lastColumn="0" w:oddVBand="0" w:evenVBand="0" w:oddHBand="0" w:evenHBand="0" w:firstRowFirstColumn="0" w:firstRowLastColumn="0" w:lastRowFirstColumn="0" w:lastRowLastColumn="0"/>
-              <w:rPr>
-                <w:lang w:val="es-ES"/>
-              </w:rPr>
-            </w:pPr>
-            <w:r>
-              <w:rPr>
-                <w:lang w:val="es-ES"/>
-              </w:rPr>
-              <w:t xml:space="preserve">El sistema </w:t>
-            </w:r>
-            <w:r>
-              <w:rPr>
-                <w:lang w:val="es-ES"/>
-              </w:rPr>
-              <w:t xml:space="preserve">reanudará la partida desde el punto en el que se dejó. </w:t>
-            </w:r>
-          </w:p>
-        </w:tc>
-      </w:tr>
-      <w:tr>
-        <w:tc>
-          <w:tcPr>
-            <w:cnfStyle w:val="001000000000" w:firstRow="0" w:lastRow="0" w:firstColumn="1" w:lastColumn="0" w:oddVBand="0" w:evenVBand="0" w:oddHBand="0" w:evenHBand="0" w:firstRowFirstColumn="0" w:firstRowLastColumn="0" w:lastRowFirstColumn="0" w:lastRowLastColumn="0"/>
-            <w:tcW w:w="2830" w:type="dxa"/>
-          </w:tcPr>
-          <w:p>
-            <w:proofErr w:type="spellStart"/>
-            <w:r>
-              <w:t>Postcondición</w:t>
-            </w:r>
-            <w:proofErr w:type="spellEnd"/>
-          </w:p>
-        </w:tc>
-        <w:tc>
-          <w:tcPr>
-            <w:tcW w:w="6520" w:type="dxa"/>
-            <w:gridSpan w:val="3"/>
-          </w:tcPr>
-          <w:p>
-            <w:pPr>
-              <w:cnfStyle w:val="000000000000" w:firstRow="0" w:lastRow="0" w:firstColumn="0" w:lastColumn="0" w:oddVBand="0" w:evenVBand="0" w:oddHBand="0" w:evenHBand="0" w:firstRowFirstColumn="0" w:firstRowLastColumn="0" w:lastRowFirstColumn="0" w:lastRowLastColumn="0"/>
-              <w:rPr>
-                <w:lang w:val="es-ES"/>
-              </w:rPr>
-            </w:pPr>
-          </w:p>
-        </w:tc>
-      </w:tr>
-      <w:tr>
-        <w:trPr>
-          <w:trHeight w:val="160"/>
-        </w:trPr>
-        <w:tc>
-          <w:tcPr>
-            <w:cnfStyle w:val="001000000000" w:firstRow="0" w:lastRow="0" w:firstColumn="1" w:lastColumn="0" w:oddVBand="0" w:evenVBand="0" w:oddHBand="0" w:evenHBand="0" w:firstRowFirstColumn="0" w:firstRowLastColumn="0" w:lastRowFirstColumn="0" w:lastRowLastColumn="0"/>
-            <w:tcW w:w="2830" w:type="dxa"/>
-            <w:vMerge w:val="restart"/>
-          </w:tcPr>
-          <w:p>
-            <w:proofErr w:type="spellStart"/>
-            <w:r>
-              <w:t>Excepciones</w:t>
-            </w:r>
-            <w:proofErr w:type="spellEnd"/>
-          </w:p>
-        </w:tc>
-        <w:tc>
-          <w:tcPr>
-            <w:tcW w:w="1560" w:type="dxa"/>
-            <w:gridSpan w:val="2"/>
-          </w:tcPr>
-          <w:p>
-            <w:pPr>
-              <w:jc w:val="center"/>
-              <w:cnfStyle w:val="000000000000" w:firstRow="0" w:lastRow="0" w:firstColumn="0" w:lastColumn="0" w:oddVBand="0" w:evenVBand="0" w:oddHBand="0" w:evenHBand="0" w:firstRowFirstColumn="0" w:firstRowLastColumn="0" w:lastRowFirstColumn="0" w:lastRowLastColumn="0"/>
-            </w:pPr>
-            <w:r>
-              <w:rPr>
-                <w:b/>
-                <w:bCs/>
-              </w:rPr>
-              <w:t>Paso</w:t>
-            </w:r>
-          </w:p>
-        </w:tc>
-        <w:tc>
-          <w:tcPr>
-            <w:tcW w:w="4960" w:type="dxa"/>
-          </w:tcPr>
-          <w:p>
-            <w:pPr>
-              <w:cnfStyle w:val="000000000000" w:firstRow="0" w:lastRow="0" w:firstColumn="0" w:lastColumn="0" w:oddVBand="0" w:evenVBand="0" w:oddHBand="0" w:evenHBand="0" w:firstRowFirstColumn="0" w:firstRowLastColumn="0" w:lastRowFirstColumn="0" w:lastRowLastColumn="0"/>
-              <w:rPr>
-                <w:lang w:val="es-ES"/>
-              </w:rPr>
-            </w:pPr>
-            <w:proofErr w:type="spellStart"/>
-            <w:r>
-              <w:rPr>
-                <w:b/>
-                <w:bCs/>
-              </w:rPr>
-              <w:t>Acción</w:t>
-            </w:r>
-            <w:proofErr w:type="spellEnd"/>
-          </w:p>
-        </w:tc>
-      </w:tr>
-      <w:tr>
-        <w:trPr>
-          <w:trHeight w:val="160"/>
-        </w:trPr>
-        <w:tc>
-          <w:tcPr>
-            <w:cnfStyle w:val="001000000000" w:firstRow="0" w:lastRow="0" w:firstColumn="1" w:lastColumn="0" w:oddVBand="0" w:evenVBand="0" w:oddHBand="0" w:evenHBand="0" w:firstRowFirstColumn="0" w:firstRowLastColumn="0" w:lastRowFirstColumn="0" w:lastRowLastColumn="0"/>
-            <w:tcW w:w="2830" w:type="dxa"/>
-            <w:vMerge/>
-          </w:tcPr>
-          <w:p>
-            <w:pPr>
-              <w:rPr>
-                <w:lang w:val="es-ES"/>
-              </w:rPr>
-            </w:pPr>
-          </w:p>
-        </w:tc>
-        <w:tc>
-          <w:tcPr>
-            <w:tcW w:w="1560" w:type="dxa"/>
-            <w:gridSpan w:val="2"/>
-          </w:tcPr>
-          <w:p>
-            <w:pPr>
-              <w:jc w:val="center"/>
-              <w:cnfStyle w:val="000000000000" w:firstRow="0" w:lastRow="0" w:firstColumn="0" w:lastColumn="0" w:oddVBand="0" w:evenVBand="0" w:oddHBand="0" w:evenHBand="0" w:firstRowFirstColumn="0" w:firstRowLastColumn="0" w:lastRowFirstColumn="0" w:lastRowLastColumn="0"/>
-            </w:pPr>
-            <w:r>
-              <w:t>3</w:t>
-            </w:r>
-          </w:p>
-        </w:tc>
-        <w:tc>
-          <w:tcPr>
-            <w:tcW w:w="4960" w:type="dxa"/>
-          </w:tcPr>
-          <w:p>
-            <w:pPr>
-              <w:cnfStyle w:val="000000000000" w:firstRow="0" w:lastRow="0" w:firstColumn="0" w:lastColumn="0" w:oddVBand="0" w:evenVBand="0" w:oddHBand="0" w:evenHBand="0" w:firstRowFirstColumn="0" w:firstRowLastColumn="0" w:lastRowFirstColumn="0" w:lastRowLastColumn="0"/>
-              <w:rPr>
-                <w:lang w:val="es-ES"/>
-              </w:rPr>
-            </w:pPr>
-            <w:r>
-              <w:rPr>
-                <w:lang w:val="es-ES"/>
-              </w:rPr>
-              <w:t xml:space="preserve">El jugador selecciona </w:t>
-            </w:r>
-            <w:r>
-              <w:rPr>
-                <w:lang w:val="es-ES"/>
-              </w:rPr>
-              <w:t>salir d</w:t>
-            </w:r>
-            <w:r>
-              <w:rPr>
-                <w:lang w:val="es-ES"/>
-              </w:rPr>
-              <w:t xml:space="preserve">el nivel y el sistema </w:t>
-            </w:r>
-            <w:r>
-              <w:rPr>
-                <w:lang w:val="es-ES"/>
-              </w:rPr>
-              <w:t>mandará al jugador a la pantalla de inicio sin guardar ningún dato.</w:t>
-            </w:r>
-          </w:p>
-        </w:tc>
-      </w:tr>
-      <w:tr>
-        <w:trPr>
-          <w:trHeight w:val="160"/>
-        </w:trPr>
-        <w:tc>
-          <w:tcPr>
-            <w:cnfStyle w:val="001000000000" w:firstRow="0" w:lastRow="0" w:firstColumn="1" w:lastColumn="0" w:oddVBand="0" w:evenVBand="0" w:oddHBand="0" w:evenHBand="0" w:firstRowFirstColumn="0" w:firstRowLastColumn="0" w:lastRowFirstColumn="0" w:lastRowLastColumn="0"/>
-            <w:tcW w:w="2830" w:type="dxa"/>
           </w:tcPr>
           <w:p>
             <w:pPr>
@@ -22573,12 +22611,14 @@
                 <w:lang w:val="es-ES"/>
               </w:rPr>
             </w:pPr>
+            <w:bookmarkStart w:id="19" w:name="_Hlk176204969"/>
             <w:r>
               <w:rPr>
                 <w:lang w:val="es-ES"/>
               </w:rPr>
               <w:t>Durante la pausa la música también se para, por lo que los componentes rítmicos se detienen hasta su reanudación.</w:t>
             </w:r>
+            <w:bookmarkEnd w:id="19"/>
           </w:p>
         </w:tc>
       </w:tr>
@@ -23629,11 +23669,24 @@
                 <w:lang w:val="es-ES"/>
               </w:rPr>
             </w:pPr>
-            <w:r>
-              <w:rPr>
-                <w:lang w:val="es-ES"/>
-              </w:rPr>
-              <w:t>El menú principal cambiara dependiendo de si hay datos guardados o no mostrando la mejor puntuación y coleccionables obtenidos en el nivel</w:t>
+            <w:bookmarkStart w:id="20" w:name="_Hlk176204983"/>
+            <w:r>
+              <w:rPr>
+                <w:lang w:val="es-ES"/>
+              </w:rPr>
+              <w:t>El menú principal cambiar</w:t>
+            </w:r>
+            <w:r>
+              <w:rPr>
+                <w:lang w:val="es-ES"/>
+              </w:rPr>
+              <w:t xml:space="preserve">á </w:t>
+            </w:r>
+            <w:r>
+              <w:rPr>
+                <w:lang w:val="es-ES"/>
+              </w:rPr>
+              <w:t>dependiendo de si hay datos guardados o no mostrando la mejor puntuación y coleccionables obtenidos en el nivel</w:t>
             </w:r>
             <w:r>
               <w:rPr>
@@ -23647,6 +23700,7 @@
               </w:rPr>
               <w:t>.</w:t>
             </w:r>
+            <w:bookmarkEnd w:id="20"/>
           </w:p>
         </w:tc>
       </w:tr>
@@ -24007,6 +24061,7 @@
                 <w:lang w:val="es-ES"/>
               </w:rPr>
             </w:pPr>
+            <w:bookmarkStart w:id="21" w:name="_Hlk176205102"/>
             <w:r>
               <w:rPr>
                 <w:lang w:val="es-ES"/>
@@ -24017,7 +24072,20 @@
               <w:rPr>
                 <w:lang w:val="es-ES"/>
               </w:rPr>
-              <w:t>al y como se describe a continuación cuando el jugador quiera empezar a jugar</w:t>
+              <w:t xml:space="preserve">al y como se describe a continuación cuando el jugador quiera </w:t>
+            </w:r>
+            <w:r>
+              <w:rPr>
+                <w:lang w:val="es-ES"/>
+              </w:rPr>
+              <w:t>borrar los datos del juego</w:t>
+            </w:r>
+            <w:bookmarkEnd w:id="21"/>
+            <w:r>
+              <w:rPr>
+                <w:lang w:val="es-ES"/>
+              </w:rPr>
+              <w:t>.</w:t>
             </w:r>
           </w:p>
         </w:tc>
@@ -24591,6 +24659,12 @@
                 <w:lang w:val="es-ES"/>
               </w:rPr>
             </w:pPr>
+            <w:r>
+              <w:rPr>
+                <w:lang w:val="es-ES"/>
+              </w:rPr>
+              <w:t>Si ha habido datos guardados en la nube, estos también se borrarán.</w:t>
+            </w:r>
           </w:p>
         </w:tc>
       </w:tr>
@@ -24999,6 +25073,12 @@
               </w:rPr>
               <w:t xml:space="preserve">desee subir </w:t>
             </w:r>
+            <w:r>
+              <w:rPr>
+                <w:lang w:val="es-ES"/>
+              </w:rPr>
+              <w:t>los datos a la nube,</w:t>
+            </w:r>
           </w:p>
         </w:tc>
       </w:tr>
@@ -25256,13 +25336,7 @@
               <w:rPr>
                 <w:lang w:val="es-ES"/>
               </w:rPr>
-              <w:t xml:space="preserve">El jugador </w:t>
-            </w:r>
-            <w:r>
-              <w:rPr>
-                <w:lang w:val="es-ES"/>
-              </w:rPr>
-              <w:t>introduce el nombre.</w:t>
+              <w:t>El jugador introduce el nombre.</w:t>
             </w:r>
           </w:p>
         </w:tc>
@@ -25275,6 +25349,7 @@
           <w:tcPr>
             <w:cnfStyle w:val="001000000000" w:firstRow="0" w:lastRow="0" w:firstColumn="1" w:lastColumn="0" w:oddVBand="0" w:evenVBand="0" w:oddHBand="0" w:evenHBand="0" w:firstRowFirstColumn="0" w:firstRowLastColumn="0" w:lastRowFirstColumn="0" w:lastRowLastColumn="0"/>
             <w:tcW w:w="2830" w:type="dxa"/>
+            <w:vMerge/>
           </w:tcPr>
           <w:p>
             <w:pPr>
@@ -25314,13 +25389,21 @@
               <w:rPr>
                 <w:lang w:val="es-ES"/>
               </w:rPr>
-              <w:t xml:space="preserve">El sistema </w:t>
-            </w:r>
-            <w:r>
-              <w:rPr>
-                <w:lang w:val="es-ES"/>
-              </w:rPr>
-              <w:t>abre una pagina del navegador donde estarán las puntuaciones de otros usuarios.</w:t>
+              <w:t xml:space="preserve">El sistema abre una </w:t>
+            </w:r>
+            <w:proofErr w:type="spellStart"/>
+            <w:r>
+              <w:rPr>
+                <w:lang w:val="es-ES"/>
+              </w:rPr>
+              <w:t>pagina</w:t>
+            </w:r>
+            <w:proofErr w:type="spellEnd"/>
+            <w:r>
+              <w:rPr>
+                <w:lang w:val="es-ES"/>
+              </w:rPr>
+              <w:t xml:space="preserve"> del navegador donde estarán las puntuaciones de otros usuarios.</w:t>
             </w:r>
           </w:p>
         </w:tc>
@@ -25462,13 +25545,7 @@
               <w:rPr>
                 <w:lang w:val="es-ES"/>
               </w:rPr>
-              <w:t xml:space="preserve">El jugador </w:t>
-            </w:r>
-            <w:r>
-              <w:rPr>
-                <w:lang w:val="es-ES"/>
-              </w:rPr>
-              <w:t>cancela el proceso de subir los datos. El sistema le devuelve al menú principal.</w:t>
+              <w:t>El jugador cancela el proceso de subir los datos. El sistema le devuelve al menú principal.</w:t>
             </w:r>
           </w:p>
         </w:tc>
@@ -25481,6 +25558,7 @@
           <w:tcPr>
             <w:cnfStyle w:val="001000000000" w:firstRow="0" w:lastRow="0" w:firstColumn="1" w:lastColumn="0" w:oddVBand="0" w:evenVBand="0" w:oddHBand="0" w:evenHBand="0" w:firstRowFirstColumn="0" w:firstRowLastColumn="0" w:lastRowFirstColumn="0" w:lastRowLastColumn="0"/>
             <w:tcW w:w="2830" w:type="dxa"/>
+            <w:vMerge/>
           </w:tcPr>
           <w:p>
             <w:pPr>
@@ -25499,9 +25577,15 @@
             <w:pPr>
               <w:jc w:val="center"/>
               <w:cnfStyle w:val="000000000000" w:firstRow="0" w:lastRow="0" w:firstColumn="0" w:lastColumn="0" w:oddVBand="0" w:evenVBand="0" w:oddHBand="0" w:evenHBand="0" w:firstRowFirstColumn="0" w:firstRowLastColumn="0" w:lastRowFirstColumn="0" w:lastRowLastColumn="0"/>
-            </w:pPr>
-            <w:r>
-              <w:t>3</w:t>
+              <w:rPr>
+                <w:lang w:val="es-ES"/>
+              </w:rPr>
+            </w:pPr>
+            <w:r>
+              <w:rPr>
+                <w:lang w:val="es-ES"/>
+              </w:rPr>
+              <w:t>2</w:t>
             </w:r>
           </w:p>
         </w:tc>
@@ -25520,7 +25604,7 @@
               <w:rPr>
                 <w:lang w:val="es-ES"/>
               </w:rPr>
-              <w:t>El jugador selecciona ver la ayuda, el sistema mostrará un panel con los controles y un botón para volver al menú de pausa.</w:t>
+              <w:t xml:space="preserve">El jugador ya subió sus puntuaciones previamente y el sistema le reconoce. El sistema pregunta al jugador si quiere reescribir los datos y el jugador acepta. </w:t>
             </w:r>
           </w:p>
         </w:tc>
@@ -25616,7 +25700,19 @@
               <w:rPr>
                 <w:lang w:val="es-ES"/>
               </w:rPr>
-              <w:t xml:space="preserve">Este caso de uso se contemplo al principio del </w:t>
+              <w:t xml:space="preserve">Este caso de uso se </w:t>
+            </w:r>
+            <w:r>
+              <w:rPr>
+                <w:lang w:val="es-ES"/>
+              </w:rPr>
+              <w:t>contempló</w:t>
+            </w:r>
+            <w:r>
+              <w:rPr>
+                <w:lang w:val="es-ES"/>
+              </w:rPr>
+              <w:t xml:space="preserve"> al principio del </w:t>
             </w:r>
             <w:r>
               <w:rPr>
@@ -25628,7 +25724,19 @@
               <w:rPr>
                 <w:lang w:val="es-ES"/>
               </w:rPr>
-              <w:t xml:space="preserve"> pero a medida que fue avanzando el proyecto su viabilidad fue disminuyendo y se acabo por descartar su implementación.</w:t>
+              <w:t xml:space="preserve"> pero a medida que fue avanzando el proyecto su viabilidad fue disminuyendo y se </w:t>
+            </w:r>
+            <w:r>
+              <w:rPr>
+                <w:lang w:val="es-ES"/>
+              </w:rPr>
+              <w:t>acabó</w:t>
+            </w:r>
+            <w:r>
+              <w:rPr>
+                <w:lang w:val="es-ES"/>
+              </w:rPr>
+              <w:t xml:space="preserve"> por descartar su implementación.</w:t>
             </w:r>
           </w:p>
         </w:tc>
@@ -25974,7 +26082,19 @@
               <w:rPr>
                 <w:lang w:val="es-ES"/>
               </w:rPr>
-              <w:t xml:space="preserve">al y como se describe a continuación cuando el jugador desee subir </w:t>
+              <w:t xml:space="preserve">al y como se describe a continuación cuando el jugador </w:t>
+            </w:r>
+            <w:r>
+              <w:rPr>
+                <w:lang w:val="es-ES"/>
+              </w:rPr>
+              <w:t>cambiar la configuración del juego,</w:t>
+            </w:r>
+            <w:r>
+              <w:rPr>
+                <w:lang w:val="es-ES"/>
+              </w:rPr>
+              <w:t xml:space="preserve"> </w:t>
             </w:r>
           </w:p>
         </w:tc>
@@ -26043,11 +26163,11 @@
             <w:vMerge w:val="restart"/>
           </w:tcPr>
           <w:p>
-            <w:proofErr w:type="spellStart"/>
-            <w:r>
-              <w:t>Secuencia</w:t>
-            </w:r>
-            <w:proofErr w:type="spellEnd"/>
+            <w:pPr>
+              <w:rPr>
+                <w:lang w:val="es-ES"/>
+              </w:rPr>
+            </w:pPr>
           </w:p>
         </w:tc>
         <w:tc>
@@ -26137,13 +26257,7 @@
               <w:rPr>
                 <w:lang w:val="es-ES"/>
               </w:rPr>
-              <w:t xml:space="preserve">EL jugador selecciona la opción de </w:t>
-            </w:r>
-            <w:r>
-              <w:rPr>
-                <w:lang w:val="es-ES"/>
-              </w:rPr>
-              <w:t>configuración.</w:t>
+              <w:t>EL jugador selecciona la opción de configuración.</w:t>
             </w:r>
           </w:p>
         </w:tc>
@@ -26195,13 +26309,7 @@
               <w:rPr>
                 <w:lang w:val="es-ES"/>
               </w:rPr>
-              <w:t xml:space="preserve">El sistema </w:t>
-            </w:r>
-            <w:r>
-              <w:rPr>
-                <w:lang w:val="es-ES"/>
-              </w:rPr>
-              <w:t>muestra las distintas opciones configurables del juego.</w:t>
+              <w:t>El sistema muestra las distintas opciones configurables del juego.</w:t>
             </w:r>
           </w:p>
         </w:tc>
@@ -26253,19 +26361,7 @@
               <w:rPr>
                 <w:lang w:val="es-ES"/>
               </w:rPr>
-              <w:t xml:space="preserve">El </w:t>
-            </w:r>
-            <w:r>
-              <w:rPr>
-                <w:lang w:val="es-ES"/>
-              </w:rPr>
-              <w:t>selecciona guardar</w:t>
-            </w:r>
-            <w:r>
-              <w:rPr>
-                <w:lang w:val="es-ES"/>
-              </w:rPr>
-              <w:t>.</w:t>
+              <w:t>El jugador selecciona las opciones de audio.</w:t>
             </w:r>
           </w:p>
         </w:tc>
@@ -26278,6 +26374,7 @@
           <w:tcPr>
             <w:cnfStyle w:val="001000000000" w:firstRow="0" w:lastRow="0" w:firstColumn="1" w:lastColumn="0" w:oddVBand="0" w:evenVBand="0" w:oddHBand="0" w:evenHBand="0" w:firstRowFirstColumn="0" w:firstRowLastColumn="0" w:lastRowFirstColumn="0" w:lastRowLastColumn="0"/>
             <w:tcW w:w="2830" w:type="dxa"/>
+            <w:vMerge/>
           </w:tcPr>
           <w:p>
             <w:pPr>
@@ -26295,8 +26392,14 @@
             <w:pPr>
               <w:jc w:val="center"/>
               <w:cnfStyle w:val="000000000000" w:firstRow="0" w:lastRow="0" w:firstColumn="0" w:lastColumn="0" w:oddVBand="0" w:evenVBand="0" w:oddHBand="0" w:evenHBand="0" w:firstRowFirstColumn="0" w:firstRowLastColumn="0" w:lastRowFirstColumn="0" w:lastRowLastColumn="0"/>
-            </w:pPr>
-            <w:r>
+              <w:rPr>
+                <w:lang w:val="es-ES"/>
+              </w:rPr>
+            </w:pPr>
+            <w:r>
+              <w:rPr>
+                <w:lang w:val="es-ES"/>
+              </w:rPr>
               <w:t>4</w:t>
             </w:r>
           </w:p>
@@ -26316,19 +26419,117 @@
               <w:rPr>
                 <w:lang w:val="es-ES"/>
               </w:rPr>
-              <w:t xml:space="preserve">El sistema abre una </w:t>
-            </w:r>
-            <w:r>
-              <w:rPr>
-                <w:lang w:val="es-ES"/>
-              </w:rPr>
-              <w:t>página</w:t>
-            </w:r>
-            <w:r>
-              <w:rPr>
-                <w:lang w:val="es-ES"/>
-              </w:rPr>
-              <w:t xml:space="preserve"> del navegador donde estarán las puntuaciones de otros usuarios.</w:t>
+              <w:t xml:space="preserve">El sistema muestra una pestaña con las diferentes </w:t>
+            </w:r>
+          </w:p>
+        </w:tc>
+      </w:tr>
+      <w:tr>
+        <w:trPr>
+          <w:trHeight w:val="615"/>
+        </w:trPr>
+        <w:tc>
+          <w:tcPr>
+            <w:cnfStyle w:val="001000000000" w:firstRow="0" w:lastRow="0" w:firstColumn="1" w:lastColumn="0" w:oddVBand="0" w:evenVBand="0" w:oddHBand="0" w:evenHBand="0" w:firstRowFirstColumn="0" w:firstRowLastColumn="0" w:lastRowFirstColumn="0" w:lastRowLastColumn="0"/>
+            <w:tcW w:w="2830" w:type="dxa"/>
+            <w:vMerge/>
+          </w:tcPr>
+          <w:p>
+            <w:pPr>
+              <w:rPr>
+                <w:lang w:val="es-ES"/>
+              </w:rPr>
+            </w:pPr>
+          </w:p>
+        </w:tc>
+        <w:tc>
+          <w:tcPr>
+            <w:tcW w:w="1418" w:type="dxa"/>
+          </w:tcPr>
+          <w:p>
+            <w:pPr>
+              <w:jc w:val="center"/>
+              <w:cnfStyle w:val="000000000000" w:firstRow="0" w:lastRow="0" w:firstColumn="0" w:lastColumn="0" w:oddVBand="0" w:evenVBand="0" w:oddHBand="0" w:evenHBand="0" w:firstRowFirstColumn="0" w:firstRowLastColumn="0" w:lastRowFirstColumn="0" w:lastRowLastColumn="0"/>
+            </w:pPr>
+            <w:r>
+              <w:t>5</w:t>
+            </w:r>
+          </w:p>
+        </w:tc>
+        <w:tc>
+          <w:tcPr>
+            <w:tcW w:w="5102" w:type="dxa"/>
+          </w:tcPr>
+          <w:p>
+            <w:pPr>
+              <w:cnfStyle w:val="000000000000" w:firstRow="0" w:lastRow="0" w:firstColumn="0" w:lastColumn="0" w:oddVBand="0" w:evenVBand="0" w:oddHBand="0" w:evenHBand="0" w:firstRowFirstColumn="0" w:firstRowLastColumn="0" w:lastRowFirstColumn="0" w:lastRowLastColumn="0"/>
+              <w:rPr>
+                <w:lang w:val="es-ES"/>
+              </w:rPr>
+            </w:pPr>
+            <w:r>
+              <w:rPr>
+                <w:lang w:val="es-ES"/>
+              </w:rPr>
+              <w:t>El jugador cambia las opciones y selecciona guardar.</w:t>
+            </w:r>
+          </w:p>
+        </w:tc>
+      </w:tr>
+      <w:tr>
+        <w:trPr>
+          <w:trHeight w:val="511"/>
+        </w:trPr>
+        <w:tc>
+          <w:tcPr>
+            <w:cnfStyle w:val="001000000000" w:firstRow="0" w:lastRow="0" w:firstColumn="1" w:lastColumn="0" w:oddVBand="0" w:evenVBand="0" w:oddHBand="0" w:evenHBand="0" w:firstRowFirstColumn="0" w:firstRowLastColumn="0" w:lastRowFirstColumn="0" w:lastRowLastColumn="0"/>
+            <w:tcW w:w="2830" w:type="dxa"/>
+            <w:vMerge/>
+          </w:tcPr>
+          <w:p>
+            <w:pPr>
+              <w:rPr>
+                <w:lang w:val="es-ES"/>
+              </w:rPr>
+            </w:pPr>
+          </w:p>
+        </w:tc>
+        <w:tc>
+          <w:tcPr>
+            <w:tcW w:w="1418" w:type="dxa"/>
+          </w:tcPr>
+          <w:p>
+            <w:pPr>
+              <w:jc w:val="center"/>
+              <w:cnfStyle w:val="000000000000" w:firstRow="0" w:lastRow="0" w:firstColumn="0" w:lastColumn="0" w:oddVBand="0" w:evenVBand="0" w:oddHBand="0" w:evenHBand="0" w:firstRowFirstColumn="0" w:firstRowLastColumn="0" w:lastRowFirstColumn="0" w:lastRowLastColumn="0"/>
+              <w:rPr>
+                <w:lang w:val="es-ES"/>
+              </w:rPr>
+            </w:pPr>
+            <w:r>
+              <w:rPr>
+                <w:lang w:val="es-ES"/>
+              </w:rPr>
+              <w:t>6</w:t>
+            </w:r>
+          </w:p>
+        </w:tc>
+        <w:tc>
+          <w:tcPr>
+            <w:tcW w:w="5102" w:type="dxa"/>
+          </w:tcPr>
+          <w:p>
+            <w:pPr>
+              <w:cnfStyle w:val="000000000000" w:firstRow="0" w:lastRow="0" w:firstColumn="0" w:lastColumn="0" w:oddVBand="0" w:evenVBand="0" w:oddHBand="0" w:evenHBand="0" w:firstRowFirstColumn="0" w:firstRowLastColumn="0" w:lastRowFirstColumn="0" w:lastRowLastColumn="0"/>
+              <w:rPr>
+                <w:lang w:val="es-ES"/>
+              </w:rPr>
+            </w:pPr>
+            <w:r>
+              <w:rPr>
+                <w:lang w:val="es-ES"/>
+              </w:rPr>
+              <w:t>El sistema devuelve al jugador a la pantalla del menú principal con los datos cambiados.</w:t>
             </w:r>
           </w:p>
         </w:tc>
@@ -26474,7 +26675,7 @@
               <w:rPr>
                 <w:lang w:val="es-ES"/>
               </w:rPr>
-              <w:t>El jugador cancela el proceso de subir los datos. El sistema le devuelve al menú principal.</w:t>
+              <w:t>El jugador selecciona las opciones de pantalla. El sistema muestra las opciones de pantalla configurables al jugador.</w:t>
             </w:r>
           </w:p>
         </w:tc>
@@ -26487,6 +26688,7 @@
           <w:tcPr>
             <w:cnfStyle w:val="001000000000" w:firstRow="0" w:lastRow="0" w:firstColumn="1" w:lastColumn="0" w:oddVBand="0" w:evenVBand="0" w:oddHBand="0" w:evenHBand="0" w:firstRowFirstColumn="0" w:firstRowLastColumn="0" w:lastRowFirstColumn="0" w:lastRowLastColumn="0"/>
             <w:tcW w:w="2830" w:type="dxa"/>
+            <w:vMerge/>
           </w:tcPr>
           <w:p>
             <w:pPr>
@@ -26506,7 +26708,7 @@
               <w:cnfStyle w:val="000000000000" w:firstRow="0" w:lastRow="0" w:firstColumn="0" w:lastColumn="0" w:oddVBand="0" w:evenVBand="0" w:oddHBand="0" w:evenHBand="0" w:firstRowFirstColumn="0" w:firstRowLastColumn="0" w:lastRowFirstColumn="0" w:lastRowLastColumn="0"/>
             </w:pPr>
             <w:r>
-              <w:t>3</w:t>
+              <w:t>5</w:t>
             </w:r>
           </w:p>
         </w:tc>
@@ -26525,7 +26727,7 @@
               <w:rPr>
                 <w:lang w:val="es-ES"/>
               </w:rPr>
-              <w:t>El jugador selecciona ver la ayuda, el sistema mostrará un panel con los controles y un botón para volver al menú de pausa.</w:t>
+              <w:t>El jugador cancela el proceso de cambiar opciones. El sistema le devuelve al menú principal.</w:t>
             </w:r>
           </w:p>
         </w:tc>
@@ -26663,15 +26865,6 @@
         </w:tc>
       </w:tr>
     </w:tbl>
-    <w:p>
-      <w:pPr>
-        <w:pStyle w:val="Prrafodelista"/>
-        <w:ind w:left="1440"/>
-        <w:rPr>
-          <w:lang w:val="es-ES"/>
-        </w:rPr>
-      </w:pPr>
-    </w:p>
     <w:p>
       <w:pPr>
         <w:pStyle w:val="Prrafodelista"/>
@@ -26687,12 +26880,6 @@
           <w:lang w:val="es-ES"/>
         </w:rPr>
       </w:pPr>
-      <w:r>
-        <w:rPr>
-          <w:lang w:val="es-ES"/>
-        </w:rPr>
-        <w:br w:type="page"/>
-      </w:r>
     </w:p>
     <w:p>
       <w:pPr>
@@ -27031,12 +27218,14 @@
                 <w:lang w:val="es-ES"/>
               </w:rPr>
             </w:pPr>
+            <w:bookmarkStart w:id="22" w:name="_Hlk176197783"/>
             <w:r>
               <w:rPr>
                 <w:lang w:val="es-ES"/>
               </w:rPr>
               <w:t>Las interfaces del juego deben ser intuitivas y de navegación fácil, además de tener unos controles fáciles de aprender.</w:t>
             </w:r>
+            <w:bookmarkEnd w:id="22"/>
           </w:p>
         </w:tc>
       </w:tr>
@@ -27452,6 +27641,7 @@
                 <w:lang w:val="es-ES"/>
               </w:rPr>
             </w:pPr>
+            <w:bookmarkStart w:id="23" w:name="_Hlk176197792"/>
             <w:r>
               <w:rPr>
                 <w:lang w:val="es-ES"/>
@@ -27464,6 +27654,7 @@
               </w:rPr>
               <w:t>sin fallos en la captura de acciones rítmicas y ofreciendo rapidez entre las acciones del jugador y la respuesta del sistema.</w:t>
             </w:r>
+            <w:bookmarkEnd w:id="23"/>
           </w:p>
         </w:tc>
       </w:tr>
@@ -27891,12 +28082,14 @@
                 <w:lang w:val="es-ES"/>
               </w:rPr>
             </w:pPr>
+            <w:bookmarkStart w:id="24" w:name="_Hlk176197807"/>
             <w:r>
               <w:rPr>
                 <w:lang w:val="es-ES"/>
               </w:rPr>
               <w:t>El sistema debe funcionar sin errores ni desajustes que estropeen la experiencia del jugador.</w:t>
             </w:r>
+            <w:bookmarkEnd w:id="24"/>
           </w:p>
         </w:tc>
       </w:tr>
@@ -28073,10 +28266,12 @@
             <w:pPr>
               <w:cnfStyle w:val="100000000000" w:firstRow="1" w:lastRow="0" w:firstColumn="0" w:lastColumn="0" w:oddVBand="0" w:evenVBand="0" w:oddHBand="0" w:evenHBand="0" w:firstRowFirstColumn="0" w:firstRowLastColumn="0" w:lastRowFirstColumn="0" w:lastRowLastColumn="0"/>
             </w:pPr>
+            <w:bookmarkStart w:id="25" w:name="_Hlk176197853"/>
             <w:proofErr w:type="spellStart"/>
             <w:r>
               <w:t>Eficiencia</w:t>
             </w:r>
+            <w:bookmarkEnd w:id="25"/>
             <w:proofErr w:type="spellEnd"/>
           </w:p>
         </w:tc>
@@ -28318,12 +28513,14 @@
                 <w:lang w:val="es-ES"/>
               </w:rPr>
             </w:pPr>
+            <w:bookmarkStart w:id="26" w:name="_Hlk176197863"/>
             <w:r>
               <w:rPr>
                 <w:lang w:val="es-ES"/>
               </w:rPr>
               <w:t>El sistema no debe suponer un consumo excesivo de recursos del ordenador del usuario.</w:t>
             </w:r>
+            <w:bookmarkEnd w:id="26"/>
           </w:p>
         </w:tc>
       </w:tr>
@@ -28513,6 +28710,7 @@
             <w:pPr>
               <w:cnfStyle w:val="100000000000" w:firstRow="1" w:lastRow="0" w:firstColumn="0" w:lastColumn="0" w:oddVBand="0" w:evenVBand="0" w:oddHBand="0" w:evenHBand="0" w:firstRowFirstColumn="0" w:firstRowLastColumn="0" w:lastRowFirstColumn="0" w:lastRowLastColumn="0"/>
             </w:pPr>
+            <w:bookmarkStart w:id="27" w:name="_Hlk176197875"/>
             <w:proofErr w:type="spellStart"/>
             <w:r>
               <w:t>Tutoriales</w:t>
@@ -28533,6 +28731,7 @@
             <w:r>
               <w:t>Usuario</w:t>
             </w:r>
+            <w:bookmarkEnd w:id="27"/>
             <w:proofErr w:type="spellEnd"/>
           </w:p>
         </w:tc>
@@ -28774,6 +28973,7 @@
                 <w:lang w:val="es-ES"/>
               </w:rPr>
             </w:pPr>
+            <w:bookmarkStart w:id="28" w:name="_Hlk176197890"/>
             <w:r>
               <w:rPr>
                 <w:lang w:val="es-ES"/>
@@ -28786,6 +28986,7 @@
               </w:rPr>
               <w:t>deberá tener tutoriales que enseñen al jugador las mecánicas del juego y se pueda familiarizar con el entorno.</w:t>
             </w:r>
+            <w:bookmarkEnd w:id="28"/>
           </w:p>
         </w:tc>
       </w:tr>
@@ -29037,23 +29238,30 @@
           <w:p>
             <w:pPr>
               <w:cnfStyle w:val="000000000000" w:firstRow="0" w:lastRow="0" w:firstColumn="0" w:lastColumn="0" w:oddVBand="0" w:evenVBand="0" w:oddHBand="0" w:evenHBand="0" w:firstRowFirstColumn="0" w:firstRowLastColumn="0" w:lastRowFirstColumn="0" w:lastRowLastColumn="0"/>
-            </w:pPr>
-            <w:r>
+              <w:rPr>
+                <w:lang w:val="es-ES"/>
+              </w:rPr>
+            </w:pPr>
+            <w:r>
+              <w:rPr>
+                <w:lang w:val="es-ES"/>
+              </w:rPr>
               <w:t xml:space="preserve">Ángel </w:t>
             </w:r>
             <w:proofErr w:type="spellStart"/>
             <w:r>
+              <w:rPr>
+                <w:lang w:val="es-ES"/>
+              </w:rPr>
               <w:t>Torijano</w:t>
             </w:r>
             <w:proofErr w:type="spellEnd"/>
             <w:r>
-              <w:t xml:space="preserve"> </w:t>
-            </w:r>
-            <w:proofErr w:type="spellStart"/>
-            <w:r>
-              <w:t>Sexmero</w:t>
-            </w:r>
-            <w:proofErr w:type="spellEnd"/>
+              <w:rPr>
+                <w:lang w:val="es-ES"/>
+              </w:rPr>
+              <w:t xml:space="preserve"> Sexmero</w:t>
+            </w:r>
           </w:p>
           <w:p>
             <w:pPr>
@@ -29233,6 +29441,7 @@
                 <w:lang w:val="es-ES"/>
               </w:rPr>
             </w:pPr>
+            <w:bookmarkStart w:id="29" w:name="_Hlk176197911"/>
             <w:r>
               <w:rPr>
                 <w:lang w:val="es-ES"/>
@@ -29243,7 +29452,14 @@
               <w:rPr>
                 <w:lang w:val="es-ES"/>
               </w:rPr>
-              <w:t>diseñará con elementos originales creadas por los autores tales como animaciones, música, etc.</w:t>
+              <w:t>diseñará con elementos originales creadas por los autores tales como animaciones, música, etc</w:t>
+            </w:r>
+            <w:bookmarkEnd w:id="29"/>
+            <w:r>
+              <w:rPr>
+                <w:lang w:val="es-ES"/>
+              </w:rPr>
+              <w:t>.</w:t>
             </w:r>
           </w:p>
         </w:tc>
@@ -29418,11 +29634,9 @@
             <w:pPr>
               <w:cnfStyle w:val="100000000000" w:firstRow="1" w:lastRow="0" w:firstColumn="0" w:lastColumn="0" w:oddVBand="0" w:evenVBand="0" w:oddHBand="0" w:evenHBand="0" w:firstRowFirstColumn="0" w:firstRowLastColumn="0" w:lastRowFirstColumn="0" w:lastRowLastColumn="0"/>
             </w:pPr>
-            <w:proofErr w:type="spellStart"/>
             <w:r>
               <w:t>Rejugabilidad</w:t>
             </w:r>
-            <w:proofErr w:type="spellEnd"/>
           </w:p>
         </w:tc>
       </w:tr>
@@ -29663,12 +29877,14 @@
                 <w:lang w:val="es-ES"/>
               </w:rPr>
             </w:pPr>
+            <w:bookmarkStart w:id="30" w:name="_Hlk176197922"/>
             <w:r>
               <w:rPr>
                 <w:lang w:val="es-ES"/>
               </w:rPr>
               <w:t>El sistema deberá ofrecer razones por las que el usuario revisite el juego</w:t>
             </w:r>
+            <w:bookmarkEnd w:id="30"/>
           </w:p>
         </w:tc>
       </w:tr>

</xml_diff>